<commit_message>
Aggiunta di fiver tra l'analisi dei competitor
</commit_message>
<xml_diff>
--- a/Saendwave_Project_Proposal.docx
+++ b/Saendwave_Project_Proposal.docx
@@ -432,6 +432,7 @@
                 <w:rFonts w:asciiTheme="majorHAnsi" w:hAnsiTheme="majorHAnsi" w:cstheme="majorHAnsi"/>
                 <w:sz w:val="24"/>
                 <w:szCs w:val="24"/>
+                <w:lang w:val="it-IT"/>
               </w:rPr>
             </w:pPr>
             <w:r>
@@ -549,32 +550,9 @@
                 <w:rFonts w:asciiTheme="majorHAnsi" w:hAnsiTheme="majorHAnsi" w:cstheme="majorHAnsi"/>
                 <w:sz w:val="24"/>
                 <w:szCs w:val="24"/>
+                <w:lang w:val="it-IT"/>
               </w:rPr>
-              <w:t xml:space="preserve">Giovanni Varricchio </w:t>
-            </w:r>
-            <w:r>
-              <w:rPr>
-                <w:rFonts w:asciiTheme="majorHAnsi" w:hAnsiTheme="majorHAnsi" w:cstheme="majorHAnsi"/>
-                <w:sz w:val="24"/>
-                <w:szCs w:val="24"/>
-              </w:rPr>
-              <w:t>(Mat.</w:t>
-            </w:r>
-            <w:r>
-              <w:rPr>
-                <w:rFonts w:asciiTheme="majorHAnsi" w:hAnsiTheme="majorHAnsi" w:cstheme="majorHAnsi"/>
-                <w:sz w:val="24"/>
-                <w:szCs w:val="24"/>
-              </w:rPr>
-              <w:t>0512122414</w:t>
-            </w:r>
-            <w:r>
-              <w:rPr>
-                <w:rFonts w:asciiTheme="majorHAnsi" w:hAnsiTheme="majorHAnsi" w:cstheme="majorHAnsi"/>
-                <w:sz w:val="24"/>
-                <w:szCs w:val="24"/>
-              </w:rPr>
-              <w:t>)</w:t>
+              <w:t>Giovanni Varricchio (Mat.0512122414)</w:t>
             </w:r>
           </w:p>
         </w:tc>
@@ -586,6 +564,7 @@
           <w:rFonts w:asciiTheme="majorHAnsi" w:hAnsiTheme="majorHAnsi" w:cstheme="majorHAnsi"/>
           <w:sz w:val="24"/>
           <w:szCs w:val="24"/>
+          <w:lang w:val="it-IT"/>
         </w:rPr>
       </w:pPr>
       <w:r>
@@ -593,6 +572,7 @@
           <w:rFonts w:asciiTheme="majorHAnsi" w:hAnsiTheme="majorHAnsi" w:cstheme="majorHAnsi"/>
           <w:sz w:val="24"/>
           <w:szCs w:val="24"/>
+          <w:lang w:val="it-IT"/>
         </w:rPr>
         <w:br/>
       </w:r>
@@ -1289,6 +1269,7 @@
           <w:iCs/>
           <w:sz w:val="24"/>
           <w:szCs w:val="24"/>
+          <w:lang w:val="it-IT"/>
         </w:rPr>
       </w:pPr>
       <w:proofErr w:type="spellStart"/>
@@ -1313,444 +1294,6 @@
         </w:rPr>
         <w:t xml:space="preserve"> </w:t>
       </w:r>
-      <w:proofErr w:type="spellStart"/>
-      <w:r>
-        <w:rPr>
-          <w:rFonts w:asciiTheme="majorHAnsi" w:hAnsiTheme="majorHAnsi" w:cstheme="majorHAnsi"/>
-          <w:iCs/>
-          <w:sz w:val="24"/>
-          <w:szCs w:val="24"/>
-        </w:rPr>
-        <w:t>mira</w:t>
-      </w:r>
-      <w:proofErr w:type="spellEnd"/>
-      <w:r>
-        <w:rPr>
-          <w:rFonts w:asciiTheme="majorHAnsi" w:hAnsiTheme="majorHAnsi" w:cstheme="majorHAnsi"/>
-          <w:iCs/>
-          <w:sz w:val="24"/>
-          <w:szCs w:val="24"/>
-        </w:rPr>
-        <w:t xml:space="preserve"> ad </w:t>
-      </w:r>
-      <w:proofErr w:type="spellStart"/>
-      <w:r>
-        <w:rPr>
-          <w:rFonts w:asciiTheme="majorHAnsi" w:hAnsiTheme="majorHAnsi" w:cstheme="majorHAnsi"/>
-          <w:iCs/>
-          <w:sz w:val="24"/>
-          <w:szCs w:val="24"/>
-        </w:rPr>
-        <w:t>agevol</w:t>
-      </w:r>
-      <w:r>
-        <w:rPr>
-          <w:rFonts w:asciiTheme="majorHAnsi" w:hAnsiTheme="majorHAnsi" w:cstheme="majorHAnsi"/>
-          <w:iCs/>
-          <w:sz w:val="24"/>
-          <w:szCs w:val="24"/>
-        </w:rPr>
-        <w:t>a</w:t>
-      </w:r>
-      <w:r>
-        <w:rPr>
-          <w:rFonts w:asciiTheme="majorHAnsi" w:hAnsiTheme="majorHAnsi" w:cstheme="majorHAnsi"/>
-          <w:iCs/>
-          <w:sz w:val="24"/>
-          <w:szCs w:val="24"/>
-        </w:rPr>
-        <w:t>re</w:t>
-      </w:r>
-      <w:proofErr w:type="spellEnd"/>
-      <w:r>
-        <w:rPr>
-          <w:rFonts w:asciiTheme="majorHAnsi" w:hAnsiTheme="majorHAnsi" w:cstheme="majorHAnsi"/>
-          <w:iCs/>
-          <w:sz w:val="24"/>
-          <w:szCs w:val="24"/>
-        </w:rPr>
-        <w:t xml:space="preserve"> </w:t>
-      </w:r>
-      <w:proofErr w:type="spellStart"/>
-      <w:r>
-        <w:rPr>
-          <w:rFonts w:asciiTheme="majorHAnsi" w:hAnsiTheme="majorHAnsi" w:cstheme="majorHAnsi"/>
-          <w:iCs/>
-          <w:sz w:val="24"/>
-          <w:szCs w:val="24"/>
-        </w:rPr>
-        <w:t>i</w:t>
-      </w:r>
-      <w:proofErr w:type="spellEnd"/>
-      <w:r>
-        <w:rPr>
-          <w:rFonts w:asciiTheme="majorHAnsi" w:hAnsiTheme="majorHAnsi" w:cstheme="majorHAnsi"/>
-          <w:iCs/>
-          <w:sz w:val="24"/>
-          <w:szCs w:val="24"/>
-        </w:rPr>
-        <w:t xml:space="preserve"> </w:t>
-      </w:r>
-      <w:proofErr w:type="spellStart"/>
-      <w:r>
-        <w:rPr>
-          <w:rFonts w:asciiTheme="majorHAnsi" w:hAnsiTheme="majorHAnsi" w:cstheme="majorHAnsi"/>
-          <w:iCs/>
-          <w:sz w:val="24"/>
-          <w:szCs w:val="24"/>
-        </w:rPr>
-        <w:t>musicisti</w:t>
-      </w:r>
-      <w:proofErr w:type="spellEnd"/>
-      <w:r>
-        <w:rPr>
-          <w:rFonts w:asciiTheme="majorHAnsi" w:hAnsiTheme="majorHAnsi" w:cstheme="majorHAnsi"/>
-          <w:iCs/>
-          <w:sz w:val="24"/>
-          <w:szCs w:val="24"/>
-        </w:rPr>
-        <w:t xml:space="preserve"> non </w:t>
-      </w:r>
-      <w:proofErr w:type="spellStart"/>
-      <w:r>
-        <w:rPr>
-          <w:rFonts w:asciiTheme="majorHAnsi" w:hAnsiTheme="majorHAnsi" w:cstheme="majorHAnsi"/>
-          <w:iCs/>
-          <w:sz w:val="24"/>
-          <w:szCs w:val="24"/>
-        </w:rPr>
-        <w:t>professionisti</w:t>
-      </w:r>
-      <w:proofErr w:type="spellEnd"/>
-      <w:r>
-        <w:rPr>
-          <w:rFonts w:asciiTheme="majorHAnsi" w:hAnsiTheme="majorHAnsi" w:cstheme="majorHAnsi"/>
-          <w:iCs/>
-          <w:sz w:val="24"/>
-          <w:szCs w:val="24"/>
-        </w:rPr>
-        <w:t xml:space="preserve"> </w:t>
-      </w:r>
-      <w:proofErr w:type="spellStart"/>
-      <w:r>
-        <w:rPr>
-          <w:rFonts w:asciiTheme="majorHAnsi" w:hAnsiTheme="majorHAnsi" w:cstheme="majorHAnsi"/>
-          <w:iCs/>
-          <w:sz w:val="24"/>
-          <w:szCs w:val="24"/>
-        </w:rPr>
-        <w:t>nella</w:t>
-      </w:r>
-      <w:proofErr w:type="spellEnd"/>
-      <w:r>
-        <w:rPr>
-          <w:rFonts w:asciiTheme="majorHAnsi" w:hAnsiTheme="majorHAnsi" w:cstheme="majorHAnsi"/>
-          <w:iCs/>
-          <w:sz w:val="24"/>
-          <w:szCs w:val="24"/>
-        </w:rPr>
-        <w:t xml:space="preserve"> </w:t>
-      </w:r>
-      <w:proofErr w:type="spellStart"/>
-      <w:r>
-        <w:rPr>
-          <w:rFonts w:asciiTheme="majorHAnsi" w:hAnsiTheme="majorHAnsi" w:cstheme="majorHAnsi"/>
-          <w:iCs/>
-          <w:sz w:val="24"/>
-          <w:szCs w:val="24"/>
-        </w:rPr>
-        <w:t>realizzazione</w:t>
-      </w:r>
-      <w:proofErr w:type="spellEnd"/>
-      <w:r>
-        <w:rPr>
-          <w:rFonts w:asciiTheme="majorHAnsi" w:hAnsiTheme="majorHAnsi" w:cstheme="majorHAnsi"/>
-          <w:iCs/>
-          <w:sz w:val="24"/>
-          <w:szCs w:val="24"/>
-        </w:rPr>
-        <w:t xml:space="preserve"> del proprio </w:t>
-      </w:r>
-      <w:proofErr w:type="spellStart"/>
-      <w:r>
-        <w:rPr>
-          <w:rFonts w:asciiTheme="majorHAnsi" w:hAnsiTheme="majorHAnsi" w:cstheme="majorHAnsi"/>
-          <w:iCs/>
-          <w:sz w:val="24"/>
-          <w:szCs w:val="24"/>
-        </w:rPr>
-        <w:t>brano</w:t>
-      </w:r>
-      <w:proofErr w:type="spellEnd"/>
-      <w:r>
-        <w:rPr>
-          <w:rFonts w:asciiTheme="majorHAnsi" w:hAnsiTheme="majorHAnsi" w:cstheme="majorHAnsi"/>
-          <w:iCs/>
-          <w:sz w:val="24"/>
-          <w:szCs w:val="24"/>
-        </w:rPr>
-        <w:t xml:space="preserve">, </w:t>
-      </w:r>
-      <w:proofErr w:type="spellStart"/>
-      <w:r>
-        <w:rPr>
-          <w:rFonts w:asciiTheme="majorHAnsi" w:hAnsiTheme="majorHAnsi" w:cstheme="majorHAnsi"/>
-          <w:iCs/>
-          <w:sz w:val="24"/>
-          <w:szCs w:val="24"/>
-        </w:rPr>
-        <w:t>rendendo</w:t>
-      </w:r>
-      <w:proofErr w:type="spellEnd"/>
-      <w:r>
-        <w:rPr>
-          <w:rFonts w:asciiTheme="majorHAnsi" w:hAnsiTheme="majorHAnsi" w:cstheme="majorHAnsi"/>
-          <w:iCs/>
-          <w:sz w:val="24"/>
-          <w:szCs w:val="24"/>
-        </w:rPr>
-        <w:t xml:space="preserve"> </w:t>
-      </w:r>
-      <w:proofErr w:type="spellStart"/>
-      <w:r>
-        <w:rPr>
-          <w:rFonts w:asciiTheme="majorHAnsi" w:hAnsiTheme="majorHAnsi" w:cstheme="majorHAnsi"/>
-          <w:iCs/>
-          <w:sz w:val="24"/>
-          <w:szCs w:val="24"/>
-        </w:rPr>
-        <w:t>accessibile</w:t>
-      </w:r>
-      <w:proofErr w:type="spellEnd"/>
-      <w:r>
-        <w:rPr>
-          <w:rFonts w:asciiTheme="majorHAnsi" w:hAnsiTheme="majorHAnsi" w:cstheme="majorHAnsi"/>
-          <w:iCs/>
-          <w:sz w:val="24"/>
-          <w:szCs w:val="24"/>
-        </w:rPr>
-        <w:t xml:space="preserve"> la </w:t>
-      </w:r>
-      <w:proofErr w:type="spellStart"/>
-      <w:r>
-        <w:rPr>
-          <w:rFonts w:asciiTheme="majorHAnsi" w:hAnsiTheme="majorHAnsi" w:cstheme="majorHAnsi"/>
-          <w:iCs/>
-          <w:sz w:val="24"/>
-          <w:szCs w:val="24"/>
-        </w:rPr>
-        <w:t>produzione</w:t>
-      </w:r>
-      <w:proofErr w:type="spellEnd"/>
-      <w:r>
-        <w:rPr>
-          <w:rFonts w:asciiTheme="majorHAnsi" w:hAnsiTheme="majorHAnsi" w:cstheme="majorHAnsi"/>
-          <w:iCs/>
-          <w:sz w:val="24"/>
-          <w:szCs w:val="24"/>
-        </w:rPr>
-        <w:t xml:space="preserve"> audio </w:t>
-      </w:r>
-      <w:proofErr w:type="spellStart"/>
-      <w:r>
-        <w:rPr>
-          <w:rFonts w:asciiTheme="majorHAnsi" w:hAnsiTheme="majorHAnsi" w:cstheme="majorHAnsi"/>
-          <w:iCs/>
-          <w:sz w:val="24"/>
-          <w:szCs w:val="24"/>
-        </w:rPr>
-        <w:t>attraverso</w:t>
-      </w:r>
-      <w:proofErr w:type="spellEnd"/>
-      <w:r>
-        <w:rPr>
-          <w:rFonts w:asciiTheme="majorHAnsi" w:hAnsiTheme="majorHAnsi" w:cstheme="majorHAnsi"/>
-          <w:iCs/>
-          <w:sz w:val="24"/>
-          <w:szCs w:val="24"/>
-        </w:rPr>
-        <w:t xml:space="preserve"> </w:t>
-      </w:r>
-      <w:proofErr w:type="spellStart"/>
-      <w:r>
-        <w:rPr>
-          <w:rFonts w:asciiTheme="majorHAnsi" w:hAnsiTheme="majorHAnsi" w:cstheme="majorHAnsi"/>
-          <w:iCs/>
-          <w:sz w:val="24"/>
-          <w:szCs w:val="24"/>
-        </w:rPr>
-        <w:t>l'abbattimento</w:t>
-      </w:r>
-      <w:proofErr w:type="spellEnd"/>
-      <w:r>
-        <w:rPr>
-          <w:rFonts w:asciiTheme="majorHAnsi" w:hAnsiTheme="majorHAnsi" w:cstheme="majorHAnsi"/>
-          <w:iCs/>
-          <w:sz w:val="24"/>
-          <w:szCs w:val="24"/>
-        </w:rPr>
-        <w:t xml:space="preserve"> </w:t>
-      </w:r>
-      <w:proofErr w:type="spellStart"/>
-      <w:r>
-        <w:rPr>
-          <w:rFonts w:asciiTheme="majorHAnsi" w:hAnsiTheme="majorHAnsi" w:cstheme="majorHAnsi"/>
-          <w:iCs/>
-          <w:sz w:val="24"/>
-          <w:szCs w:val="24"/>
-        </w:rPr>
-        <w:t>dei</w:t>
-      </w:r>
-      <w:proofErr w:type="spellEnd"/>
-      <w:r>
-        <w:rPr>
-          <w:rFonts w:asciiTheme="majorHAnsi" w:hAnsiTheme="majorHAnsi" w:cstheme="majorHAnsi"/>
-          <w:iCs/>
-          <w:sz w:val="24"/>
-          <w:szCs w:val="24"/>
-        </w:rPr>
-        <w:t xml:space="preserve"> </w:t>
-      </w:r>
-      <w:proofErr w:type="spellStart"/>
-      <w:r>
-        <w:rPr>
-          <w:rFonts w:asciiTheme="majorHAnsi" w:hAnsiTheme="majorHAnsi" w:cstheme="majorHAnsi"/>
-          <w:iCs/>
-          <w:sz w:val="24"/>
-          <w:szCs w:val="24"/>
-        </w:rPr>
-        <w:t>costi</w:t>
-      </w:r>
-      <w:proofErr w:type="spellEnd"/>
-      <w:r>
-        <w:rPr>
-          <w:rFonts w:asciiTheme="majorHAnsi" w:hAnsiTheme="majorHAnsi" w:cstheme="majorHAnsi"/>
-          <w:iCs/>
-          <w:sz w:val="24"/>
-          <w:szCs w:val="24"/>
-        </w:rPr>
-        <w:t xml:space="preserve"> standard e </w:t>
-      </w:r>
-      <w:proofErr w:type="spellStart"/>
-      <w:r>
-        <w:rPr>
-          <w:rFonts w:asciiTheme="majorHAnsi" w:hAnsiTheme="majorHAnsi" w:cstheme="majorHAnsi"/>
-          <w:iCs/>
-          <w:sz w:val="24"/>
-          <w:szCs w:val="24"/>
-        </w:rPr>
-        <w:t>superando</w:t>
-      </w:r>
-      <w:proofErr w:type="spellEnd"/>
-      <w:r>
-        <w:rPr>
-          <w:rFonts w:asciiTheme="majorHAnsi" w:hAnsiTheme="majorHAnsi" w:cstheme="majorHAnsi"/>
-          <w:iCs/>
-          <w:sz w:val="24"/>
-          <w:szCs w:val="24"/>
-        </w:rPr>
-        <w:t xml:space="preserve"> la </w:t>
-      </w:r>
-      <w:proofErr w:type="spellStart"/>
-      <w:r>
-        <w:rPr>
-          <w:rFonts w:asciiTheme="majorHAnsi" w:hAnsiTheme="majorHAnsi" w:cstheme="majorHAnsi"/>
-          <w:iCs/>
-          <w:sz w:val="24"/>
-          <w:szCs w:val="24"/>
-        </w:rPr>
-        <w:t>necessità</w:t>
-      </w:r>
-      <w:proofErr w:type="spellEnd"/>
-      <w:r>
-        <w:rPr>
-          <w:rFonts w:asciiTheme="majorHAnsi" w:hAnsiTheme="majorHAnsi" w:cstheme="majorHAnsi"/>
-          <w:iCs/>
-          <w:sz w:val="24"/>
-          <w:szCs w:val="24"/>
-        </w:rPr>
-        <w:t xml:space="preserve"> di </w:t>
-      </w:r>
-      <w:proofErr w:type="spellStart"/>
-      <w:r>
-        <w:rPr>
-          <w:rFonts w:asciiTheme="majorHAnsi" w:hAnsiTheme="majorHAnsi" w:cstheme="majorHAnsi"/>
-          <w:iCs/>
-          <w:sz w:val="24"/>
-          <w:szCs w:val="24"/>
-        </w:rPr>
-        <w:t>una</w:t>
-      </w:r>
-      <w:proofErr w:type="spellEnd"/>
-      <w:r>
-        <w:rPr>
-          <w:rFonts w:asciiTheme="majorHAnsi" w:hAnsiTheme="majorHAnsi" w:cstheme="majorHAnsi"/>
-          <w:iCs/>
-          <w:sz w:val="24"/>
-          <w:szCs w:val="24"/>
-        </w:rPr>
-        <w:t xml:space="preserve"> </w:t>
-      </w:r>
-      <w:proofErr w:type="spellStart"/>
-      <w:r>
-        <w:rPr>
-          <w:rFonts w:asciiTheme="majorHAnsi" w:hAnsiTheme="majorHAnsi" w:cstheme="majorHAnsi"/>
-          <w:iCs/>
-          <w:sz w:val="24"/>
-          <w:szCs w:val="24"/>
-        </w:rPr>
-        <w:t>formazione</w:t>
-      </w:r>
-      <w:proofErr w:type="spellEnd"/>
-      <w:r>
-        <w:rPr>
-          <w:rFonts w:asciiTheme="majorHAnsi" w:hAnsiTheme="majorHAnsi" w:cstheme="majorHAnsi"/>
-          <w:iCs/>
-          <w:sz w:val="24"/>
-          <w:szCs w:val="24"/>
-        </w:rPr>
-        <w:t xml:space="preserve"> </w:t>
-      </w:r>
-      <w:proofErr w:type="spellStart"/>
-      <w:r>
-        <w:rPr>
-          <w:rFonts w:asciiTheme="majorHAnsi" w:hAnsiTheme="majorHAnsi" w:cstheme="majorHAnsi"/>
-          <w:iCs/>
-          <w:sz w:val="24"/>
-          <w:szCs w:val="24"/>
-        </w:rPr>
-        <w:t>tecnica</w:t>
-      </w:r>
-      <w:proofErr w:type="spellEnd"/>
-      <w:r>
-        <w:rPr>
-          <w:rFonts w:asciiTheme="majorHAnsi" w:hAnsiTheme="majorHAnsi" w:cstheme="majorHAnsi"/>
-          <w:iCs/>
-          <w:sz w:val="24"/>
-          <w:szCs w:val="24"/>
-        </w:rPr>
-        <w:t xml:space="preserve"> specifica.</w:t>
-      </w:r>
-    </w:p>
-    <w:p>
-      <w:pPr>
-        <w:jc w:val="both"/>
-        <w:rPr>
-          <w:rFonts w:asciiTheme="majorHAnsi" w:hAnsiTheme="majorHAnsi" w:cstheme="majorHAnsi"/>
-          <w:sz w:val="24"/>
-          <w:szCs w:val="24"/>
-          <w:lang w:val="it-IT"/>
-        </w:rPr>
-      </w:pPr>
-      <w:r>
-        <w:rPr>
-          <w:rFonts w:asciiTheme="majorHAnsi" w:hAnsiTheme="majorHAnsi" w:cstheme="majorHAnsi"/>
-          <w:iCs/>
-          <w:sz w:val="24"/>
-          <w:szCs w:val="24"/>
-        </w:rPr>
-        <w:t>La</w:t>
-      </w:r>
       <w:r>
         <w:rPr>
           <w:rFonts w:asciiTheme="majorHAnsi" w:hAnsiTheme="majorHAnsi" w:cstheme="majorHAnsi"/>
@@ -1759,6 +1302,57 @@
           <w:szCs w:val="24"/>
           <w:lang w:val="it-IT"/>
         </w:rPr>
+        <w:t>mira ad agevol</w:t>
+      </w:r>
+      <w:r>
+        <w:rPr>
+          <w:rFonts w:asciiTheme="majorHAnsi" w:hAnsiTheme="majorHAnsi" w:cstheme="majorHAnsi"/>
+          <w:iCs/>
+          <w:sz w:val="24"/>
+          <w:szCs w:val="24"/>
+          <w:lang w:val="it-IT"/>
+        </w:rPr>
+        <w:t>a</w:t>
+      </w:r>
+      <w:r>
+        <w:rPr>
+          <w:rFonts w:asciiTheme="majorHAnsi" w:hAnsiTheme="majorHAnsi" w:cstheme="majorHAnsi"/>
+          <w:iCs/>
+          <w:sz w:val="24"/>
+          <w:szCs w:val="24"/>
+          <w:lang w:val="it-IT"/>
+        </w:rPr>
+        <w:t>re i musicisti non professionisti nella realizzazione del proprio brano, rendendo accessibile la produzione audio attraverso l'abbattimento dei costi standard e superando la necessità di una formazione tecnica specifica.</w:t>
+      </w:r>
+    </w:p>
+    <w:p>
+      <w:pPr>
+        <w:jc w:val="both"/>
+        <w:rPr>
+          <w:rFonts w:asciiTheme="majorHAnsi" w:hAnsiTheme="majorHAnsi" w:cstheme="majorHAnsi"/>
+          <w:sz w:val="24"/>
+          <w:szCs w:val="24"/>
+          <w:lang w:val="it-IT"/>
+        </w:rPr>
+      </w:pPr>
+      <w:r>
+        <w:rPr>
+          <w:rFonts w:asciiTheme="majorHAnsi" w:hAnsiTheme="majorHAnsi" w:cstheme="majorHAnsi"/>
+          <w:iCs/>
+          <w:sz w:val="24"/>
+          <w:szCs w:val="24"/>
+          <w:lang w:val="it-IT"/>
+        </w:rPr>
+        <w:t>La</w:t>
+      </w:r>
+      <w:r>
+        <w:rPr>
+          <w:rFonts w:asciiTheme="majorHAnsi" w:hAnsiTheme="majorHAnsi" w:cstheme="majorHAnsi"/>
+          <w:iCs/>
+          <w:sz w:val="24"/>
+          <w:szCs w:val="24"/>
+          <w:lang w:val="it-IT"/>
+        </w:rPr>
         <w:t xml:space="preserve"> piattaforma permette all’utente di selezionare determinati effetti (VST/Plugin), caricare una propria traccia audio e richiederne la modifica con gli effetti desiderati da parte di figure professionali specializzate, ricevendo la traccia modificata. </w:t>
       </w:r>
     </w:p>
@@ -1790,7 +1384,7 @@
         <w:rPr>
           <w:sz w:val="26"/>
           <w:szCs w:val="26"/>
-          <w:lang w:val="it-IT"/>
+          <w:lang w:val="en-GB"/>
         </w:rPr>
       </w:pPr>
       <w:proofErr w:type="spellStart"/>
@@ -1800,7 +1394,7 @@
           <w:bCs/>
           <w:sz w:val="26"/>
           <w:szCs w:val="26"/>
-          <w:lang w:val="it-IT"/>
+          <w:lang w:val="en-GB"/>
         </w:rPr>
         <w:t>SoundBetter</w:t>
       </w:r>
@@ -1811,7 +1405,7 @@
           <w:bCs/>
           <w:sz w:val="26"/>
           <w:szCs w:val="26"/>
-          <w:lang w:val="it-IT"/>
+          <w:lang w:val="en-GB"/>
         </w:rPr>
         <w:t xml:space="preserve"> (</w:t>
       </w:r>
@@ -1845,7 +1439,7 @@
           <w:bCs/>
           <w:sz w:val="26"/>
           <w:szCs w:val="26"/>
-          <w:lang w:val="it-IT"/>
+          <w:lang w:val="en-GB"/>
         </w:rPr>
         <w:t>)</w:t>
       </w:r>
@@ -1858,7 +1452,7 @@
           <w:bCs/>
           <w:sz w:val="26"/>
           <w:szCs w:val="26"/>
-          <w:lang w:val="it-IT"/>
+          <w:lang w:val="en-GB"/>
         </w:rPr>
       </w:pPr>
     </w:p>
@@ -2509,158 +2103,123 @@
         </w:rPr>
         <w:t xml:space="preserve"> (</w:t>
       </w:r>
-      <w:hyperlink r:id="rId12" w:history="1">
-        <w:r>
-          <w:rPr>
-            <w:rStyle w:val="Collegamentoipertestuale"/>
-            <w:b/>
-            <w:bCs/>
-            <w:sz w:val="26"/>
-            <w:szCs w:val="26"/>
-          </w:rPr>
-          <w:t xml:space="preserve">Fiverr | Marketplace di </w:t>
-        </w:r>
-        <w:proofErr w:type="spellStart"/>
-        <w:r>
-          <w:rPr>
-            <w:rStyle w:val="Collegamentoipertestuale"/>
-            <w:b/>
-            <w:bCs/>
-            <w:sz w:val="26"/>
-            <w:szCs w:val="26"/>
-          </w:rPr>
-          <w:t>servizi</w:t>
-        </w:r>
-        <w:proofErr w:type="spellEnd"/>
-        <w:r>
-          <w:rPr>
-            <w:rStyle w:val="Collegamentoipertestuale"/>
-            <w:b/>
-            <w:bCs/>
-            <w:sz w:val="26"/>
-            <w:szCs w:val="26"/>
-          </w:rPr>
-          <w:t xml:space="preserve"> freelance | Trova </w:t>
-        </w:r>
-        <w:proofErr w:type="spellStart"/>
-        <w:r>
-          <w:rPr>
-            <w:rStyle w:val="Collegamentoipertestuale"/>
-            <w:b/>
-            <w:bCs/>
-            <w:sz w:val="26"/>
-            <w:szCs w:val="26"/>
-          </w:rPr>
-          <w:t>i</w:t>
-        </w:r>
-        <w:proofErr w:type="spellEnd"/>
-        <w:r>
-          <w:rPr>
-            <w:rStyle w:val="Collegamentoipertestuale"/>
-            <w:b/>
-            <w:bCs/>
-            <w:sz w:val="26"/>
-            <w:szCs w:val="26"/>
-          </w:rPr>
-          <w:t xml:space="preserve"> </w:t>
-        </w:r>
-        <w:proofErr w:type="spellStart"/>
-        <w:r>
-          <w:rPr>
-            <w:rStyle w:val="Collegamentoipertestuale"/>
-            <w:b/>
-            <w:bCs/>
-            <w:sz w:val="26"/>
-            <w:szCs w:val="26"/>
-          </w:rPr>
-          <w:t>migliori</w:t>
-        </w:r>
-        <w:proofErr w:type="spellEnd"/>
-        <w:r>
-          <w:rPr>
-            <w:rStyle w:val="Collegamentoipertestuale"/>
-            <w:b/>
-            <w:bCs/>
-            <w:sz w:val="26"/>
-            <w:szCs w:val="26"/>
-          </w:rPr>
-          <w:t xml:space="preserve"> </w:t>
-        </w:r>
-        <w:proofErr w:type="spellStart"/>
-        <w:r>
-          <w:rPr>
-            <w:rStyle w:val="Collegamentoipertestuale"/>
-            <w:b/>
-            <w:bCs/>
-            <w:sz w:val="26"/>
-            <w:szCs w:val="26"/>
-          </w:rPr>
-          <w:t>talenti</w:t>
-        </w:r>
-        <w:proofErr w:type="spellEnd"/>
-        <w:r>
-          <w:rPr>
-            <w:rStyle w:val="Collegamentoipertestuale"/>
-            <w:b/>
-            <w:bCs/>
-            <w:sz w:val="26"/>
-            <w:szCs w:val="26"/>
-          </w:rPr>
-          <w:t xml:space="preserve"> </w:t>
-        </w:r>
-        <w:proofErr w:type="spellStart"/>
-        <w:r>
-          <w:rPr>
-            <w:rStyle w:val="Collegamentoipertestuale"/>
-            <w:b/>
-            <w:bCs/>
-            <w:sz w:val="26"/>
-            <w:szCs w:val="26"/>
-          </w:rPr>
-          <w:t>globali</w:t>
-        </w:r>
-        <w:proofErr w:type="spellEnd"/>
-      </w:hyperlink>
+      <w:proofErr w:type="spellStart"/>
       <w:r>
-        <w:rPr>
+        <w:fldChar w:fldCharType="begin"/>
+      </w:r>
+      <w:r>
+        <w:rPr>
+          <w:lang w:val="it-IT"/>
+        </w:rPr>
+        <w:instrText>HYPERLINK "https://it.fiverr.com/"</w:instrText>
+      </w:r>
+      <w:r>
+        <w:fldChar w:fldCharType="separate"/>
+      </w:r>
+      <w:r>
+        <w:rPr>
+          <w:rStyle w:val="Collegamentoipertestuale"/>
           <w:b/>
           <w:bCs/>
           <w:sz w:val="26"/>
           <w:szCs w:val="26"/>
           <w:lang w:val="it-IT"/>
         </w:rPr>
-        <w:t>)</w:t>
+        <w:t>Fiverr</w:t>
       </w:r>
-    </w:p>
-    <w:p>
-      <w:pPr>
-        <w:pStyle w:val="Paragrafoelenco"/>
-        <w:rPr>
+      <w:proofErr w:type="spellEnd"/>
+      <w:r>
+        <w:rPr>
+          <w:rStyle w:val="Collegamentoipertestuale"/>
           <w:b/>
           <w:bCs/>
           <w:sz w:val="26"/>
           <w:szCs w:val="26"/>
           <w:lang w:val="it-IT"/>
         </w:rPr>
-      </w:pPr>
-    </w:p>
-    <w:p>
-      <w:pPr>
-        <w:pStyle w:val="Paragrafoelenco"/>
-        <w:rPr>
-          <w:lang w:val="it-IT"/>
-        </w:rPr>
-      </w:pPr>
-    </w:p>
-    <w:p>
-      <w:pPr>
-        <w:pStyle w:val="Paragrafoelenco"/>
-        <w:rPr>
+        <w:t xml:space="preserve"> | Marketplace di servizi freelance | Trova i migliori talenti globali</w:t>
+      </w:r>
+      <w:r>
+        <w:fldChar w:fldCharType="end"/>
+      </w:r>
+      <w:r>
+        <w:rPr>
+          <w:b/>
+          <w:bCs/>
           <w:sz w:val="26"/>
           <w:szCs w:val="26"/>
           <w:lang w:val="it-IT"/>
         </w:rPr>
-      </w:pPr>
+        <w:t>)</w:t>
+      </w:r>
+    </w:p>
+    <w:p>
+      <w:pPr>
+        <w:pStyle w:val="Paragrafoelenco"/>
+        <w:rPr>
+          <w:lang w:val="it-IT"/>
+        </w:rPr>
+      </w:pPr>
+      <w:proofErr w:type="spellStart"/>
+      <w:r>
+        <w:rPr>
+          <w:lang w:val="it-IT"/>
+        </w:rPr>
+        <w:t>Fiver</w:t>
+      </w:r>
+      <w:proofErr w:type="spellEnd"/>
+      <w:r>
+        <w:rPr>
+          <w:lang w:val="it-IT"/>
+        </w:rPr>
+        <w:t xml:space="preserve"> è un sito internazionale che offre servizi di freelance in diversi ambiti. </w:t>
+      </w:r>
+    </w:p>
+    <w:p>
+      <w:pPr>
+        <w:pStyle w:val="Paragrafoelenco"/>
+        <w:rPr>
+          <w:lang w:val="it-IT"/>
+        </w:rPr>
+      </w:pPr>
+      <w:r>
+        <w:rPr>
+          <w:lang w:val="it-IT"/>
+        </w:rPr>
+        <w:t>Ciò che richiama l’attenzione è il banner centrale che promuove le categorie popolari o in evidenza. Sulla parte superiore troviamo una barra di ricerca e le categorie, affiancati dalle sezioni per l’accesso</w:t>
+      </w:r>
+      <w:r>
+        <w:rPr>
+          <w:lang w:val="it-IT"/>
+        </w:rPr>
+        <w:t xml:space="preserve">. Sotto il testo di benvenuto ci sono due opzioni: una permette di generare un brief con l’AI, l’altra di scaricare l’app di </w:t>
+      </w:r>
+      <w:proofErr w:type="spellStart"/>
+      <w:r>
+        <w:rPr>
+          <w:lang w:val="it-IT"/>
+        </w:rPr>
+        <w:t>Fiver</w:t>
+      </w:r>
+      <w:proofErr w:type="spellEnd"/>
+      <w:r>
+        <w:rPr>
+          <w:lang w:val="it-IT"/>
+        </w:rPr>
+        <w:t>.</w:t>
+      </w:r>
+      <w:r>
+        <w:rPr>
+          <w:lang w:val="it-IT"/>
+        </w:rPr>
+        <w:t xml:space="preserve"> Dopo si possono esplorare i consigliati in cui vengono mostrati i video delle persone che offrono i loro servizi</w:t>
+      </w:r>
+      <w:r>
+        <w:rPr>
+          <w:lang w:val="it-IT"/>
+        </w:rPr>
+        <w:t>.</w:t>
+      </w:r>
     </w:p>
     <w:p>
       <w:pPr>
@@ -2671,20 +2230,454 @@
           <w:lang w:val="it-IT"/>
         </w:rPr>
       </w:pPr>
+      <w:r>
+        <w:rPr>
+          <w:noProof/>
+        </w:rPr>
+        <w:drawing>
+          <wp:inline distT="0" distB="0" distL="0" distR="0" wp14:anchorId="69AFF9C5" wp14:editId="0D306AA8">
+            <wp:extent cx="4724400" cy="2194331"/>
+            <wp:effectExtent l="0" t="0" r="0" b="0"/>
+            <wp:docPr id="1672585320" name="Immagine 1"/>
+            <wp:cNvGraphicFramePr>
+              <a:graphicFrameLocks xmlns:a="http://schemas.openxmlformats.org/drawingml/2006/main" noChangeAspect="1"/>
+            </wp:cNvGraphicFramePr>
+            <a:graphic xmlns:a="http://schemas.openxmlformats.org/drawingml/2006/main">
+              <a:graphicData uri="http://schemas.openxmlformats.org/drawingml/2006/picture">
+                <pic:pic xmlns:pic="http://schemas.openxmlformats.org/drawingml/2006/picture">
+                  <pic:nvPicPr>
+                    <pic:cNvPr id="0" name="Picture 1"/>
+                    <pic:cNvPicPr>
+                      <a:picLocks noChangeAspect="1" noChangeArrowheads="1"/>
+                    </pic:cNvPicPr>
+                  </pic:nvPicPr>
+                  <pic:blipFill>
+                    <a:blip r:embed="rId12">
+                      <a:extLst>
+                        <a:ext uri="{28A0092B-C50C-407E-A947-70E740481C1C}">
+                          <a14:useLocalDpi xmlns:a14="http://schemas.microsoft.com/office/drawing/2010/main" val="0"/>
+                        </a:ext>
+                      </a:extLst>
+                    </a:blip>
+                    <a:srcRect/>
+                    <a:stretch>
+                      <a:fillRect/>
+                    </a:stretch>
+                  </pic:blipFill>
+                  <pic:spPr bwMode="auto">
+                    <a:xfrm>
+                      <a:off x="0" y="0"/>
+                      <a:ext cx="4737570" cy="2200448"/>
+                    </a:xfrm>
+                    <a:prstGeom prst="rect">
+                      <a:avLst/>
+                    </a:prstGeom>
+                    <a:noFill/>
+                    <a:ln>
+                      <a:noFill/>
+                    </a:ln>
+                  </pic:spPr>
+                </pic:pic>
+              </a:graphicData>
+            </a:graphic>
+          </wp:inline>
+        </w:drawing>
+      </w:r>
     </w:p>
     <w:p>
       <w:pPr>
         <w:pStyle w:val="Paragrafoelenco"/>
         <w:rPr>
+          <w:lang w:val="it-IT"/>
+        </w:rPr>
+      </w:pPr>
+      <w:r>
+        <w:rPr>
+          <w:lang w:val="it-IT"/>
+        </w:rPr>
+        <w:t>Sceglien</w:t>
+      </w:r>
+      <w:r>
+        <w:rPr>
+          <w:lang w:val="it-IT"/>
+        </w:rPr>
+        <w:t>do la sezione musica tra le varie categorie</w:t>
+      </w:r>
+      <w:r>
+        <w:rPr>
+          <w:lang w:val="it-IT"/>
+        </w:rPr>
+        <w:t xml:space="preserve"> si apre una nuova scheda. In questa pagina vediamo in evidenza il titolo della categoria con una breve descrizione e un video di presentazione. Sotto ci sono tutti i servizi disponibili nella sezione musica accompagnati da immagini</w:t>
+      </w:r>
+      <w:r>
+        <w:rPr>
+          <w:lang w:val="it-IT"/>
+        </w:rPr>
+        <w:t>.</w:t>
+      </w:r>
+    </w:p>
+    <w:p>
+      <w:pPr>
+        <w:pStyle w:val="Paragrafoelenco"/>
+        <w:rPr>
+          <w:b/>
+          <w:bCs/>
           <w:sz w:val="26"/>
           <w:szCs w:val="26"/>
           <w:lang w:val="it-IT"/>
         </w:rPr>
       </w:pPr>
+      <w:r>
+        <w:rPr>
+          <w:noProof/>
+        </w:rPr>
+        <w:lastRenderedPageBreak/>
+        <w:drawing>
+          <wp:anchor distT="0" distB="0" distL="114300" distR="114300" simplePos="0" relativeHeight="251657216" behindDoc="0" locked="0" layoutInCell="1" allowOverlap="1" wp14:anchorId="43BA6029" wp14:editId="263A6934">
+            <wp:simplePos x="0" y="0"/>
+            <wp:positionH relativeFrom="column">
+              <wp:posOffset>-419100</wp:posOffset>
+            </wp:positionH>
+            <wp:positionV relativeFrom="paragraph">
+              <wp:posOffset>-114300</wp:posOffset>
+            </wp:positionV>
+            <wp:extent cx="3022181" cy="1874520"/>
+            <wp:effectExtent l="0" t="0" r="6985" b="0"/>
+            <wp:wrapThrough wrapText="bothSides">
+              <wp:wrapPolygon edited="0">
+                <wp:start x="0" y="0"/>
+                <wp:lineTo x="0" y="21293"/>
+                <wp:lineTo x="21514" y="21293"/>
+                <wp:lineTo x="21514" y="0"/>
+                <wp:lineTo x="0" y="0"/>
+              </wp:wrapPolygon>
+            </wp:wrapThrough>
+            <wp:docPr id="773313245" name="Immagine 2" descr="How To Find Musicians for Your Projects (2025) | Fiverr"/>
+            <wp:cNvGraphicFramePr>
+              <a:graphicFrameLocks xmlns:a="http://schemas.openxmlformats.org/drawingml/2006/main" noChangeAspect="1"/>
+            </wp:cNvGraphicFramePr>
+            <a:graphic xmlns:a="http://schemas.openxmlformats.org/drawingml/2006/main">
+              <a:graphicData uri="http://schemas.openxmlformats.org/drawingml/2006/picture">
+                <pic:pic xmlns:pic="http://schemas.openxmlformats.org/drawingml/2006/picture">
+                  <pic:nvPicPr>
+                    <pic:cNvPr id="0" name="Picture 3" descr="How To Find Musicians for Your Projects (2025) | Fiverr"/>
+                    <pic:cNvPicPr>
+                      <a:picLocks noChangeAspect="1" noChangeArrowheads="1"/>
+                    </pic:cNvPicPr>
+                  </pic:nvPicPr>
+                  <pic:blipFill>
+                    <a:blip r:embed="rId13">
+                      <a:extLst>
+                        <a:ext uri="{28A0092B-C50C-407E-A947-70E740481C1C}">
+                          <a14:useLocalDpi xmlns:a14="http://schemas.microsoft.com/office/drawing/2010/main" val="0"/>
+                        </a:ext>
+                      </a:extLst>
+                    </a:blip>
+                    <a:srcRect/>
+                    <a:stretch>
+                      <a:fillRect/>
+                    </a:stretch>
+                  </pic:blipFill>
+                  <pic:spPr bwMode="auto">
+                    <a:xfrm>
+                      <a:off x="0" y="0"/>
+                      <a:ext cx="3022181" cy="1874520"/>
+                    </a:xfrm>
+                    <a:prstGeom prst="rect">
+                      <a:avLst/>
+                    </a:prstGeom>
+                    <a:noFill/>
+                    <a:ln>
+                      <a:noFill/>
+                    </a:ln>
+                  </pic:spPr>
+                </pic:pic>
+              </a:graphicData>
+            </a:graphic>
+            <wp14:sizeRelH relativeFrom="page">
+              <wp14:pctWidth>0</wp14:pctWidth>
+            </wp14:sizeRelH>
+            <wp14:sizeRelV relativeFrom="page">
+              <wp14:pctHeight>0</wp14:pctHeight>
+            </wp14:sizeRelV>
+          </wp:anchor>
+        </w:drawing>
+      </w:r>
+      <w:r>
+        <w:rPr>
+          <w:noProof/>
+          <w:sz w:val="26"/>
+          <w:szCs w:val="26"/>
+          <w:lang w:val="it-IT"/>
+        </w:rPr>
+        <w:drawing>
+          <wp:anchor distT="0" distB="0" distL="114300" distR="114300" simplePos="0" relativeHeight="251661312" behindDoc="0" locked="0" layoutInCell="1" allowOverlap="1" wp14:anchorId="651501E2" wp14:editId="5D231E24">
+            <wp:simplePos x="0" y="0"/>
+            <wp:positionH relativeFrom="column">
+              <wp:posOffset>2781300</wp:posOffset>
+            </wp:positionH>
+            <wp:positionV relativeFrom="paragraph">
+              <wp:posOffset>68580</wp:posOffset>
+            </wp:positionV>
+            <wp:extent cx="3397921" cy="1562100"/>
+            <wp:effectExtent l="0" t="0" r="0" b="0"/>
+            <wp:wrapThrough wrapText="bothSides">
+              <wp:wrapPolygon edited="0">
+                <wp:start x="0" y="0"/>
+                <wp:lineTo x="0" y="21337"/>
+                <wp:lineTo x="21434" y="21337"/>
+                <wp:lineTo x="21434" y="0"/>
+                <wp:lineTo x="0" y="0"/>
+              </wp:wrapPolygon>
+            </wp:wrapThrough>
+            <wp:docPr id="1427747628" name="Immagine 6"/>
+            <wp:cNvGraphicFramePr>
+              <a:graphicFrameLocks xmlns:a="http://schemas.openxmlformats.org/drawingml/2006/main" noChangeAspect="1"/>
+            </wp:cNvGraphicFramePr>
+            <a:graphic xmlns:a="http://schemas.openxmlformats.org/drawingml/2006/main">
+              <a:graphicData uri="http://schemas.openxmlformats.org/drawingml/2006/picture">
+                <pic:pic xmlns:pic="http://schemas.openxmlformats.org/drawingml/2006/picture">
+                  <pic:nvPicPr>
+                    <pic:cNvPr id="0" name="Picture 13"/>
+                    <pic:cNvPicPr>
+                      <a:picLocks noChangeAspect="1" noChangeArrowheads="1"/>
+                    </pic:cNvPicPr>
+                  </pic:nvPicPr>
+                  <pic:blipFill>
+                    <a:blip r:embed="rId14">
+                      <a:extLst>
+                        <a:ext uri="{28A0092B-C50C-407E-A947-70E740481C1C}">
+                          <a14:useLocalDpi xmlns:a14="http://schemas.microsoft.com/office/drawing/2010/main" val="0"/>
+                        </a:ext>
+                      </a:extLst>
+                    </a:blip>
+                    <a:srcRect/>
+                    <a:stretch>
+                      <a:fillRect/>
+                    </a:stretch>
+                  </pic:blipFill>
+                  <pic:spPr bwMode="auto">
+                    <a:xfrm>
+                      <a:off x="0" y="0"/>
+                      <a:ext cx="3397921" cy="1562100"/>
+                    </a:xfrm>
+                    <a:prstGeom prst="rect">
+                      <a:avLst/>
+                    </a:prstGeom>
+                    <a:noFill/>
+                    <a:ln>
+                      <a:noFill/>
+                    </a:ln>
+                  </pic:spPr>
+                </pic:pic>
+              </a:graphicData>
+            </a:graphic>
+            <wp14:sizeRelH relativeFrom="page">
+              <wp14:pctWidth>0</wp14:pctWidth>
+            </wp14:sizeRelH>
+            <wp14:sizeRelV relativeFrom="page">
+              <wp14:pctHeight>0</wp14:pctHeight>
+            </wp14:sizeRelV>
+          </wp:anchor>
+        </w:drawing>
+      </w:r>
     </w:p>
     <w:p>
       <w:pPr>
         <w:pStyle w:val="Paragrafoelenco"/>
+        <w:rPr>
+          <w:lang w:val="it-IT"/>
+        </w:rPr>
+      </w:pPr>
+    </w:p>
+    <w:p>
+      <w:pPr>
+        <w:pStyle w:val="Paragrafoelenco"/>
+        <w:rPr>
+          <w:sz w:val="26"/>
+          <w:szCs w:val="26"/>
+          <w:lang w:val="it-IT"/>
+        </w:rPr>
+      </w:pPr>
+    </w:p>
+    <w:p>
+      <w:pPr>
+        <w:pStyle w:val="Paragrafoelenco"/>
+        <w:rPr>
+          <w:rFonts w:asciiTheme="majorHAnsi" w:hAnsiTheme="majorHAnsi" w:cstheme="majorHAnsi"/>
+          <w:sz w:val="24"/>
+          <w:szCs w:val="24"/>
+          <w:lang w:val="it-IT"/>
+        </w:rPr>
+      </w:pPr>
+      <w:r>
+        <w:rPr>
+          <w:rFonts w:asciiTheme="majorHAnsi" w:hAnsiTheme="majorHAnsi" w:cstheme="majorHAnsi"/>
+          <w:sz w:val="24"/>
+          <w:szCs w:val="24"/>
+          <w:lang w:val="it-IT"/>
+        </w:rPr>
+        <w:t xml:space="preserve">La pagina di ogni servizio </w:t>
+      </w:r>
+      <w:r>
+        <w:rPr>
+          <w:rFonts w:asciiTheme="majorHAnsi" w:hAnsiTheme="majorHAnsi" w:cstheme="majorHAnsi"/>
+          <w:sz w:val="24"/>
+          <w:szCs w:val="24"/>
+          <w:lang w:val="it-IT"/>
+        </w:rPr>
+        <w:t>include</w:t>
+      </w:r>
+      <w:r>
+        <w:rPr>
+          <w:rFonts w:asciiTheme="majorHAnsi" w:hAnsiTheme="majorHAnsi" w:cstheme="majorHAnsi"/>
+          <w:sz w:val="24"/>
+          <w:szCs w:val="24"/>
+          <w:lang w:val="it-IT"/>
+        </w:rPr>
+        <w:t xml:space="preserve"> una descrizione completa del servizio offerto, esempi audio e video, </w:t>
+      </w:r>
+      <w:r>
+        <w:rPr>
+          <w:rFonts w:asciiTheme="majorHAnsi" w:hAnsiTheme="majorHAnsi" w:cstheme="majorHAnsi"/>
+          <w:sz w:val="24"/>
+          <w:szCs w:val="24"/>
+          <w:lang w:val="it-IT"/>
+        </w:rPr>
+        <w:t>prezzo di partenza,</w:t>
+      </w:r>
+      <w:r>
+        <w:rPr>
+          <w:rFonts w:asciiTheme="majorHAnsi" w:hAnsiTheme="majorHAnsi" w:cstheme="majorHAnsi"/>
+          <w:sz w:val="24"/>
+          <w:szCs w:val="24"/>
+          <w:lang w:val="it-IT"/>
+        </w:rPr>
+        <w:t xml:space="preserve"> </w:t>
+      </w:r>
+      <w:r>
+        <w:rPr>
+          <w:rFonts w:asciiTheme="majorHAnsi" w:hAnsiTheme="majorHAnsi" w:cstheme="majorHAnsi"/>
+          <w:sz w:val="24"/>
+          <w:szCs w:val="24"/>
+          <w:lang w:val="it-IT"/>
+        </w:rPr>
+        <w:t>recensioni</w:t>
+      </w:r>
+      <w:r>
+        <w:rPr>
+          <w:rFonts w:asciiTheme="majorHAnsi" w:hAnsiTheme="majorHAnsi" w:cstheme="majorHAnsi"/>
+          <w:sz w:val="24"/>
+          <w:szCs w:val="24"/>
+          <w:lang w:val="it-IT"/>
+        </w:rPr>
+        <w:t xml:space="preserve"> e informazioni sul venditore</w:t>
+      </w:r>
+      <w:r>
+        <w:rPr>
+          <w:rFonts w:asciiTheme="majorHAnsi" w:hAnsiTheme="majorHAnsi" w:cstheme="majorHAnsi"/>
+          <w:sz w:val="24"/>
+          <w:szCs w:val="24"/>
+          <w:lang w:val="it-IT"/>
+        </w:rPr>
+        <w:t>.</w:t>
+      </w:r>
+      <w:r>
+        <w:rPr>
+          <w:rFonts w:asciiTheme="majorHAnsi" w:hAnsiTheme="majorHAnsi" w:cstheme="majorHAnsi"/>
+          <w:sz w:val="24"/>
+          <w:szCs w:val="24"/>
+          <w:lang w:val="it-IT"/>
+        </w:rPr>
+        <w:t xml:space="preserve"> C’è anche un sommario generato dall’AI. </w:t>
+      </w:r>
+      <w:r>
+        <w:rPr>
+          <w:rFonts w:asciiTheme="majorHAnsi" w:hAnsiTheme="majorHAnsi" w:cstheme="majorHAnsi"/>
+          <w:sz w:val="24"/>
+          <w:szCs w:val="24"/>
+          <w:lang w:val="it-IT"/>
+        </w:rPr>
+        <w:t>L’acquisto è consentito solo agli utenti registrati, ma è possibile navigare liberamente</w:t>
+      </w:r>
+      <w:r>
+        <w:rPr>
+          <w:rFonts w:asciiTheme="majorHAnsi" w:hAnsiTheme="majorHAnsi" w:cstheme="majorHAnsi"/>
+          <w:sz w:val="24"/>
+          <w:szCs w:val="24"/>
+          <w:lang w:val="it-IT"/>
+        </w:rPr>
+        <w:t>.</w:t>
+      </w:r>
+    </w:p>
+    <w:p>
+      <w:pPr>
+        <w:pStyle w:val="Paragrafoelenco"/>
+        <w:rPr>
+          <w:sz w:val="26"/>
+          <w:szCs w:val="26"/>
+          <w:lang w:val="it-IT"/>
+        </w:rPr>
+      </w:pPr>
+      <w:r>
+        <w:rPr>
+          <w:noProof/>
+          <w:sz w:val="26"/>
+          <w:szCs w:val="26"/>
+          <w:lang w:val="it-IT"/>
+        </w:rPr>
+        <w:drawing>
+          <wp:inline distT="0" distB="0" distL="0" distR="0" wp14:anchorId="69966F1E" wp14:editId="4529E5B4">
+            <wp:extent cx="4993239" cy="2314575"/>
+            <wp:effectExtent l="0" t="0" r="0" b="0"/>
+            <wp:docPr id="1744061755" name="Immagine 9"/>
+            <wp:cNvGraphicFramePr>
+              <a:graphicFrameLocks xmlns:a="http://schemas.openxmlformats.org/drawingml/2006/main" noChangeAspect="1"/>
+            </wp:cNvGraphicFramePr>
+            <a:graphic xmlns:a="http://schemas.openxmlformats.org/drawingml/2006/main">
+              <a:graphicData uri="http://schemas.openxmlformats.org/drawingml/2006/picture">
+                <pic:pic xmlns:pic="http://schemas.openxmlformats.org/drawingml/2006/picture">
+                  <pic:nvPicPr>
+                    <pic:cNvPr id="0" name="Picture 20"/>
+                    <pic:cNvPicPr>
+                      <a:picLocks noChangeAspect="1" noChangeArrowheads="1"/>
+                    </pic:cNvPicPr>
+                  </pic:nvPicPr>
+                  <pic:blipFill>
+                    <a:blip r:embed="rId15">
+                      <a:extLst>
+                        <a:ext uri="{28A0092B-C50C-407E-A947-70E740481C1C}">
+                          <a14:useLocalDpi xmlns:a14="http://schemas.microsoft.com/office/drawing/2010/main" val="0"/>
+                        </a:ext>
+                      </a:extLst>
+                    </a:blip>
+                    <a:srcRect/>
+                    <a:stretch>
+                      <a:fillRect/>
+                    </a:stretch>
+                  </pic:blipFill>
+                  <pic:spPr bwMode="auto">
+                    <a:xfrm>
+                      <a:off x="0" y="0"/>
+                      <a:ext cx="5010522" cy="2322586"/>
+                    </a:xfrm>
+                    <a:prstGeom prst="rect">
+                      <a:avLst/>
+                    </a:prstGeom>
+                    <a:noFill/>
+                    <a:ln>
+                      <a:noFill/>
+                    </a:ln>
+                  </pic:spPr>
+                </pic:pic>
+              </a:graphicData>
+            </a:graphic>
+          </wp:inline>
+        </w:drawing>
+      </w:r>
+    </w:p>
+    <w:p>
+      <w:pPr>
         <w:rPr>
           <w:sz w:val="26"/>
           <w:szCs w:val="26"/>

</xml_diff>

<commit_message>
MOdifiche impaginazione Documento Proposal
</commit_message>
<xml_diff>
--- a/Saendwave_Project_Proposal.docx
+++ b/Saendwave_Project_Proposal.docx
@@ -9,7 +9,6 @@
           <w:rFonts w:asciiTheme="majorHAnsi" w:hAnsiTheme="majorHAnsi" w:cstheme="majorHAnsi"/>
           <w:sz w:val="52"/>
           <w:szCs w:val="52"/>
-          <w:lang w:val="it-IT"/>
         </w:rPr>
       </w:pPr>
       <w:r>
@@ -18,7 +17,6 @@
           <w:b/>
           <w:sz w:val="52"/>
           <w:szCs w:val="52"/>
-          <w:lang w:val="it-IT"/>
         </w:rPr>
         <w:t>Università degli Studi di Salerno</w:t>
       </w:r>
@@ -30,7 +28,6 @@
           <w:rFonts w:asciiTheme="majorHAnsi" w:hAnsiTheme="majorHAnsi" w:cstheme="majorHAnsi"/>
           <w:sz w:val="40"/>
           <w:szCs w:val="40"/>
-          <w:lang w:val="it-IT"/>
         </w:rPr>
       </w:pPr>
       <w:r>
@@ -38,7 +35,6 @@
           <w:rFonts w:asciiTheme="majorHAnsi" w:hAnsiTheme="majorHAnsi" w:cstheme="majorHAnsi"/>
           <w:sz w:val="40"/>
           <w:szCs w:val="40"/>
-          <w:lang w:val="it-IT"/>
         </w:rPr>
         <w:t>Corso di Laurea in Informatica</w:t>
       </w:r>
@@ -50,19 +46,18 @@
           <w:rFonts w:ascii="Times New Roman" w:eastAsia="Times New Roman" w:hAnsi="Times New Roman" w:cs="Times New Roman"/>
           <w:sz w:val="24"/>
           <w:szCs w:val="24"/>
-          <w:lang w:val="it-IT" w:eastAsia="it-IT"/>
+          <w:lang w:eastAsia="it-IT"/>
         </w:rPr>
       </w:pPr>
       <w:r>
         <w:rPr>
           <w:rFonts w:ascii="Times New Roman" w:eastAsia="Times New Roman" w:hAnsi="Times New Roman" w:cs="Times New Roman"/>
-          <w:noProof/>
           <w:sz w:val="24"/>
           <w:szCs w:val="24"/>
-          <w:lang w:val="it-IT" w:eastAsia="it-IT"/>
+          <w:lang w:eastAsia="it-IT"/>
         </w:rPr>
         <w:drawing>
-          <wp:anchor distT="0" distB="0" distL="114300" distR="114300" simplePos="0" relativeHeight="251658240" behindDoc="1" locked="0" layoutInCell="1" allowOverlap="1" wp14:anchorId="682770F5" wp14:editId="6CCDF99C">
+          <wp:anchor distT="0" distB="0" distL="114300" distR="114300" simplePos="0" relativeHeight="251655168" behindDoc="1" locked="0" layoutInCell="1" allowOverlap="1" wp14:anchorId="682770F5" wp14:editId="6CCDF99C">
             <wp:simplePos x="0" y="0"/>
             <wp:positionH relativeFrom="column">
               <wp:posOffset>975360</wp:posOffset>
@@ -129,7 +124,6 @@
           <w:rFonts w:asciiTheme="majorHAnsi" w:hAnsiTheme="majorHAnsi" w:cstheme="majorHAnsi"/>
           <w:sz w:val="24"/>
           <w:szCs w:val="24"/>
-          <w:lang w:val="it-IT"/>
         </w:rPr>
         <w:br/>
       </w:r>
@@ -138,7 +132,6 @@
           <w:rFonts w:asciiTheme="majorHAnsi" w:hAnsiTheme="majorHAnsi" w:cstheme="majorHAnsi"/>
           <w:sz w:val="24"/>
           <w:szCs w:val="24"/>
-          <w:lang w:val="it-IT"/>
         </w:rPr>
         <w:br/>
       </w:r>
@@ -147,7 +140,7 @@
           <w:rFonts w:ascii="Times New Roman" w:eastAsia="Times New Roman" w:hAnsi="Times New Roman" w:cs="Times New Roman"/>
           <w:sz w:val="24"/>
           <w:szCs w:val="24"/>
-          <w:lang w:val="it-IT" w:eastAsia="it-IT"/>
+          <w:lang w:eastAsia="it-IT"/>
         </w:rPr>
         <w:fldChar w:fldCharType="begin"/>
       </w:r>
@@ -156,7 +149,7 @@
           <w:rFonts w:ascii="Times New Roman" w:eastAsia="Times New Roman" w:hAnsi="Times New Roman" w:cs="Times New Roman"/>
           <w:sz w:val="24"/>
           <w:szCs w:val="24"/>
-          <w:lang w:val="it-IT" w:eastAsia="it-IT"/>
+          <w:lang w:eastAsia="it-IT"/>
         </w:rPr>
         <w:instrText xml:space="preserve"> INCLUDEPICTURE "https://www.opisalerno.it/wp-content/uploads/2016/11/logo-unisa-png.png" \* MERGEFORMATINET </w:instrText>
       </w:r>
@@ -165,7 +158,7 @@
           <w:rFonts w:ascii="Times New Roman" w:eastAsia="Times New Roman" w:hAnsi="Times New Roman" w:cs="Times New Roman"/>
           <w:sz w:val="24"/>
           <w:szCs w:val="24"/>
-          <w:lang w:val="it-IT" w:eastAsia="it-IT"/>
+          <w:lang w:eastAsia="it-IT"/>
         </w:rPr>
         <w:fldChar w:fldCharType="separate"/>
       </w:r>
@@ -174,7 +167,7 @@
           <w:rFonts w:ascii="Times New Roman" w:eastAsia="Times New Roman" w:hAnsi="Times New Roman" w:cs="Times New Roman"/>
           <w:sz w:val="24"/>
           <w:szCs w:val="24"/>
-          <w:lang w:val="it-IT" w:eastAsia="it-IT"/>
+          <w:lang w:eastAsia="it-IT"/>
         </w:rPr>
         <w:fldChar w:fldCharType="end"/>
       </w:r>
@@ -187,7 +180,6 @@
           <w:b/>
           <w:sz w:val="48"/>
           <w:szCs w:val="48"/>
-          <w:lang w:val="it-IT"/>
         </w:rPr>
       </w:pPr>
     </w:p>
@@ -199,7 +191,6 @@
           <w:b/>
           <w:sz w:val="48"/>
           <w:szCs w:val="48"/>
-          <w:lang w:val="it-IT"/>
         </w:rPr>
       </w:pPr>
     </w:p>
@@ -210,7 +201,6 @@
           <w:b/>
           <w:sz w:val="48"/>
           <w:szCs w:val="48"/>
-          <w:lang w:val="it-IT"/>
         </w:rPr>
       </w:pPr>
     </w:p>
@@ -221,7 +211,6 @@
           <w:rFonts w:asciiTheme="majorHAnsi" w:hAnsiTheme="majorHAnsi" w:cstheme="majorHAnsi"/>
           <w:sz w:val="44"/>
           <w:szCs w:val="44"/>
-          <w:lang w:val="it-IT"/>
         </w:rPr>
       </w:pPr>
       <w:r>
@@ -230,7 +219,6 @@
           <w:b/>
           <w:sz w:val="44"/>
           <w:szCs w:val="44"/>
-          <w:lang w:val="it-IT"/>
         </w:rPr>
         <w:t>Tecnologie Software per il Web</w:t>
       </w:r>
@@ -242,7 +230,6 @@
           <w:rFonts w:asciiTheme="majorHAnsi" w:hAnsiTheme="majorHAnsi" w:cstheme="majorHAnsi"/>
           <w:sz w:val="48"/>
           <w:szCs w:val="48"/>
-          <w:lang w:val="it-IT"/>
         </w:rPr>
       </w:pPr>
       <w:r>
@@ -251,16 +238,25 @@
           <w:i/>
           <w:sz w:val="44"/>
           <w:szCs w:val="44"/>
-          <w:lang w:val="it-IT"/>
         </w:rPr>
-        <w:t>Project Proposal</w:t>
+        <w:t xml:space="preserve">Project </w:t>
       </w:r>
+      <w:proofErr w:type="spellStart"/>
+      <w:r>
+        <w:rPr>
+          <w:rFonts w:asciiTheme="majorHAnsi" w:hAnsiTheme="majorHAnsi" w:cstheme="majorHAnsi"/>
+          <w:i/>
+          <w:sz w:val="44"/>
+          <w:szCs w:val="44"/>
+        </w:rPr>
+        <w:t>Proposal</w:t>
+      </w:r>
+      <w:proofErr w:type="spellEnd"/>
       <w:r>
         <w:rPr>
           <w:rFonts w:asciiTheme="majorHAnsi" w:hAnsiTheme="majorHAnsi" w:cstheme="majorHAnsi"/>
           <w:sz w:val="24"/>
           <w:szCs w:val="24"/>
-          <w:lang w:val="it-IT"/>
         </w:rPr>
         <w:br/>
       </w:r>
@@ -272,7 +268,6 @@
           <w:rFonts w:asciiTheme="majorHAnsi" w:hAnsiTheme="majorHAnsi" w:cstheme="majorHAnsi"/>
           <w:sz w:val="52"/>
           <w:szCs w:val="52"/>
-          <w:lang w:val="it-IT"/>
         </w:rPr>
       </w:pPr>
       <w:r>
@@ -281,7 +276,6 @@
           <w:b/>
           <w:sz w:val="52"/>
           <w:szCs w:val="52"/>
-          <w:lang w:val="it-IT"/>
         </w:rPr>
         <w:t>“</w:t>
       </w:r>
@@ -291,7 +285,6 @@
           <w:b/>
           <w:sz w:val="52"/>
           <w:szCs w:val="52"/>
-          <w:lang w:val="it-IT"/>
         </w:rPr>
         <w:t>SÆNDWAVE</w:t>
       </w:r>
@@ -301,7 +294,6 @@
           <w:b/>
           <w:sz w:val="52"/>
           <w:szCs w:val="52"/>
-          <w:lang w:val="it-IT"/>
         </w:rPr>
         <w:t>”</w:t>
       </w:r>
@@ -312,7 +304,6 @@
           <w:rFonts w:asciiTheme="majorHAnsi" w:hAnsiTheme="majorHAnsi" w:cstheme="majorHAnsi"/>
           <w:sz w:val="24"/>
           <w:szCs w:val="24"/>
-          <w:lang w:val="it-IT"/>
         </w:rPr>
       </w:pPr>
     </w:p>
@@ -396,7 +387,6 @@
                 <w:bCs/>
                 <w:sz w:val="32"/>
                 <w:szCs w:val="32"/>
-                <w:lang w:val="it-IT"/>
               </w:rPr>
             </w:pPr>
             <w:r>
@@ -406,7 +396,6 @@
                 <w:bCs/>
                 <w:sz w:val="32"/>
                 <w:szCs w:val="32"/>
-                <w:lang w:val="it-IT"/>
               </w:rPr>
               <w:t>Studenti:</w:t>
             </w:r>
@@ -418,7 +407,6 @@
                 <w:rFonts w:asciiTheme="majorHAnsi" w:hAnsiTheme="majorHAnsi" w:cstheme="majorHAnsi"/>
                 <w:sz w:val="24"/>
                 <w:szCs w:val="24"/>
-                <w:lang w:val="it-IT"/>
               </w:rPr>
             </w:pPr>
             <w:r>
@@ -426,98 +414,43 @@
                 <w:rFonts w:asciiTheme="majorHAnsi" w:hAnsiTheme="majorHAnsi" w:cstheme="majorHAnsi"/>
                 <w:sz w:val="24"/>
                 <w:szCs w:val="24"/>
-                <w:lang w:val="it-IT"/>
               </w:rPr>
-              <w:t>Maria Ambrosio</w:t>
+              <w:t xml:space="preserve">Maria </w:t>
+            </w:r>
+            <w:proofErr w:type="gramStart"/>
+            <w:r>
+              <w:rPr>
+                <w:rFonts w:asciiTheme="majorHAnsi" w:hAnsiTheme="majorHAnsi" w:cstheme="majorHAnsi"/>
+                <w:sz w:val="24"/>
+                <w:szCs w:val="24"/>
+              </w:rPr>
+              <w:t>Ambrosio(</w:t>
+            </w:r>
+            <w:proofErr w:type="gramEnd"/>
+            <w:r>
+              <w:rPr>
+                <w:rFonts w:asciiTheme="majorHAnsi" w:hAnsiTheme="majorHAnsi" w:cstheme="majorHAnsi"/>
+                <w:sz w:val="24"/>
+                <w:szCs w:val="24"/>
+              </w:rPr>
+              <w:t>Mat.0512121304)</w:t>
             </w:r>
             <w:r>
               <w:rPr>
                 <w:rFonts w:asciiTheme="majorHAnsi" w:hAnsiTheme="majorHAnsi" w:cstheme="majorHAnsi"/>
                 <w:sz w:val="24"/>
                 <w:szCs w:val="24"/>
-                <w:lang w:val="it-IT"/>
               </w:rPr>
-              <w:t>(Mat.</w:t>
+              <w:br/>
+              <w:t>Mattia Della Sala (Mat.0512121322)</w:t>
             </w:r>
             <w:r>
               <w:rPr>
                 <w:rFonts w:asciiTheme="majorHAnsi" w:hAnsiTheme="majorHAnsi" w:cstheme="majorHAnsi"/>
                 <w:sz w:val="24"/>
                 <w:szCs w:val="24"/>
-                <w:lang w:val="it-IT"/>
-              </w:rPr>
-              <w:t>0512121304</w:t>
-            </w:r>
-            <w:r>
-              <w:rPr>
-                <w:rFonts w:asciiTheme="majorHAnsi" w:hAnsiTheme="majorHAnsi" w:cstheme="majorHAnsi"/>
-                <w:sz w:val="24"/>
-                <w:szCs w:val="24"/>
-                <w:lang w:val="it-IT"/>
-              </w:rPr>
-              <w:t>)</w:t>
-            </w:r>
-            <w:r>
-              <w:rPr>
-                <w:rFonts w:asciiTheme="majorHAnsi" w:hAnsiTheme="majorHAnsi" w:cstheme="majorHAnsi"/>
-                <w:sz w:val="24"/>
-                <w:szCs w:val="24"/>
-                <w:lang w:val="it-IT"/>
               </w:rPr>
               <w:br/>
-            </w:r>
-            <w:r>
-              <w:rPr>
-                <w:rFonts w:asciiTheme="majorHAnsi" w:hAnsiTheme="majorHAnsi" w:cstheme="majorHAnsi"/>
-                <w:sz w:val="24"/>
-                <w:szCs w:val="24"/>
-                <w:lang w:val="it-IT"/>
-              </w:rPr>
-              <w:t>Mattia Della Sala</w:t>
-            </w:r>
-            <w:r>
-              <w:rPr>
-                <w:rFonts w:asciiTheme="majorHAnsi" w:hAnsiTheme="majorHAnsi" w:cstheme="majorHAnsi"/>
-                <w:sz w:val="24"/>
-                <w:szCs w:val="24"/>
-                <w:lang w:val="it-IT"/>
-              </w:rPr>
-              <w:t xml:space="preserve"> (Mat.</w:t>
-            </w:r>
-            <w:r>
-              <w:rPr>
-                <w:rFonts w:asciiTheme="majorHAnsi" w:hAnsiTheme="majorHAnsi" w:cstheme="majorHAnsi"/>
-                <w:sz w:val="24"/>
-                <w:szCs w:val="24"/>
-                <w:lang w:val="it-IT"/>
-              </w:rPr>
-              <w:t>0512121322</w:t>
-            </w:r>
-            <w:r>
-              <w:rPr>
-                <w:rFonts w:asciiTheme="majorHAnsi" w:hAnsiTheme="majorHAnsi" w:cstheme="majorHAnsi"/>
-                <w:sz w:val="24"/>
-                <w:szCs w:val="24"/>
-                <w:lang w:val="it-IT"/>
-              </w:rPr>
-              <w:t>)</w:t>
-            </w:r>
-            <w:r>
-              <w:rPr>
-                <w:rFonts w:asciiTheme="majorHAnsi" w:hAnsiTheme="majorHAnsi" w:cstheme="majorHAnsi"/>
-                <w:sz w:val="24"/>
-                <w:szCs w:val="24"/>
-                <w:lang w:val="it-IT"/>
-              </w:rPr>
-              <w:br/>
-            </w:r>
-            <w:r>
-              <w:rPr>
-                <w:rFonts w:asciiTheme="majorHAnsi" w:hAnsiTheme="majorHAnsi" w:cstheme="majorHAnsi"/>
-                <w:sz w:val="24"/>
-                <w:szCs w:val="24"/>
-                <w:lang w:val="it-IT"/>
-              </w:rPr>
               <w:t>Giovanni Varricchio (Mat.0512122414)</w:t>
             </w:r>
           </w:p>
@@ -530,7 +463,6 @@
           <w:rFonts w:asciiTheme="majorHAnsi" w:hAnsiTheme="majorHAnsi" w:cstheme="majorHAnsi"/>
           <w:sz w:val="24"/>
           <w:szCs w:val="24"/>
-          <w:lang w:val="it-IT"/>
         </w:rPr>
       </w:pPr>
       <w:r>
@@ -538,7 +470,6 @@
           <w:rFonts w:asciiTheme="majorHAnsi" w:hAnsiTheme="majorHAnsi" w:cstheme="majorHAnsi"/>
           <w:sz w:val="24"/>
           <w:szCs w:val="24"/>
-          <w:lang w:val="it-IT"/>
         </w:rPr>
         <w:br/>
       </w:r>
@@ -567,7 +498,6 @@
           <w:rFonts w:asciiTheme="majorHAnsi" w:hAnsiTheme="majorHAnsi" w:cstheme="majorHAnsi"/>
           <w:sz w:val="24"/>
           <w:szCs w:val="24"/>
-          <w:lang w:val="it-IT"/>
         </w:rPr>
       </w:pPr>
       <w:r>
@@ -575,7 +505,6 @@
           <w:rFonts w:asciiTheme="majorHAnsi" w:hAnsiTheme="majorHAnsi" w:cstheme="majorHAnsi"/>
           <w:sz w:val="24"/>
           <w:szCs w:val="24"/>
-          <w:lang w:val="it-IT"/>
         </w:rPr>
         <w:br w:type="page"/>
       </w:r>
@@ -589,7 +518,6 @@
           <w:color w:val="auto"/>
           <w:sz w:val="36"/>
           <w:szCs w:val="36"/>
-          <w:lang w:val="it-IT"/>
         </w:rPr>
         <w:id w:val="-799222558"/>
         <w:docPartObj>
@@ -599,10 +527,8 @@
       </w:sdtPr>
       <w:sdtEndPr>
         <w:rPr>
-          <w:noProof/>
           <w:sz w:val="24"/>
           <w:szCs w:val="24"/>
-          <w:lang w:val="en-US"/>
         </w:rPr>
       </w:sdtEndPr>
       <w:sdtContent>
@@ -620,7 +546,6 @@
               <w:rFonts w:cstheme="majorHAnsi"/>
               <w:sz w:val="36"/>
               <w:szCs w:val="36"/>
-              <w:lang w:val="it-IT"/>
             </w:rPr>
             <w:t>Sommario</w:t>
           </w:r>
@@ -636,8 +561,7 @@
               <w:bCs w:val="0"/>
               <w:i w:val="0"/>
               <w:iCs w:val="0"/>
-              <w:noProof/>
-              <w:lang w:val="it-IT" w:eastAsia="it-IT"/>
+              <w:lang w:eastAsia="it-IT"/>
             </w:rPr>
           </w:pPr>
           <w:r>
@@ -667,55 +591,46 @@
               <w:rPr>
                 <w:rStyle w:val="Collegamentoipertestuale"/>
                 <w:rFonts w:cstheme="majorHAnsi"/>
-                <w:noProof/>
-                <w:lang w:val="it-IT"/>
               </w:rPr>
               <w:t>1. Identificazione del Progetto</w:t>
             </w:r>
             <w:r>
               <w:rPr>
-                <w:noProof/>
                 <w:webHidden/>
               </w:rPr>
               <w:tab/>
             </w:r>
             <w:r>
               <w:rPr>
-                <w:noProof/>
                 <w:webHidden/>
               </w:rPr>
               <w:fldChar w:fldCharType="begin"/>
             </w:r>
             <w:r>
               <w:rPr>
-                <w:noProof/>
                 <w:webHidden/>
               </w:rPr>
               <w:instrText xml:space="preserve"> PAGEREF _Toc223999114 \h </w:instrText>
             </w:r>
             <w:r>
               <w:rPr>
-                <w:noProof/>
                 <w:webHidden/>
               </w:rPr>
             </w:r>
             <w:r>
               <w:rPr>
-                <w:noProof/>
                 <w:webHidden/>
               </w:rPr>
               <w:fldChar w:fldCharType="separate"/>
             </w:r>
             <w:r>
               <w:rPr>
-                <w:noProof/>
                 <w:webHidden/>
               </w:rPr>
               <w:t>4</w:t>
             </w:r>
             <w:r>
               <w:rPr>
-                <w:noProof/>
                 <w:webHidden/>
               </w:rPr>
               <w:fldChar w:fldCharType="end"/>
@@ -733,8 +648,7 @@
               <w:bCs w:val="0"/>
               <w:i w:val="0"/>
               <w:iCs w:val="0"/>
-              <w:noProof/>
-              <w:lang w:val="it-IT" w:eastAsia="it-IT"/>
+              <w:lang w:eastAsia="it-IT"/>
             </w:rPr>
           </w:pPr>
           <w:hyperlink w:anchor="_Toc223999115" w:history="1">
@@ -742,55 +656,46 @@
               <w:rPr>
                 <w:rStyle w:val="Collegamentoipertestuale"/>
                 <w:rFonts w:cstheme="majorHAnsi"/>
-                <w:noProof/>
-                <w:lang w:val="it-IT"/>
               </w:rPr>
               <w:t>2. Obiettivo del progetto</w:t>
             </w:r>
             <w:r>
               <w:rPr>
-                <w:noProof/>
                 <w:webHidden/>
               </w:rPr>
               <w:tab/>
             </w:r>
             <w:r>
               <w:rPr>
-                <w:noProof/>
                 <w:webHidden/>
               </w:rPr>
               <w:fldChar w:fldCharType="begin"/>
             </w:r>
             <w:r>
               <w:rPr>
-                <w:noProof/>
                 <w:webHidden/>
               </w:rPr>
               <w:instrText xml:space="preserve"> PAGEREF _Toc223999115 \h </w:instrText>
             </w:r>
             <w:r>
               <w:rPr>
-                <w:noProof/>
                 <w:webHidden/>
               </w:rPr>
             </w:r>
             <w:r>
               <w:rPr>
-                <w:noProof/>
                 <w:webHidden/>
               </w:rPr>
               <w:fldChar w:fldCharType="separate"/>
             </w:r>
             <w:r>
               <w:rPr>
-                <w:noProof/>
                 <w:webHidden/>
               </w:rPr>
               <w:t>4</w:t>
             </w:r>
             <w:r>
               <w:rPr>
-                <w:noProof/>
                 <w:webHidden/>
               </w:rPr>
               <w:fldChar w:fldCharType="end"/>
@@ -808,8 +713,7 @@
               <w:bCs w:val="0"/>
               <w:i w:val="0"/>
               <w:iCs w:val="0"/>
-              <w:noProof/>
-              <w:lang w:val="it-IT" w:eastAsia="it-IT"/>
+              <w:lang w:eastAsia="it-IT"/>
             </w:rPr>
           </w:pPr>
           <w:hyperlink w:anchor="_Toc223999116" w:history="1">
@@ -817,55 +721,46 @@
               <w:rPr>
                 <w:rStyle w:val="Collegamentoipertestuale"/>
                 <w:rFonts w:cstheme="majorHAnsi"/>
-                <w:noProof/>
-                <w:lang w:val="it-IT"/>
               </w:rPr>
               <w:t>3. Analisi di siti esistenti</w:t>
             </w:r>
             <w:r>
               <w:rPr>
-                <w:noProof/>
                 <w:webHidden/>
               </w:rPr>
               <w:tab/>
             </w:r>
             <w:r>
               <w:rPr>
-                <w:noProof/>
                 <w:webHidden/>
               </w:rPr>
               <w:fldChar w:fldCharType="begin"/>
             </w:r>
             <w:r>
               <w:rPr>
-                <w:noProof/>
                 <w:webHidden/>
               </w:rPr>
               <w:instrText xml:space="preserve"> PAGEREF _Toc223999116 \h </w:instrText>
             </w:r>
             <w:r>
               <w:rPr>
-                <w:noProof/>
                 <w:webHidden/>
               </w:rPr>
             </w:r>
             <w:r>
               <w:rPr>
-                <w:noProof/>
                 <w:webHidden/>
               </w:rPr>
               <w:fldChar w:fldCharType="separate"/>
             </w:r>
             <w:r>
               <w:rPr>
-                <w:noProof/>
                 <w:webHidden/>
               </w:rPr>
               <w:t>4</w:t>
             </w:r>
             <w:r>
               <w:rPr>
-                <w:noProof/>
                 <w:webHidden/>
               </w:rPr>
               <w:fldChar w:fldCharType="end"/>
@@ -883,8 +778,7 @@
               <w:bCs w:val="0"/>
               <w:i w:val="0"/>
               <w:iCs w:val="0"/>
-              <w:noProof/>
-              <w:lang w:val="it-IT" w:eastAsia="it-IT"/>
+              <w:lang w:eastAsia="it-IT"/>
             </w:rPr>
           </w:pPr>
           <w:hyperlink w:anchor="_Toc223999117" w:history="1">
@@ -892,55 +786,46 @@
               <w:rPr>
                 <w:rStyle w:val="Collegamentoipertestuale"/>
                 <w:rFonts w:cstheme="majorHAnsi"/>
-                <w:noProof/>
-                <w:lang w:val="it-IT"/>
               </w:rPr>
               <w:t>4. Funzionalità del sito</w:t>
             </w:r>
             <w:r>
               <w:rPr>
-                <w:noProof/>
                 <w:webHidden/>
               </w:rPr>
               <w:tab/>
             </w:r>
             <w:r>
               <w:rPr>
-                <w:noProof/>
                 <w:webHidden/>
               </w:rPr>
               <w:fldChar w:fldCharType="begin"/>
             </w:r>
             <w:r>
               <w:rPr>
-                <w:noProof/>
                 <w:webHidden/>
               </w:rPr>
               <w:instrText xml:space="preserve"> PAGEREF _Toc223999117 \h </w:instrText>
             </w:r>
             <w:r>
               <w:rPr>
-                <w:noProof/>
                 <w:webHidden/>
               </w:rPr>
             </w:r>
             <w:r>
               <w:rPr>
-                <w:noProof/>
                 <w:webHidden/>
               </w:rPr>
               <w:fldChar w:fldCharType="separate"/>
             </w:r>
             <w:r>
               <w:rPr>
-                <w:noProof/>
                 <w:webHidden/>
               </w:rPr>
               <w:t>4</w:t>
             </w:r>
             <w:r>
               <w:rPr>
-                <w:noProof/>
                 <w:webHidden/>
               </w:rPr>
               <w:fldChar w:fldCharType="end"/>
@@ -960,7 +845,6 @@
               <w:rFonts w:asciiTheme="majorHAnsi" w:hAnsiTheme="majorHAnsi" w:cstheme="majorHAnsi"/>
               <w:b/>
               <w:bCs/>
-              <w:noProof/>
               <w:sz w:val="24"/>
               <w:szCs w:val="24"/>
             </w:rPr>
@@ -975,7 +859,6 @@
           <w:rFonts w:asciiTheme="majorHAnsi" w:hAnsiTheme="majorHAnsi" w:cstheme="majorHAnsi"/>
           <w:sz w:val="24"/>
           <w:szCs w:val="24"/>
-          <w:lang w:val="it-IT"/>
         </w:rPr>
       </w:pPr>
       <w:r>
@@ -983,7 +866,6 @@
           <w:rFonts w:asciiTheme="majorHAnsi" w:hAnsiTheme="majorHAnsi" w:cstheme="majorHAnsi"/>
           <w:sz w:val="24"/>
           <w:szCs w:val="24"/>
-          <w:lang w:val="it-IT"/>
         </w:rPr>
         <w:br w:type="page"/>
       </w:r>
@@ -993,14 +875,12 @@
         <w:pStyle w:val="Titolo1"/>
         <w:rPr>
           <w:rFonts w:cstheme="majorHAnsi"/>
-          <w:lang w:val="it-IT"/>
         </w:rPr>
       </w:pPr>
       <w:bookmarkStart w:id="0" w:name="_Toc223999114"/>
       <w:r>
         <w:rPr>
           <w:rFonts w:cstheme="majorHAnsi"/>
-          <w:lang w:val="it-IT"/>
         </w:rPr>
         <w:lastRenderedPageBreak/>
         <w:t xml:space="preserve">1. </w:t>
@@ -1008,7 +888,6 @@
       <w:r>
         <w:rPr>
           <w:rFonts w:cstheme="majorHAnsi"/>
-          <w:lang w:val="it-IT"/>
         </w:rPr>
         <w:t>Identificazione del Progetto</w:t>
       </w:r>
@@ -1016,7 +895,6 @@
       <w:r>
         <w:rPr>
           <w:rFonts w:cstheme="majorHAnsi"/>
-          <w:lang w:val="it-IT"/>
         </w:rPr>
         <w:t xml:space="preserve">  </w:t>
       </w:r>
@@ -1033,7 +911,6 @@
           <w:rFonts w:asciiTheme="majorHAnsi" w:hAnsiTheme="majorHAnsi" w:cstheme="majorHAnsi"/>
           <w:sz w:val="24"/>
           <w:szCs w:val="24"/>
-          <w:lang w:val="it-IT"/>
         </w:rPr>
       </w:pPr>
       <w:bookmarkStart w:id="1" w:name="_Toc223999115"/>
@@ -1042,19 +919,19 @@
           <w:rFonts w:asciiTheme="majorHAnsi" w:hAnsiTheme="majorHAnsi" w:cstheme="majorHAnsi"/>
           <w:sz w:val="24"/>
           <w:szCs w:val="24"/>
-          <w:lang w:val="it-IT"/>
         </w:rPr>
         <w:t xml:space="preserve">Titolo del progetto: </w:t>
       </w:r>
+      <w:proofErr w:type="spellStart"/>
       <w:r>
         <w:rPr>
           <w:rFonts w:asciiTheme="majorHAnsi" w:hAnsiTheme="majorHAnsi" w:cstheme="majorHAnsi"/>
           <w:sz w:val="24"/>
           <w:szCs w:val="24"/>
-          <w:lang w:val="it-IT"/>
         </w:rPr>
         <w:t>Sændwave</w:t>
       </w:r>
+      <w:proofErr w:type="spellEnd"/>
     </w:p>
     <w:p>
       <w:pPr>
@@ -1068,7 +945,6 @@
           <w:rFonts w:asciiTheme="majorHAnsi" w:hAnsiTheme="majorHAnsi" w:cstheme="majorHAnsi"/>
           <w:sz w:val="24"/>
           <w:szCs w:val="24"/>
-          <w:lang w:val="it-IT"/>
         </w:rPr>
       </w:pPr>
       <w:r>
@@ -1076,18 +952,8 @@
           <w:rFonts w:asciiTheme="majorHAnsi" w:hAnsiTheme="majorHAnsi" w:cstheme="majorHAnsi"/>
           <w:sz w:val="24"/>
           <w:szCs w:val="24"/>
-          <w:lang w:val="it-IT"/>
         </w:rPr>
-        <w:t xml:space="preserve">Nome del gruppo: </w:t>
-      </w:r>
-      <w:r>
-        <w:rPr>
-          <w:rFonts w:asciiTheme="majorHAnsi" w:hAnsiTheme="majorHAnsi" w:cstheme="majorHAnsi"/>
-          <w:sz w:val="24"/>
-          <w:szCs w:val="24"/>
-          <w:lang w:val="it-IT"/>
-        </w:rPr>
-        <w:t>Team Mag.ma</w:t>
+        <w:t>Nome del gruppo: Team Mag.ma</w:t>
       </w:r>
     </w:p>
     <w:p>
@@ -1102,7 +968,6 @@
           <w:rFonts w:asciiTheme="majorHAnsi" w:hAnsiTheme="majorHAnsi" w:cstheme="majorHAnsi"/>
           <w:sz w:val="24"/>
           <w:szCs w:val="24"/>
-          <w:lang w:val="it-IT"/>
         </w:rPr>
       </w:pPr>
       <w:r>
@@ -1110,7 +975,6 @@
           <w:rFonts w:asciiTheme="majorHAnsi" w:hAnsiTheme="majorHAnsi" w:cstheme="majorHAnsi"/>
           <w:sz w:val="24"/>
           <w:szCs w:val="24"/>
-          <w:lang w:val="it-IT"/>
         </w:rPr>
         <w:t xml:space="preserve">Componenti del gruppo: </w:t>
       </w:r>
@@ -1127,7 +991,6 @@
           <w:rFonts w:asciiTheme="majorHAnsi" w:hAnsiTheme="majorHAnsi" w:cstheme="majorHAnsi"/>
           <w:sz w:val="24"/>
           <w:szCs w:val="24"/>
-          <w:lang w:val="it-IT"/>
         </w:rPr>
       </w:pPr>
       <w:r>
@@ -1135,7 +998,6 @@
           <w:rFonts w:asciiTheme="majorHAnsi" w:hAnsiTheme="majorHAnsi" w:cstheme="majorHAnsi"/>
           <w:sz w:val="24"/>
           <w:szCs w:val="24"/>
-          <w:lang w:val="it-IT"/>
         </w:rPr>
         <w:t>Maria Ambrosio 0512121304</w:t>
       </w:r>
@@ -1152,7 +1014,6 @@
           <w:rFonts w:asciiTheme="majorHAnsi" w:hAnsiTheme="majorHAnsi" w:cstheme="majorHAnsi"/>
           <w:sz w:val="24"/>
           <w:szCs w:val="24"/>
-          <w:lang w:val="it-IT"/>
         </w:rPr>
       </w:pPr>
       <w:r>
@@ -1160,7 +1021,6 @@
           <w:rFonts w:asciiTheme="majorHAnsi" w:hAnsiTheme="majorHAnsi" w:cstheme="majorHAnsi"/>
           <w:sz w:val="24"/>
           <w:szCs w:val="24"/>
-          <w:lang w:val="it-IT"/>
         </w:rPr>
         <w:t>Mattia Della Sala 0512121322</w:t>
       </w:r>
@@ -1177,7 +1037,6 @@
           <w:rFonts w:asciiTheme="majorHAnsi" w:hAnsiTheme="majorHAnsi" w:cstheme="majorHAnsi"/>
           <w:sz w:val="24"/>
           <w:szCs w:val="24"/>
-          <w:lang w:val="it-IT"/>
         </w:rPr>
       </w:pPr>
       <w:r>
@@ -1185,7 +1044,6 @@
           <w:rFonts w:asciiTheme="majorHAnsi" w:hAnsiTheme="majorHAnsi" w:cstheme="majorHAnsi"/>
           <w:sz w:val="24"/>
           <w:szCs w:val="24"/>
-          <w:lang w:val="it-IT"/>
         </w:rPr>
         <w:t>Giovanni Varricchio 0512122414</w:t>
       </w:r>
@@ -1195,13 +1053,11 @@
         <w:pStyle w:val="Titolo1"/>
         <w:rPr>
           <w:rFonts w:cstheme="majorHAnsi"/>
-          <w:lang w:val="it-IT"/>
         </w:rPr>
       </w:pPr>
       <w:r>
         <w:rPr>
           <w:rFonts w:cstheme="majorHAnsi"/>
-          <w:lang w:val="it-IT"/>
         </w:rPr>
         <w:t>2. Obiettivo del progetto</w:t>
       </w:r>
@@ -1215,18 +1071,27 @@
           <w:iCs/>
           <w:sz w:val="24"/>
           <w:szCs w:val="24"/>
-          <w:lang w:val="it-IT"/>
         </w:rPr>
       </w:pPr>
+      <w:proofErr w:type="spellStart"/>
       <w:r>
         <w:rPr>
           <w:rFonts w:asciiTheme="majorHAnsi" w:hAnsiTheme="majorHAnsi" w:cstheme="majorHAnsi"/>
           <w:iCs/>
           <w:sz w:val="24"/>
           <w:szCs w:val="24"/>
-          <w:lang w:val="it-IT"/>
         </w:rPr>
-        <w:t xml:space="preserve">Sændwave </w:t>
+        <w:t>Sændwave</w:t>
+      </w:r>
+      <w:proofErr w:type="spellEnd"/>
+      <w:r>
+        <w:rPr>
+          <w:rFonts w:asciiTheme="majorHAnsi" w:hAnsiTheme="majorHAnsi" w:cstheme="majorHAnsi"/>
+          <w:iCs/>
+          <w:sz w:val="24"/>
+          <w:szCs w:val="24"/>
+        </w:rPr>
+        <w:t xml:space="preserve"> </w:t>
       </w:r>
       <w:r>
         <w:rPr>
@@ -1234,7 +1099,6 @@
           <w:iCs/>
           <w:sz w:val="24"/>
           <w:szCs w:val="24"/>
-          <w:lang w:val="it-IT"/>
         </w:rPr>
         <w:t>mira ad agevol</w:t>
       </w:r>
@@ -1244,7 +1108,6 @@
           <w:iCs/>
           <w:sz w:val="24"/>
           <w:szCs w:val="24"/>
-          <w:lang w:val="it-IT"/>
         </w:rPr>
         <w:t>a</w:t>
       </w:r>
@@ -1254,7 +1117,6 @@
           <w:iCs/>
           <w:sz w:val="24"/>
           <w:szCs w:val="24"/>
-          <w:lang w:val="it-IT"/>
         </w:rPr>
         <w:t>re i musicisti non professionisti nella realizzazione del proprio brano, rendendo accessibile la produzione audio attraverso l'abbattimento dei costi standard e superando la necessità di una formazione tecnica specifica.</w:t>
       </w:r>
@@ -1266,7 +1128,6 @@
           <w:rFonts w:asciiTheme="majorHAnsi" w:hAnsiTheme="majorHAnsi" w:cstheme="majorHAnsi"/>
           <w:sz w:val="24"/>
           <w:szCs w:val="24"/>
-          <w:lang w:val="it-IT"/>
         </w:rPr>
       </w:pPr>
       <w:r>
@@ -1275,7 +1136,6 @@
           <w:iCs/>
           <w:sz w:val="24"/>
           <w:szCs w:val="24"/>
-          <w:lang w:val="it-IT"/>
         </w:rPr>
         <w:t>La</w:t>
       </w:r>
@@ -1285,7 +1145,6 @@
           <w:iCs/>
           <w:sz w:val="24"/>
           <w:szCs w:val="24"/>
-          <w:lang w:val="it-IT"/>
         </w:rPr>
         <w:t xml:space="preserve"> piattaforma permette all’utente di selezionare determinati effetti (VST/Plugin), caricare una propria traccia audio e richiederne la modifica con gli effetti desiderati da parte di figure professionali specializzate, ricevendo la traccia modificata. </w:t>
       </w:r>
@@ -1295,14 +1154,12 @@
         <w:pStyle w:val="Titolo1"/>
         <w:rPr>
           <w:rFonts w:cstheme="majorHAnsi"/>
-          <w:lang w:val="it-IT"/>
         </w:rPr>
       </w:pPr>
       <w:bookmarkStart w:id="2" w:name="_Toc223999116"/>
       <w:r>
         <w:rPr>
           <w:rFonts w:cstheme="majorHAnsi"/>
-          <w:lang w:val="it-IT"/>
         </w:rPr>
         <w:t>3. Analisi di siti esistenti</w:t>
       </w:r>
@@ -1318,26 +1175,25 @@
         <w:rPr>
           <w:sz w:val="26"/>
           <w:szCs w:val="26"/>
-          <w:lang w:val="en-GB"/>
         </w:rPr>
       </w:pPr>
+      <w:proofErr w:type="spellStart"/>
       <w:r>
         <w:rPr>
           <w:b/>
           <w:bCs/>
           <w:sz w:val="26"/>
           <w:szCs w:val="26"/>
-          <w:lang w:val="en-GB"/>
         </w:rPr>
         <w:t>SoundBetter</w:t>
       </w:r>
+      <w:proofErr w:type="spellEnd"/>
       <w:r>
         <w:rPr>
           <w:b/>
           <w:bCs/>
           <w:sz w:val="26"/>
           <w:szCs w:val="26"/>
-          <w:lang w:val="en-GB"/>
         </w:rPr>
         <w:t xml:space="preserve"> (</w:t>
       </w:r>
@@ -1350,8 +1206,64 @@
             <w:sz w:val="26"/>
             <w:szCs w:val="26"/>
           </w:rPr>
-          <w:t>Hire Mixing &amp; Mastering Engineers, Producers, Singers &amp; Songwriters | SoundBetter</w:t>
+          <w:t xml:space="preserve">Hire Mixing &amp; Mastering </w:t>
         </w:r>
+        <w:proofErr w:type="spellStart"/>
+        <w:r>
+          <w:rPr>
+            <w:rStyle w:val="Collegamentoipertestuale"/>
+            <w:b/>
+            <w:bCs/>
+            <w:sz w:val="26"/>
+            <w:szCs w:val="26"/>
+          </w:rPr>
+          <w:t>Engineers</w:t>
+        </w:r>
+        <w:proofErr w:type="spellEnd"/>
+        <w:r>
+          <w:rPr>
+            <w:rStyle w:val="Collegamentoipertestuale"/>
+            <w:b/>
+            <w:bCs/>
+            <w:sz w:val="26"/>
+            <w:szCs w:val="26"/>
+          </w:rPr>
+          <w:t xml:space="preserve">, Producers, </w:t>
+        </w:r>
+        <w:proofErr w:type="spellStart"/>
+        <w:r>
+          <w:rPr>
+            <w:rStyle w:val="Collegamentoipertestuale"/>
+            <w:b/>
+            <w:bCs/>
+            <w:sz w:val="26"/>
+            <w:szCs w:val="26"/>
+          </w:rPr>
+          <w:t>Singers</w:t>
+        </w:r>
+        <w:proofErr w:type="spellEnd"/>
+        <w:r>
+          <w:rPr>
+            <w:rStyle w:val="Collegamentoipertestuale"/>
+            <w:b/>
+            <w:bCs/>
+            <w:sz w:val="26"/>
+            <w:szCs w:val="26"/>
+          </w:rPr>
+          <w:t xml:space="preserve"> &amp; Songwriters | </w:t>
+        </w:r>
+        <w:proofErr w:type="spellStart"/>
+        <w:r>
+          <w:rPr>
+            <w:rStyle w:val="Collegamentoipertestuale"/>
+            <w:b/>
+            <w:bCs/>
+            <w:sz w:val="26"/>
+            <w:szCs w:val="26"/>
+          </w:rPr>
+          <w:t>SoundBetter</w:t>
+        </w:r>
+        <w:proofErr w:type="spellEnd"/>
       </w:hyperlink>
       <w:r>
         <w:rPr>
@@ -1359,7 +1271,6 @@
           <w:bCs/>
           <w:sz w:val="26"/>
           <w:szCs w:val="26"/>
-          <w:lang w:val="en-GB"/>
         </w:rPr>
         <w:t>)</w:t>
       </w:r>
@@ -1372,71 +1283,40 @@
           <w:bCs/>
           <w:sz w:val="26"/>
           <w:szCs w:val="26"/>
-          <w:lang w:val="en-GB"/>
         </w:rPr>
       </w:pPr>
     </w:p>
     <w:p>
       <w:pPr>
         <w:pStyle w:val="Paragrafoelenco"/>
-        <w:rPr>
-          <w:lang w:val="it-IT"/>
-        </w:rPr>
-      </w:pPr>
+      </w:pPr>
+      <w:proofErr w:type="spellStart"/>
       <w:r>
-        <w:rPr>
-          <w:lang w:val="it-IT"/>
-        </w:rPr>
-        <w:t>SoundBetter è un sito inglese che permette di contattare e assumere figure professionali, le quali si appoggiano al sito usandolo come vetrina per i loro lavori. Il sito presenta</w:t>
+        <w:t>SoundBetter</w:t>
+      </w:r>
+      <w:proofErr w:type="spellEnd"/>
+      <w:r>
+        <w:t xml:space="preserve"> è un sito inglese che permette di contattare e assumere figure professionali, le quali si appoggiano al sito usandolo come vetrina per i loro lavori. Il sito presenta un banner centrale che permette velocemente di cercare un professionista, creare un proprio progetto senza appoggiarsi ad un professionista specifico e collegamento ad un video introduttivo che presenta </w:t>
       </w:r>
       <w:r>
-        <w:rPr>
-          <w:lang w:val="it-IT"/>
-        </w:rPr>
-        <w:t xml:space="preserve"> un banner centrale che permette velocemente di cercare un professionista, creare un proprio progetto senza appoggiarsi ad un professionista specifico e collegamento ad un video introduttivo che presenta </w:t>
-      </w:r>
-      <w:r>
-        <w:rPr>
-          <w:lang w:val="it-IT"/>
-        </w:rPr>
         <w:t>alcuni</w:t>
       </w:r>
       <w:r>
-        <w:rPr>
-          <w:lang w:val="it-IT"/>
-        </w:rPr>
         <w:t xml:space="preserve"> dei professionisti e il funzionamento del sito. In alto troviamo</w:t>
       </w:r>
       <w:r>
-        <w:rPr>
-          <w:lang w:val="it-IT"/>
-        </w:rPr>
         <w:t xml:space="preserve"> una sezione dedicata al login/registrazione dell’utente e i collegamenti alle aree dei professionisti che collaborano con il </w:t>
       </w:r>
       <w:r>
-        <w:rPr>
-          <w:lang w:val="it-IT"/>
-        </w:rPr>
         <w:t xml:space="preserve">sito, le </w:t>
       </w:r>
       <w:r>
-        <w:rPr>
-          <w:lang w:val="it-IT"/>
-        </w:rPr>
         <w:t>recensioni degli utenti, le ultime richieste di lavori e i plugin utilizzati e sponsorizzati dal sito.</w:t>
       </w:r>
       <w:r>
-        <w:rPr>
-          <w:noProof/>
-          <w:lang w:val="it-IT"/>
-        </w:rPr>
         <w:t xml:space="preserve"> </w:t>
       </w:r>
       <w:r>
-        <w:rPr>
-          <w:noProof/>
-          <w:lang w:val="it-IT"/>
-        </w:rPr>
         <w:t>L’utente registrato può vedere tutti i suoi lavori.</w:t>
       </w:r>
     </w:p>
@@ -1446,16 +1326,11 @@
         <w:rPr>
           <w:sz w:val="26"/>
           <w:szCs w:val="26"/>
-          <w:lang w:val="it-IT"/>
         </w:rPr>
       </w:pPr>
       <w:r>
-        <w:rPr>
-          <w:noProof/>
-          <w:lang w:val="it-IT"/>
-        </w:rPr>
         <w:drawing>
-          <wp:anchor distT="0" distB="0" distL="114300" distR="114300" simplePos="0" relativeHeight="251651072" behindDoc="0" locked="0" layoutInCell="1" allowOverlap="1" wp14:anchorId="6E62FBC3" wp14:editId="4A61533C">
+          <wp:anchor distT="0" distB="0" distL="114300" distR="114300" simplePos="0" relativeHeight="251631616" behindDoc="0" locked="0" layoutInCell="1" allowOverlap="1" wp14:anchorId="6E62FBC3" wp14:editId="4A61533C">
             <wp:simplePos x="0" y="0"/>
             <wp:positionH relativeFrom="column">
               <wp:posOffset>581025</wp:posOffset>
@@ -1518,7 +1393,6 @@
         <w:rPr>
           <w:sz w:val="26"/>
           <w:szCs w:val="26"/>
-          <w:lang w:val="it-IT"/>
         </w:rPr>
       </w:pPr>
     </w:p>
@@ -1528,7 +1402,6 @@
         <w:rPr>
           <w:sz w:val="26"/>
           <w:szCs w:val="26"/>
-          <w:lang w:val="it-IT"/>
         </w:rPr>
       </w:pPr>
     </w:p>
@@ -1538,7 +1411,6 @@
         <w:rPr>
           <w:sz w:val="26"/>
           <w:szCs w:val="26"/>
-          <w:lang w:val="it-IT"/>
         </w:rPr>
       </w:pPr>
     </w:p>
@@ -1548,7 +1420,6 @@
         <w:rPr>
           <w:sz w:val="26"/>
           <w:szCs w:val="26"/>
-          <w:lang w:val="it-IT"/>
         </w:rPr>
       </w:pPr>
     </w:p>
@@ -1558,7 +1429,6 @@
         <w:rPr>
           <w:sz w:val="26"/>
           <w:szCs w:val="26"/>
-          <w:lang w:val="it-IT"/>
         </w:rPr>
       </w:pPr>
     </w:p>
@@ -1568,7 +1438,6 @@
         <w:rPr>
           <w:sz w:val="26"/>
           <w:szCs w:val="26"/>
-          <w:lang w:val="it-IT"/>
         </w:rPr>
       </w:pPr>
     </w:p>
@@ -1578,19 +1447,16 @@
         <w:rPr>
           <w:sz w:val="26"/>
           <w:szCs w:val="26"/>
-          <w:lang w:val="it-IT"/>
         </w:rPr>
       </w:pPr>
       <w:r>
         <w:rPr>
-          <w:noProof/>
           <w:sz w:val="26"/>
           <w:szCs w:val="26"/>
-          <w:lang w:val="it-IT"/>
         </w:rPr>
         <w:lastRenderedPageBreak/>
         <w:drawing>
-          <wp:anchor distT="0" distB="0" distL="114300" distR="114300" simplePos="0" relativeHeight="251664384" behindDoc="1" locked="0" layoutInCell="1" allowOverlap="1" wp14:anchorId="5BAF9F05" wp14:editId="571E96EC">
+          <wp:anchor distT="0" distB="0" distL="114300" distR="114300" simplePos="0" relativeHeight="251658240" behindDoc="1" locked="0" layoutInCell="1" allowOverlap="1" wp14:anchorId="5BAF9F05" wp14:editId="571E96EC">
             <wp:simplePos x="0" y="0"/>
             <wp:positionH relativeFrom="column">
               <wp:posOffset>4219575</wp:posOffset>
@@ -1648,13 +1514,11 @@
       </w:r>
       <w:r>
         <w:rPr>
-          <w:noProof/>
           <w:sz w:val="26"/>
           <w:szCs w:val="26"/>
-          <w:lang w:val="it-IT"/>
         </w:rPr>
         <w:drawing>
-          <wp:anchor distT="0" distB="0" distL="114300" distR="114300" simplePos="0" relativeHeight="251654144" behindDoc="1" locked="0" layoutInCell="1" allowOverlap="1" wp14:anchorId="7D625442" wp14:editId="74F1CDE6">
+          <wp:anchor distT="0" distB="0" distL="114300" distR="114300" simplePos="0" relativeHeight="251640832" behindDoc="1" locked="0" layoutInCell="1" allowOverlap="1" wp14:anchorId="7D625442" wp14:editId="74F1CDE6">
             <wp:simplePos x="0" y="0"/>
             <wp:positionH relativeFrom="column">
               <wp:posOffset>-304800</wp:posOffset>
@@ -1723,7 +1587,6 @@
         <w:rPr>
           <w:sz w:val="26"/>
           <w:szCs w:val="26"/>
-          <w:lang w:val="it-IT"/>
         </w:rPr>
       </w:pPr>
     </w:p>
@@ -1733,7 +1596,6 @@
         <w:rPr>
           <w:sz w:val="26"/>
           <w:szCs w:val="26"/>
-          <w:lang w:val="it-IT"/>
         </w:rPr>
       </w:pPr>
     </w:p>
@@ -1743,7 +1605,6 @@
         <w:rPr>
           <w:sz w:val="26"/>
           <w:szCs w:val="26"/>
-          <w:lang w:val="it-IT"/>
         </w:rPr>
       </w:pPr>
     </w:p>
@@ -1753,7 +1614,6 @@
         <w:rPr>
           <w:sz w:val="26"/>
           <w:szCs w:val="26"/>
-          <w:lang w:val="it-IT"/>
         </w:rPr>
       </w:pPr>
     </w:p>
@@ -1763,18 +1623,15 @@
         <w:rPr>
           <w:sz w:val="26"/>
           <w:szCs w:val="26"/>
-          <w:lang w:val="it-IT"/>
         </w:rPr>
       </w:pPr>
       <w:r>
         <w:rPr>
-          <w:noProof/>
           <w:sz w:val="26"/>
           <w:szCs w:val="26"/>
-          <w:lang w:val="it-IT"/>
         </w:rPr>
         <w:drawing>
-          <wp:anchor distT="0" distB="0" distL="114300" distR="114300" simplePos="0" relativeHeight="251662336" behindDoc="1" locked="0" layoutInCell="1" allowOverlap="1" wp14:anchorId="30014436" wp14:editId="262B624D">
+          <wp:anchor distT="0" distB="0" distL="114300" distR="114300" simplePos="0" relativeHeight="251657216" behindDoc="1" locked="0" layoutInCell="1" allowOverlap="1" wp14:anchorId="30014436" wp14:editId="262B624D">
             <wp:simplePos x="0" y="0"/>
             <wp:positionH relativeFrom="column">
               <wp:posOffset>3362325</wp:posOffset>
@@ -1843,7 +1700,6 @@
         <w:rPr>
           <w:sz w:val="26"/>
           <w:szCs w:val="26"/>
-          <w:lang w:val="it-IT"/>
         </w:rPr>
       </w:pPr>
     </w:p>
@@ -1853,7 +1709,6 @@
         <w:rPr>
           <w:sz w:val="26"/>
           <w:szCs w:val="26"/>
-          <w:lang w:val="it-IT"/>
         </w:rPr>
       </w:pPr>
     </w:p>
@@ -1863,123 +1718,68 @@
         <w:rPr>
           <w:sz w:val="26"/>
           <w:szCs w:val="26"/>
-          <w:lang w:val="it-IT"/>
         </w:rPr>
       </w:pPr>
     </w:p>
     <w:p>
       <w:pPr>
         <w:pStyle w:val="Paragrafoelenco"/>
-        <w:rPr>
-          <w:lang w:val="it-IT"/>
-        </w:rPr>
       </w:pPr>
       <w:r>
-        <w:rPr>
-          <w:lang w:val="it-IT"/>
-        </w:rPr>
         <w:t xml:space="preserve">Nella pagina di presentazione del professionista </w:t>
       </w:r>
     </w:p>
     <w:p>
       <w:pPr>
         <w:pStyle w:val="Paragrafoelenco"/>
-        <w:rPr>
-          <w:lang w:val="it-IT"/>
-        </w:rPr>
       </w:pPr>
       <w:r>
-        <w:rPr>
-          <w:lang w:val="it-IT"/>
-        </w:rPr>
         <w:t>selezionato vi sono alcune</w:t>
       </w:r>
       <w:r>
-        <w:rPr>
-          <w:lang w:val="it-IT"/>
-        </w:rPr>
         <w:t xml:space="preserve"> </w:t>
       </w:r>
       <w:r>
-        <w:rPr>
-          <w:lang w:val="it-IT"/>
-        </w:rPr>
         <w:t xml:space="preserve">tracce d’esempio dei </w:t>
       </w:r>
     </w:p>
     <w:p>
       <w:pPr>
         <w:pStyle w:val="Paragrafoelenco"/>
-        <w:rPr>
-          <w:lang w:val="it-IT"/>
-        </w:rPr>
       </w:pPr>
       <w:r>
-        <w:rPr>
-          <w:lang w:val="it-IT"/>
-        </w:rPr>
         <w:t>suoi lavori e un tasto</w:t>
       </w:r>
       <w:r>
-        <w:rPr>
-          <w:lang w:val="it-IT"/>
-        </w:rPr>
         <w:t xml:space="preserve"> </w:t>
       </w:r>
       <w:r>
-        <w:rPr>
-          <w:lang w:val="it-IT"/>
-        </w:rPr>
         <w:t xml:space="preserve">che permette di mandare </w:t>
       </w:r>
     </w:p>
     <w:p>
       <w:pPr>
         <w:pStyle w:val="Paragrafoelenco"/>
-        <w:rPr>
-          <w:lang w:val="it-IT"/>
-        </w:rPr>
       </w:pPr>
       <w:r>
-        <w:rPr>
-          <w:lang w:val="it-IT"/>
-        </w:rPr>
         <w:t>la propria traccia</w:t>
       </w:r>
       <w:r>
-        <w:rPr>
-          <w:lang w:val="it-IT"/>
-        </w:rPr>
         <w:t xml:space="preserve"> </w:t>
       </w:r>
       <w:r>
-        <w:rPr>
-          <w:lang w:val="it-IT"/>
-        </w:rPr>
         <w:t xml:space="preserve">per richiederne il lavoro da fare </w:t>
       </w:r>
     </w:p>
     <w:p>
       <w:pPr>
         <w:pStyle w:val="Paragrafoelenco"/>
-        <w:rPr>
-          <w:lang w:val="it-IT"/>
-        </w:rPr>
       </w:pPr>
       <w:r>
-        <w:rPr>
-          <w:lang w:val="it-IT"/>
-        </w:rPr>
         <w:t>tramite descrizione testuale e questionario.</w:t>
       </w:r>
     </w:p>
-    <w:p>
-      <w:pPr>
-        <w:rPr>
-          <w:lang w:val="it-IT"/>
-        </w:rPr>
-      </w:pPr>
-    </w:p>
+    <w:p/>
     <w:p>
       <w:pPr>
         <w:pStyle w:val="Paragrafoelenco"/>
@@ -1990,39 +1790,68 @@
         <w:rPr>
           <w:sz w:val="26"/>
           <w:szCs w:val="26"/>
-          <w:lang w:val="it-IT"/>
         </w:rPr>
       </w:pPr>
+      <w:proofErr w:type="spellStart"/>
       <w:r>
         <w:rPr>
           <w:b/>
           <w:bCs/>
           <w:sz w:val="26"/>
           <w:szCs w:val="26"/>
-          <w:lang w:val="it-IT"/>
         </w:rPr>
-        <w:t>Fiverr (</w:t>
+        <w:t>Fiverr</w:t>
       </w:r>
-      <w:hyperlink r:id="rId12" w:history="1">
-        <w:r>
-          <w:rPr>
-            <w:rStyle w:val="Collegamentoipertestuale"/>
-            <w:b/>
-            <w:bCs/>
-            <w:sz w:val="26"/>
-            <w:szCs w:val="26"/>
-            <w:lang w:val="it-IT"/>
-          </w:rPr>
-          <w:t>Fiverr | Marketplace di servizi freelance | Trova i migliori talenti globali</w:t>
-        </w:r>
-      </w:hyperlink>
+      <w:proofErr w:type="spellEnd"/>
       <w:r>
         <w:rPr>
           <w:b/>
           <w:bCs/>
           <w:sz w:val="26"/>
           <w:szCs w:val="26"/>
-          <w:lang w:val="it-IT"/>
+        </w:rPr>
+        <w:t xml:space="preserve"> (</w:t>
+      </w:r>
+      <w:proofErr w:type="spellStart"/>
+      <w:r>
+        <w:fldChar w:fldCharType="begin"/>
+      </w:r>
+      <w:r>
+        <w:instrText>HYPERLINK "https://it.fiverr.com/"</w:instrText>
+      </w:r>
+      <w:r>
+        <w:fldChar w:fldCharType="separate"/>
+      </w:r>
+      <w:r>
+        <w:rPr>
+          <w:rStyle w:val="Collegamentoipertestuale"/>
+          <w:b/>
+          <w:bCs/>
+          <w:sz w:val="26"/>
+          <w:szCs w:val="26"/>
+        </w:rPr>
+        <w:t>Fiverr</w:t>
+      </w:r>
+      <w:proofErr w:type="spellEnd"/>
+      <w:r>
+        <w:rPr>
+          <w:rStyle w:val="Collegamentoipertestuale"/>
+          <w:b/>
+          <w:bCs/>
+          <w:sz w:val="26"/>
+          <w:szCs w:val="26"/>
+        </w:rPr>
+        <w:t xml:space="preserve"> | Marketplace di servizi freelance | Trova i migliori talenti globali</w:t>
+      </w:r>
+      <w:r>
+        <w:fldChar w:fldCharType="end"/>
+      </w:r>
+      <w:r>
+        <w:rPr>
+          <w:b/>
+          <w:bCs/>
+          <w:sz w:val="26"/>
+          <w:szCs w:val="26"/>
         </w:rPr>
         <w:t>)</w:t>
       </w:r>
@@ -2030,46 +1859,35 @@
     <w:p>
       <w:pPr>
         <w:pStyle w:val="Paragrafoelenco"/>
-        <w:rPr>
-          <w:lang w:val="it-IT"/>
-        </w:rPr>
-      </w:pPr>
+      </w:pPr>
+      <w:proofErr w:type="spellStart"/>
       <w:r>
-        <w:rPr>
-          <w:lang w:val="it-IT"/>
-        </w:rPr>
-        <w:t xml:space="preserve">Fiver è un sito internazionale che offre servizi di freelance in diversi ambiti. </w:t>
+        <w:t>Fiver</w:t>
+      </w:r>
+      <w:proofErr w:type="spellEnd"/>
+      <w:r>
+        <w:t xml:space="preserve"> è un sito internazionale che offre servizi di freelance in diversi ambiti. </w:t>
       </w:r>
     </w:p>
     <w:p>
       <w:pPr>
         <w:pStyle w:val="Paragrafoelenco"/>
-        <w:rPr>
-          <w:lang w:val="it-IT"/>
-        </w:rPr>
       </w:pPr>
       <w:r>
-        <w:rPr>
-          <w:lang w:val="it-IT"/>
-        </w:rPr>
-        <w:t>Ciò che richiama l’attenzione è il banner centrale che promuove le categorie popolari o in evidenza. Sulla parte superiore troviamo una barra di ricerca e le categorie, affiancati dalle sezioni per l’accesso</w:t>
+        <w:t xml:space="preserve">Ciò che richiama l’attenzione è il banner centrale che promuove le categorie popolari o in evidenza. Sulla parte superiore troviamo una barra di ricerca e le categorie, affiancati dalle sezioni per l’accesso. Sotto il testo di benvenuto ci sono due opzioni: una permette di generare un brief con l’AI, l’altra di scaricare l’app di </w:t>
+      </w:r>
+      <w:proofErr w:type="spellStart"/>
+      <w:r>
+        <w:t>Fiver</w:t>
+      </w:r>
+      <w:proofErr w:type="spellEnd"/>
+      <w:r>
+        <w:t>.</w:t>
       </w:r>
       <w:r>
-        <w:rPr>
-          <w:lang w:val="it-IT"/>
-        </w:rPr>
-        <w:t>. Sotto il testo di benvenuto ci sono due opzioni: una permette di generare un brief con l’AI, l’altra di scaricare l’app di Fiver.</w:t>
-      </w:r>
-      <w:r>
-        <w:rPr>
-          <w:lang w:val="it-IT"/>
-        </w:rPr>
         <w:t xml:space="preserve"> Dopo si possono esplorare i consigliati in cui vengono mostrati i video delle persone che offrono i loro servizi</w:t>
       </w:r>
       <w:r>
-        <w:rPr>
-          <w:lang w:val="it-IT"/>
-        </w:rPr>
         <w:t>.</w:t>
       </w:r>
     </w:p>
@@ -2079,13 +1897,9 @@
         <w:rPr>
           <w:sz w:val="26"/>
           <w:szCs w:val="26"/>
-          <w:lang w:val="it-IT"/>
         </w:rPr>
       </w:pPr>
       <w:r>
-        <w:rPr>
-          <w:noProof/>
-        </w:rPr>
         <w:drawing>
           <wp:inline distT="0" distB="0" distL="0" distR="0" wp14:anchorId="69AFF9C5" wp14:editId="0D306AA8">
             <wp:extent cx="4724400" cy="2194331"/>
@@ -2104,7 +1918,7 @@
                     </pic:cNvPicPr>
                   </pic:nvPicPr>
                   <pic:blipFill>
-                    <a:blip r:embed="rId13">
+                    <a:blip r:embed="rId12">
                       <a:extLst>
                         <a:ext uri="{28A0092B-C50C-407E-A947-70E740481C1C}">
                           <a14:useLocalDpi xmlns:a14="http://schemas.microsoft.com/office/drawing/2010/main" val="0"/>
@@ -2139,42 +1953,18 @@
     <w:p>
       <w:pPr>
         <w:pStyle w:val="Paragrafoelenco"/>
-        <w:rPr>
-          <w:lang w:val="it-IT"/>
-        </w:rPr>
       </w:pPr>
       <w:r>
-        <w:rPr>
-          <w:lang w:val="it-IT"/>
-        </w:rPr>
-        <w:t>Sceglien</w:t>
+        <w:t>Scegliendo la sezione musica tra le varie categorie</w:t>
       </w:r>
       <w:r>
-        <w:rPr>
-          <w:lang w:val="it-IT"/>
-        </w:rPr>
-        <w:t>do la sezione musica tra le varie categorie</w:t>
-      </w:r>
-      <w:r>
-        <w:rPr>
-          <w:lang w:val="it-IT"/>
-        </w:rPr>
         <w:t xml:space="preserve"> si apre una nuova scheda. In questa pagina vediamo in evidenza il titolo della categoria con una breve descrizione e un video di presentazione. Sotto ci sono tutti i servizi disponibili nella sezione musica accompagnati da immagini</w:t>
       </w:r>
       <w:r>
-        <w:rPr>
-          <w:lang w:val="it-IT"/>
-        </w:rPr>
         <w:t>.</w:t>
       </w:r>
     </w:p>
-    <w:p>
-      <w:pPr>
-        <w:rPr>
-          <w:lang w:val="it-IT"/>
-        </w:rPr>
-      </w:pPr>
-    </w:p>
+    <w:p/>
     <w:p>
       <w:pPr>
         <w:pStyle w:val="Paragrafoelenco"/>
@@ -2183,15 +1973,11 @@
           <w:bCs/>
           <w:sz w:val="26"/>
           <w:szCs w:val="26"/>
-          <w:lang w:val="it-IT"/>
         </w:rPr>
       </w:pPr>
       <w:r>
-        <w:rPr>
-          <w:noProof/>
-        </w:rPr>
         <w:drawing>
-          <wp:anchor distT="0" distB="0" distL="114300" distR="114300" simplePos="0" relativeHeight="251611648" behindDoc="0" locked="0" layoutInCell="1" allowOverlap="1" wp14:anchorId="43BA6029" wp14:editId="263A6934">
+          <wp:anchor distT="0" distB="0" distL="114300" distR="114300" simplePos="0" relativeHeight="251626496" behindDoc="0" locked="0" layoutInCell="1" allowOverlap="1" wp14:anchorId="43BA6029" wp14:editId="263A6934">
             <wp:simplePos x="0" y="0"/>
             <wp:positionH relativeFrom="column">
               <wp:posOffset>-419100</wp:posOffset>
@@ -2224,7 +2010,7 @@
                     </pic:cNvPicPr>
                   </pic:nvPicPr>
                   <pic:blipFill>
-                    <a:blip r:embed="rId14">
+                    <a:blip r:embed="rId13">
                       <a:extLst>
                         <a:ext uri="{28A0092B-C50C-407E-A947-70E740481C1C}">
                           <a14:useLocalDpi xmlns:a14="http://schemas.microsoft.com/office/drawing/2010/main" val="0"/>
@@ -2263,13 +2049,11 @@
       </w:r>
       <w:r>
         <w:rPr>
-          <w:noProof/>
           <w:sz w:val="26"/>
           <w:szCs w:val="26"/>
-          <w:lang w:val="it-IT"/>
         </w:rPr>
         <w:drawing>
-          <wp:anchor distT="0" distB="0" distL="114300" distR="114300" simplePos="0" relativeHeight="251612672" behindDoc="0" locked="0" layoutInCell="1" allowOverlap="1" wp14:anchorId="651501E2" wp14:editId="5D231E24">
+          <wp:anchor distT="0" distB="0" distL="114300" distR="114300" simplePos="0" relativeHeight="251627520" behindDoc="0" locked="0" layoutInCell="1" allowOverlap="1" wp14:anchorId="651501E2" wp14:editId="5D231E24">
             <wp:simplePos x="0" y="0"/>
             <wp:positionH relativeFrom="column">
               <wp:posOffset>2781300</wp:posOffset>
@@ -2302,7 +2086,7 @@
                     </pic:cNvPicPr>
                   </pic:nvPicPr>
                   <pic:blipFill>
-                    <a:blip r:embed="rId15">
+                    <a:blip r:embed="rId14">
                       <a:extLst>
                         <a:ext uri="{28A0092B-C50C-407E-A947-70E740481C1C}">
                           <a14:useLocalDpi xmlns:a14="http://schemas.microsoft.com/office/drawing/2010/main" val="0"/>
@@ -2343,10 +2127,30 @@
     <w:p>
       <w:pPr>
         <w:pStyle w:val="Paragrafoelenco"/>
+      </w:pPr>
+    </w:p>
+    <w:p>
+      <w:pPr>
+        <w:pStyle w:val="Paragrafoelenco"/>
         <w:rPr>
-          <w:lang w:val="it-IT"/>
+          <w:sz w:val="24"/>
+          <w:szCs w:val="24"/>
         </w:rPr>
       </w:pPr>
+    </w:p>
+    <w:p>
+      <w:pPr>
+        <w:pStyle w:val="Paragrafoelenco"/>
+        <w:rPr>
+          <w:rFonts w:asciiTheme="majorHAnsi" w:hAnsiTheme="majorHAnsi" w:cstheme="majorHAnsi"/>
+        </w:rPr>
+      </w:pPr>
+      <w:r>
+        <w:rPr>
+          <w:rFonts w:asciiTheme="majorHAnsi" w:hAnsiTheme="majorHAnsi" w:cstheme="majorHAnsi"/>
+        </w:rPr>
+        <w:t>La pagina di ogni servizio include una descrizione completa del servizio offerto, esempi audio e video, prezzo di partenza, recensioni e informazioni sul venditore. C’è anche un sommario generato dall’AI. L’acquisto è consentito solo agli utenti registrati, ma è possibile navigare liberamente.</w:t>
+      </w:r>
     </w:p>
     <w:p>
       <w:pPr>
@@ -2354,135 +2158,12 @@
         <w:rPr>
           <w:sz w:val="26"/>
           <w:szCs w:val="26"/>
-          <w:lang w:val="it-IT"/>
         </w:rPr>
       </w:pPr>
-    </w:p>
-    <w:p>
-      <w:pPr>
-        <w:pStyle w:val="Paragrafoelenco"/>
-        <w:rPr>
-          <w:rFonts w:asciiTheme="majorHAnsi" w:hAnsiTheme="majorHAnsi" w:cstheme="majorHAnsi"/>
-          <w:sz w:val="24"/>
-          <w:szCs w:val="24"/>
-          <w:lang w:val="it-IT"/>
-        </w:rPr>
-      </w:pPr>
       <w:r>
-        <w:rPr>
-          <w:rFonts w:asciiTheme="majorHAnsi" w:hAnsiTheme="majorHAnsi" w:cstheme="majorHAnsi"/>
-          <w:sz w:val="24"/>
-          <w:szCs w:val="24"/>
-          <w:lang w:val="it-IT"/>
-        </w:rPr>
-        <w:t xml:space="preserve">La pagina di ogni servizio </w:t>
-      </w:r>
-      <w:r>
-        <w:rPr>
-          <w:rFonts w:asciiTheme="majorHAnsi" w:hAnsiTheme="majorHAnsi" w:cstheme="majorHAnsi"/>
-          <w:sz w:val="24"/>
-          <w:szCs w:val="24"/>
-          <w:lang w:val="it-IT"/>
-        </w:rPr>
-        <w:t>include</w:t>
-      </w:r>
-      <w:r>
-        <w:rPr>
-          <w:rFonts w:asciiTheme="majorHAnsi" w:hAnsiTheme="majorHAnsi" w:cstheme="majorHAnsi"/>
-          <w:sz w:val="24"/>
-          <w:szCs w:val="24"/>
-          <w:lang w:val="it-IT"/>
-        </w:rPr>
-        <w:t xml:space="preserve"> una descrizione completa del servizio offerto, esempi audio e video, </w:t>
-      </w:r>
-      <w:r>
-        <w:rPr>
-          <w:rFonts w:asciiTheme="majorHAnsi" w:hAnsiTheme="majorHAnsi" w:cstheme="majorHAnsi"/>
-          <w:sz w:val="24"/>
-          <w:szCs w:val="24"/>
-          <w:lang w:val="it-IT"/>
-        </w:rPr>
-        <w:t>prezzo di partenza,</w:t>
-      </w:r>
-      <w:r>
-        <w:rPr>
-          <w:rFonts w:asciiTheme="majorHAnsi" w:hAnsiTheme="majorHAnsi" w:cstheme="majorHAnsi"/>
-          <w:sz w:val="24"/>
-          <w:szCs w:val="24"/>
-          <w:lang w:val="it-IT"/>
-        </w:rPr>
-        <w:t xml:space="preserve"> </w:t>
-      </w:r>
-      <w:r>
-        <w:rPr>
-          <w:rFonts w:asciiTheme="majorHAnsi" w:hAnsiTheme="majorHAnsi" w:cstheme="majorHAnsi"/>
-          <w:sz w:val="24"/>
-          <w:szCs w:val="24"/>
-          <w:lang w:val="it-IT"/>
-        </w:rPr>
-        <w:t>recensioni</w:t>
-      </w:r>
-      <w:r>
-        <w:rPr>
-          <w:rFonts w:asciiTheme="majorHAnsi" w:hAnsiTheme="majorHAnsi" w:cstheme="majorHAnsi"/>
-          <w:sz w:val="24"/>
-          <w:szCs w:val="24"/>
-          <w:lang w:val="it-IT"/>
-        </w:rPr>
-        <w:t xml:space="preserve"> e informazioni sul venditore</w:t>
-      </w:r>
-      <w:r>
-        <w:rPr>
-          <w:rFonts w:asciiTheme="majorHAnsi" w:hAnsiTheme="majorHAnsi" w:cstheme="majorHAnsi"/>
-          <w:sz w:val="24"/>
-          <w:szCs w:val="24"/>
-          <w:lang w:val="it-IT"/>
-        </w:rPr>
-        <w:t>.</w:t>
-      </w:r>
-      <w:r>
-        <w:rPr>
-          <w:rFonts w:asciiTheme="majorHAnsi" w:hAnsiTheme="majorHAnsi" w:cstheme="majorHAnsi"/>
-          <w:sz w:val="24"/>
-          <w:szCs w:val="24"/>
-          <w:lang w:val="it-IT"/>
-        </w:rPr>
-        <w:t xml:space="preserve"> C’è anche un sommario generato dall’AI. </w:t>
-      </w:r>
-      <w:r>
-        <w:rPr>
-          <w:rFonts w:asciiTheme="majorHAnsi" w:hAnsiTheme="majorHAnsi" w:cstheme="majorHAnsi"/>
-          <w:sz w:val="24"/>
-          <w:szCs w:val="24"/>
-          <w:lang w:val="it-IT"/>
-        </w:rPr>
-        <w:t>L’acquisto è consentito solo agli utenti registrati, ma è possibile navigare liberamente</w:t>
-      </w:r>
-      <w:r>
-        <w:rPr>
-          <w:rFonts w:asciiTheme="majorHAnsi" w:hAnsiTheme="majorHAnsi" w:cstheme="majorHAnsi"/>
-          <w:sz w:val="24"/>
-          <w:szCs w:val="24"/>
-          <w:lang w:val="it-IT"/>
-        </w:rPr>
-        <w:t>.</w:t>
-      </w:r>
-    </w:p>
-    <w:p>
-      <w:pPr>
-        <w:pStyle w:val="Paragrafoelenco"/>
         <w:rPr>
           <w:sz w:val="26"/>
           <w:szCs w:val="26"/>
-          <w:lang w:val="it-IT"/>
-        </w:rPr>
-      </w:pPr>
-      <w:r>
-        <w:rPr>
-          <w:noProof/>
-          <w:sz w:val="26"/>
-          <w:szCs w:val="26"/>
-          <w:lang w:val="it-IT"/>
         </w:rPr>
         <w:drawing>
           <wp:inline distT="0" distB="0" distL="0" distR="0" wp14:anchorId="69966F1E" wp14:editId="6B2CD254">
@@ -2502,7 +2183,7 @@
                     </pic:cNvPicPr>
                   </pic:nvPicPr>
                   <pic:blipFill>
-                    <a:blip r:embed="rId16">
+                    <a:blip r:embed="rId15">
                       <a:extLst>
                         <a:ext uri="{28A0092B-C50C-407E-A947-70E740481C1C}">
                           <a14:useLocalDpi xmlns:a14="http://schemas.microsoft.com/office/drawing/2010/main" val="0"/>
@@ -2540,7 +2221,6 @@
         <w:rPr>
           <w:sz w:val="26"/>
           <w:szCs w:val="26"/>
-          <w:lang w:val="it-IT"/>
         </w:rPr>
       </w:pPr>
     </w:p>
@@ -2550,7 +2230,6 @@
         <w:rPr>
           <w:sz w:val="26"/>
           <w:szCs w:val="26"/>
-          <w:lang w:val="it-IT"/>
         </w:rPr>
       </w:pPr>
     </w:p>
@@ -2560,7 +2239,6 @@
         <w:rPr>
           <w:sz w:val="26"/>
           <w:szCs w:val="26"/>
-          <w:lang w:val="it-IT"/>
         </w:rPr>
       </w:pPr>
     </w:p>
@@ -2570,7 +2248,6 @@
         <w:rPr>
           <w:sz w:val="26"/>
           <w:szCs w:val="26"/>
-          <w:lang w:val="it-IT"/>
         </w:rPr>
       </w:pPr>
     </w:p>
@@ -2580,7 +2257,6 @@
         <w:rPr>
           <w:sz w:val="26"/>
           <w:szCs w:val="26"/>
-          <w:lang w:val="it-IT"/>
         </w:rPr>
       </w:pPr>
     </w:p>
@@ -2590,7 +2266,6 @@
         <w:rPr>
           <w:sz w:val="26"/>
           <w:szCs w:val="26"/>
-          <w:lang w:val="it-IT"/>
         </w:rPr>
       </w:pPr>
     </w:p>
@@ -2600,7 +2275,6 @@
         <w:rPr>
           <w:sz w:val="26"/>
           <w:szCs w:val="26"/>
-          <w:lang w:val="it-IT"/>
         </w:rPr>
       </w:pPr>
     </w:p>
@@ -2610,7 +2284,6 @@
         <w:rPr>
           <w:sz w:val="26"/>
           <w:szCs w:val="26"/>
-          <w:lang w:val="it-IT"/>
         </w:rPr>
       </w:pPr>
     </w:p>
@@ -2620,7 +2293,6 @@
         <w:rPr>
           <w:sz w:val="26"/>
           <w:szCs w:val="26"/>
-          <w:lang w:val="it-IT"/>
         </w:rPr>
       </w:pPr>
     </w:p>
@@ -2630,7 +2302,15 @@
         <w:rPr>
           <w:sz w:val="26"/>
           <w:szCs w:val="26"/>
-          <w:lang w:val="it-IT"/>
+        </w:rPr>
+      </w:pPr>
+    </w:p>
+    <w:p>
+      <w:pPr>
+        <w:pStyle w:val="Paragrafoelenco"/>
+        <w:rPr>
+          <w:sz w:val="26"/>
+          <w:szCs w:val="26"/>
         </w:rPr>
       </w:pPr>
     </w:p>
@@ -2644,34 +2324,115 @@
         <w:rPr>
           <w:sz w:val="26"/>
           <w:szCs w:val="26"/>
-          <w:lang w:val="it-IT"/>
         </w:rPr>
       </w:pPr>
+      <w:proofErr w:type="spellStart"/>
+      <w:r>
+        <w:rPr>
+          <w:b/>
+          <w:bCs/>
+          <w:sz w:val="26"/>
+          <w:szCs w:val="26"/>
+        </w:rPr>
+        <w:lastRenderedPageBreak/>
+        <w:t>Neur</w:t>
+      </w:r>
+      <w:r>
+        <w:rPr>
+          <w:b/>
+          <w:bCs/>
+          <w:sz w:val="26"/>
+          <w:szCs w:val="26"/>
+        </w:rPr>
+        <w:t>a</w:t>
+      </w:r>
+      <w:r>
+        <w:rPr>
+          <w:b/>
+          <w:bCs/>
+          <w:sz w:val="26"/>
+          <w:szCs w:val="26"/>
+        </w:rPr>
+        <w:t>l</w:t>
+      </w:r>
+      <w:proofErr w:type="spellEnd"/>
       <w:r>
         <w:rPr>
           <w:sz w:val="26"/>
           <w:szCs w:val="26"/>
-          <w:lang w:val="it-IT"/>
         </w:rPr>
-        <w:lastRenderedPageBreak/>
-        <w:t>Neural (</w:t>
+        <w:t xml:space="preserve"> (</w:t>
       </w:r>
-      <w:hyperlink r:id="rId17" w:history="1">
-        <w:r>
-          <w:rPr>
-            <w:rStyle w:val="Collegamentoipertestuale"/>
-            <w:sz w:val="26"/>
-            <w:szCs w:val="26"/>
-            <w:lang w:val="it-IT"/>
-          </w:rPr>
-          <w:t>Neural DSP - Algorithmically Perfect - Neural DSP</w:t>
-        </w:r>
-      </w:hyperlink>
+      <w:proofErr w:type="spellStart"/>
+      <w:r>
+        <w:fldChar w:fldCharType="begin"/>
+      </w:r>
+      <w:r>
+        <w:instrText>HYPERLINK "https://neuraldsp.com/"</w:instrText>
+      </w:r>
+      <w:r>
+        <w:fldChar w:fldCharType="separate"/>
+      </w:r>
+      <w:r>
+        <w:rPr>
+          <w:rStyle w:val="Collegamentoipertestuale"/>
+          <w:sz w:val="26"/>
+          <w:szCs w:val="26"/>
+        </w:rPr>
+        <w:t>Neural</w:t>
+      </w:r>
+      <w:proofErr w:type="spellEnd"/>
+      <w:r>
+        <w:rPr>
+          <w:rStyle w:val="Collegamentoipertestuale"/>
+          <w:sz w:val="26"/>
+          <w:szCs w:val="26"/>
+        </w:rPr>
+        <w:t xml:space="preserve"> DSP - </w:t>
+      </w:r>
+      <w:proofErr w:type="spellStart"/>
+      <w:r>
+        <w:rPr>
+          <w:rStyle w:val="Collegamentoipertestuale"/>
+          <w:sz w:val="26"/>
+          <w:szCs w:val="26"/>
+        </w:rPr>
+        <w:t>Algorithmically</w:t>
+      </w:r>
+      <w:proofErr w:type="spellEnd"/>
+      <w:r>
+        <w:rPr>
+          <w:rStyle w:val="Collegamentoipertestuale"/>
+          <w:sz w:val="26"/>
+          <w:szCs w:val="26"/>
+        </w:rPr>
+        <w:t xml:space="preserve"> Perfect - </w:t>
+      </w:r>
+      <w:proofErr w:type="spellStart"/>
+      <w:r>
+        <w:rPr>
+          <w:rStyle w:val="Collegamentoipertestuale"/>
+          <w:sz w:val="26"/>
+          <w:szCs w:val="26"/>
+        </w:rPr>
+        <w:t>Neural</w:t>
+      </w:r>
+      <w:proofErr w:type="spellEnd"/>
+      <w:r>
+        <w:rPr>
+          <w:rStyle w:val="Collegamentoipertestuale"/>
+          <w:sz w:val="26"/>
+          <w:szCs w:val="26"/>
+        </w:rPr>
+        <w:t xml:space="preserve"> DSP</w:t>
+      </w:r>
+      <w:r>
+        <w:fldChar w:fldCharType="end"/>
+      </w:r>
       <w:r>
         <w:rPr>
           <w:sz w:val="26"/>
           <w:szCs w:val="26"/>
-          <w:lang w:val="it-IT"/>
         </w:rPr>
         <w:t>)</w:t>
       </w:r>
@@ -2679,230 +2440,55 @@
     <w:p>
       <w:pPr>
         <w:ind w:left="426"/>
-        <w:rPr>
-          <w:sz w:val="26"/>
-          <w:szCs w:val="26"/>
-          <w:lang w:val="it-IT"/>
-        </w:rPr>
-      </w:pPr>
+      </w:pPr>
+      <w:proofErr w:type="spellStart"/>
       <w:r>
         <w:rPr>
           <w:b/>
           <w:bCs/>
-          <w:sz w:val="24"/>
-          <w:szCs w:val="24"/>
         </w:rPr>
-        <w:t>Neural DSP</w:t>
+        <w:t>Neural</w:t>
+      </w:r>
+      <w:proofErr w:type="spellEnd"/>
+      <w:r>
+        <w:rPr>
+          <w:b/>
+          <w:bCs/>
+        </w:rPr>
+        <w:t xml:space="preserve"> DSP</w:t>
       </w:r>
       <w:r>
+        <w:t xml:space="preserve"> è un'azienda finlandese specializzata nella creazione di soluzioni digitali di altissima qualità per chitarristi e bassisti. </w:t>
+      </w:r>
+      <w:r>
+        <w:t>È</w:t>
+      </w:r>
+      <w:r>
+        <w:t xml:space="preserve"> celebre per i suoi plugin audio (VST/AU/AAX), spesso sviluppati in collaborazione con chitarristi di fama mondiale.</w:t>
+      </w:r>
+    </w:p>
+    <w:p>
+      <w:pPr>
+        <w:ind w:left="426"/>
         <w:rPr>
           <w:sz w:val="24"/>
           <w:szCs w:val="24"/>
         </w:rPr>
-        <w:t xml:space="preserve"> è un'azienda finlandese leader nel settore della tecnologia musicale, specializzata nella creazione di soluzioni digitali di altissima qualità per chitarristi e bassisti.</w:t>
+      </w:pPr>
+      <w:r>
+        <w:t xml:space="preserve">La pagina principale del sito </w:t>
       </w:r>
       <w:r>
-        <w:rPr>
-          <w:sz w:val="24"/>
-          <w:szCs w:val="24"/>
-        </w:rPr>
-        <w:t xml:space="preserve"> Essa </w:t>
-      </w:r>
-      <w:r>
-        <w:rPr>
-          <w:sz w:val="24"/>
-          <w:szCs w:val="24"/>
-        </w:rPr>
-        <w:t>è celebre per i suoi plugin audio (VST/AU/AAX), spesso sviluppati in collaborazione con chitarristi di fama mondiale</w:t>
-      </w:r>
-      <w:r>
-        <w:rPr>
-          <w:sz w:val="24"/>
-          <w:szCs w:val="24"/>
-        </w:rPr>
-        <w:t>.</w:t>
-      </w:r>
-      <w:r>
-        <w:rPr>
-          <w:sz w:val="26"/>
-          <w:szCs w:val="26"/>
-          <w:lang w:val="it-IT"/>
-        </w:rPr>
-        <w:t xml:space="preserve"> </w:t>
-      </w:r>
-      <w:r>
-        <w:rPr>
-          <w:sz w:val="26"/>
-          <w:szCs w:val="26"/>
-          <w:lang w:val="it-IT"/>
-        </w:rPr>
-        <w:drawing>
-          <wp:inline distT="0" distB="0" distL="0" distR="0" wp14:anchorId="272626D7" wp14:editId="1F08D11D">
-            <wp:extent cx="4724400" cy="2571750"/>
-            <wp:effectExtent l="0" t="0" r="0" b="0"/>
-            <wp:docPr id="1972792325" name="Immagine 1"/>
-            <wp:cNvGraphicFramePr>
-              <a:graphicFrameLocks xmlns:a="http://schemas.openxmlformats.org/drawingml/2006/main" noChangeAspect="1"/>
-            </wp:cNvGraphicFramePr>
-            <a:graphic xmlns:a="http://schemas.openxmlformats.org/drawingml/2006/main">
-              <a:graphicData uri="http://schemas.openxmlformats.org/drawingml/2006/picture">
-                <pic:pic xmlns:pic="http://schemas.openxmlformats.org/drawingml/2006/picture">
-                  <pic:nvPicPr>
-                    <pic:cNvPr id="1972792325" name=""/>
-                    <pic:cNvPicPr/>
-                  </pic:nvPicPr>
-                  <pic:blipFill>
-                    <a:blip r:embed="rId18"/>
-                    <a:stretch>
-                      <a:fillRect/>
-                    </a:stretch>
-                  </pic:blipFill>
-                  <pic:spPr>
-                    <a:xfrm>
-                      <a:off x="0" y="0"/>
-                      <a:ext cx="4724400" cy="2571750"/>
-                    </a:xfrm>
-                    <a:prstGeom prst="rect">
-                      <a:avLst/>
-                    </a:prstGeom>
-                  </pic:spPr>
-                </pic:pic>
-              </a:graphicData>
-            </a:graphic>
-          </wp:inline>
-        </w:drawing>
+        <w:t>mostra nell’area centrale una visione sui prodotti più popolari e le collaborazioni più rinomate, permettendo di accedere velocemente all’acquisto del prodotto in evidenza.</w:t>
       </w:r>
     </w:p>
     <w:p>
-      <w:pPr>
-        <w:ind w:left="426"/>
-        <w:rPr>
-          <w:sz w:val="24"/>
-          <w:szCs w:val="24"/>
-          <w:lang w:val="it-IT"/>
-        </w:rPr>
-      </w:pPr>
-    </w:p>
-    <w:p>
-      <w:pPr>
-        <w:rPr>
-          <w:sz w:val="28"/>
-          <w:szCs w:val="28"/>
-        </w:rPr>
-      </w:pPr>
       <w:r>
-        <w:rPr>
-          <w:sz w:val="28"/>
-          <w:szCs w:val="28"/>
-          <w:lang w:val="it-IT"/>
-        </w:rPr>
-        <w:t xml:space="preserve">Le sue offerte comprendono </w:t>
-      </w:r>
-      <w:r>
-        <w:rPr>
-          <w:sz w:val="28"/>
-          <w:szCs w:val="28"/>
-        </w:rPr>
-        <w:t>una suite completa che include pre-effetti (pedali), diverse testate di amplificatori, cabinet con microfoni virtuali posizionabili e post-effetti (delay, riverberi).</w:t>
-      </w:r>
-      <w:r>
-        <w:rPr>
-          <w:sz w:val="28"/>
-          <w:szCs w:val="28"/>
-        </w:rPr>
-        <w:t xml:space="preserve"> Sono famosi soprattutto per i loro plugin Sofware serie Archetype.</w:t>
-      </w:r>
-      <w:r>
-        <w:rPr>
-          <w:noProof/>
-          <w:sz w:val="24"/>
-          <w:szCs w:val="24"/>
-        </w:rPr>
-        <w:t xml:space="preserve"> </w:t>
-      </w:r>
-    </w:p>
-    <w:p>
-      <w:pPr>
-        <w:rPr>
-          <w:lang w:val="it-IT"/>
-        </w:rPr>
-      </w:pPr>
-      <w:r>
-        <w:rPr>
-          <w:noProof/>
-        </w:rPr>
         <w:drawing>
-          <wp:anchor distT="0" distB="0" distL="114300" distR="114300" simplePos="0" relativeHeight="251656704" behindDoc="0" locked="0" layoutInCell="1" allowOverlap="1" wp14:anchorId="7A879C3D" wp14:editId="12227784">
+          <wp:anchor distT="0" distB="0" distL="114300" distR="114300" simplePos="0" relativeHeight="251630592" behindDoc="0" locked="0" layoutInCell="1" allowOverlap="1" wp14:anchorId="66F908B6" wp14:editId="4E1FF001">
             <wp:simplePos x="0" y="0"/>
             <wp:positionH relativeFrom="column">
-              <wp:posOffset>2819400</wp:posOffset>
-            </wp:positionH>
-            <wp:positionV relativeFrom="paragraph">
-              <wp:posOffset>4445</wp:posOffset>
-            </wp:positionV>
-            <wp:extent cx="3714750" cy="1884045"/>
-            <wp:effectExtent l="0" t="0" r="0" b="1905"/>
-            <wp:wrapNone/>
-            <wp:docPr id="1826621955" name="Immagine 2"/>
-            <wp:cNvGraphicFramePr>
-              <a:graphicFrameLocks xmlns:a="http://schemas.openxmlformats.org/drawingml/2006/main" noChangeAspect="1"/>
-            </wp:cNvGraphicFramePr>
-            <a:graphic xmlns:a="http://schemas.openxmlformats.org/drawingml/2006/main">
-              <a:graphicData uri="http://schemas.openxmlformats.org/drawingml/2006/picture">
-                <pic:pic xmlns:pic="http://schemas.openxmlformats.org/drawingml/2006/picture">
-                  <pic:nvPicPr>
-                    <pic:cNvPr id="0" name="Picture 2"/>
-                    <pic:cNvPicPr>
-                      <a:picLocks noChangeAspect="1" noChangeArrowheads="1"/>
-                    </pic:cNvPicPr>
-                  </pic:nvPicPr>
-                  <pic:blipFill>
-                    <a:blip r:embed="rId19">
-                      <a:extLst>
-                        <a:ext uri="{28A0092B-C50C-407E-A947-70E740481C1C}">
-                          <a14:useLocalDpi xmlns:a14="http://schemas.microsoft.com/office/drawing/2010/main" val="0"/>
-                        </a:ext>
-                      </a:extLst>
-                    </a:blip>
-                    <a:srcRect/>
-                    <a:stretch>
-                      <a:fillRect/>
-                    </a:stretch>
-                  </pic:blipFill>
-                  <pic:spPr bwMode="auto">
-                    <a:xfrm>
-                      <a:off x="0" y="0"/>
-                      <a:ext cx="3714750" cy="1884045"/>
-                    </a:xfrm>
-                    <a:prstGeom prst="rect">
-                      <a:avLst/>
-                    </a:prstGeom>
-                    <a:noFill/>
-                    <a:ln>
-                      <a:noFill/>
-                    </a:ln>
-                  </pic:spPr>
-                </pic:pic>
-              </a:graphicData>
-            </a:graphic>
-            <wp14:sizeRelH relativeFrom="margin">
-              <wp14:pctWidth>0</wp14:pctWidth>
-            </wp14:sizeRelH>
-            <wp14:sizeRelV relativeFrom="margin">
-              <wp14:pctHeight>0</wp14:pctHeight>
-            </wp14:sizeRelV>
-          </wp:anchor>
-        </w:drawing>
-      </w:r>
-      <w:r>
-        <w:rPr>
-          <w:noProof/>
-        </w:rPr>
-        <w:drawing>
-          <wp:anchor distT="0" distB="0" distL="114300" distR="114300" simplePos="0" relativeHeight="251640320" behindDoc="0" locked="0" layoutInCell="1" allowOverlap="1" wp14:anchorId="66F908B6" wp14:editId="43F01CA7">
-            <wp:simplePos x="0" y="0"/>
-            <wp:positionH relativeFrom="column">
-              <wp:posOffset>-1060450</wp:posOffset>
+              <wp:posOffset>853410</wp:posOffset>
             </wp:positionH>
             <wp:positionV relativeFrom="paragraph">
               <wp:posOffset>4445</wp:posOffset>
@@ -2924,7 +2510,7 @@
                     </pic:cNvPicPr>
                   </pic:nvPicPr>
                   <pic:blipFill>
-                    <a:blip r:embed="rId20">
+                    <a:blip r:embed="rId16">
                       <a:extLst>
                         <a:ext uri="{28A0092B-C50C-407E-A947-70E740481C1C}">
                           <a14:useLocalDpi xmlns:a14="http://schemas.microsoft.com/office/drawing/2010/main" val="0"/>
@@ -2965,7 +2551,6 @@
         <w:rPr>
           <w:sz w:val="26"/>
           <w:szCs w:val="26"/>
-          <w:lang w:val="it-IT"/>
         </w:rPr>
       </w:pPr>
     </w:p>
@@ -2975,7 +2560,6 @@
         <w:rPr>
           <w:sz w:val="26"/>
           <w:szCs w:val="26"/>
-          <w:lang w:val="it-IT"/>
         </w:rPr>
       </w:pPr>
     </w:p>
@@ -2985,7 +2569,6 @@
         <w:rPr>
           <w:sz w:val="26"/>
           <w:szCs w:val="26"/>
-          <w:lang w:val="it-IT"/>
         </w:rPr>
       </w:pPr>
     </w:p>
@@ -2995,7 +2578,6 @@
         <w:rPr>
           <w:sz w:val="26"/>
           <w:szCs w:val="26"/>
-          <w:lang w:val="it-IT"/>
         </w:rPr>
       </w:pPr>
     </w:p>
@@ -3005,117 +2587,30 @@
         <w:rPr>
           <w:sz w:val="26"/>
           <w:szCs w:val="26"/>
-          <w:lang w:val="it-IT"/>
         </w:rPr>
       </w:pPr>
     </w:p>
     <w:p>
       <w:pPr>
-        <w:pStyle w:val="Paragrafoelenco"/>
         <w:rPr>
           <w:sz w:val="26"/>
           <w:szCs w:val="26"/>
-          <w:lang w:val="it-IT"/>
         </w:rPr>
       </w:pPr>
-    </w:p>
-    <w:p>
-      <w:pPr>
-        <w:pStyle w:val="Paragrafoelenco"/>
-        <w:rPr>
-          <w:sz w:val="26"/>
-          <w:szCs w:val="26"/>
-          <w:lang w:val="it-IT"/>
-        </w:rPr>
-      </w:pPr>
-    </w:p>
-    <w:p>
-      <w:pPr>
-        <w:pStyle w:val="Paragrafoelenco"/>
-        <w:rPr>
-          <w:sz w:val="26"/>
-          <w:szCs w:val="26"/>
-          <w:lang w:val="it-IT"/>
-        </w:rPr>
-      </w:pPr>
-    </w:p>
-    <w:p>
-      <w:pPr>
-        <w:pStyle w:val="Paragrafoelenco"/>
-        <w:rPr>
-          <w:sz w:val="26"/>
-          <w:szCs w:val="26"/>
-          <w:lang w:val="it-IT"/>
-        </w:rPr>
-      </w:pPr>
-    </w:p>
-    <w:p>
-      <w:pPr>
-        <w:pStyle w:val="Paragrafoelenco"/>
-        <w:rPr>
-          <w:sz w:val="26"/>
-          <w:szCs w:val="26"/>
-          <w:lang w:val="it-IT"/>
-        </w:rPr>
-      </w:pPr>
-    </w:p>
-    <w:p>
-      <w:pPr>
-        <w:pStyle w:val="Paragrafoelenco"/>
-        <w:rPr>
-          <w:sz w:val="26"/>
-          <w:szCs w:val="26"/>
-          <w:lang w:val="it-IT"/>
-        </w:rPr>
-      </w:pPr>
-    </w:p>
-    <w:p>
-      <w:pPr>
-        <w:pStyle w:val="Paragrafoelenco"/>
-        <w:rPr>
-          <w:sz w:val="26"/>
-          <w:szCs w:val="26"/>
-          <w:lang w:val="it-IT"/>
-        </w:rPr>
-      </w:pPr>
-    </w:p>
-    <w:p>
-      <w:pPr>
-        <w:pStyle w:val="Paragrafoelenco"/>
-        <w:rPr>
-          <w:sz w:val="26"/>
-          <w:szCs w:val="26"/>
-          <w:lang w:val="it-IT"/>
-        </w:rPr>
-      </w:pPr>
-    </w:p>
-    <w:p>
-      <w:pPr>
-        <w:pStyle w:val="Paragrafoelenco"/>
-        <w:rPr>
-          <w:sz w:val="26"/>
-          <w:szCs w:val="26"/>
-          <w:lang w:val="it-IT"/>
-        </w:rPr>
-      </w:pPr>
       <w:r>
-        <w:rPr>
-          <w:sz w:val="24"/>
-          <w:szCs w:val="24"/>
-        </w:rPr>
         <w:drawing>
-          <wp:anchor distT="0" distB="0" distL="114300" distR="114300" simplePos="0" relativeHeight="251673088" behindDoc="0" locked="0" layoutInCell="1" allowOverlap="1" wp14:anchorId="4DA43E83" wp14:editId="353DDA29">
+          <wp:anchor distT="0" distB="0" distL="114300" distR="114300" simplePos="0" relativeHeight="251643904" behindDoc="0" locked="0" layoutInCell="1" allowOverlap="1" wp14:anchorId="7A879C3D" wp14:editId="25331E85">
             <wp:simplePos x="0" y="0"/>
             <wp:positionH relativeFrom="column">
-              <wp:posOffset>-25400</wp:posOffset>
+              <wp:posOffset>1948009</wp:posOffset>
             </wp:positionH>
             <wp:positionV relativeFrom="paragraph">
-              <wp:posOffset>-443865</wp:posOffset>
+              <wp:posOffset>339772</wp:posOffset>
             </wp:positionV>
-            <wp:extent cx="3308989" cy="1739900"/>
-            <wp:effectExtent l="0" t="0" r="5715" b="0"/>
+            <wp:extent cx="2798384" cy="1419283"/>
+            <wp:effectExtent l="0" t="0" r="2540" b="0"/>
             <wp:wrapNone/>
-            <wp:docPr id="1461843809" name="Immagine 1"/>
+            <wp:docPr id="1826621955" name="Immagine 2"/>
             <wp:cNvGraphicFramePr>
               <a:graphicFrameLocks xmlns:a="http://schemas.openxmlformats.org/drawingml/2006/main" noChangeAspect="1"/>
             </wp:cNvGraphicFramePr>
@@ -3123,11 +2618,84 @@
               <a:graphicData uri="http://schemas.openxmlformats.org/drawingml/2006/picture">
                 <pic:pic xmlns:pic="http://schemas.openxmlformats.org/drawingml/2006/picture">
                   <pic:nvPicPr>
-                    <pic:cNvPr id="1461843809" name=""/>
+                    <pic:cNvPr id="0" name="Picture 2"/>
+                    <pic:cNvPicPr>
+                      <a:picLocks noChangeAspect="1" noChangeArrowheads="1"/>
+                    </pic:cNvPicPr>
+                  </pic:nvPicPr>
+                  <pic:blipFill>
+                    <a:blip r:embed="rId17">
+                      <a:extLst>
+                        <a:ext uri="{28A0092B-C50C-407E-A947-70E740481C1C}">
+                          <a14:useLocalDpi xmlns:a14="http://schemas.microsoft.com/office/drawing/2010/main" val="0"/>
+                        </a:ext>
+                      </a:extLst>
+                    </a:blip>
+                    <a:srcRect/>
+                    <a:stretch>
+                      <a:fillRect/>
+                    </a:stretch>
+                  </pic:blipFill>
+                  <pic:spPr bwMode="auto">
+                    <a:xfrm>
+                      <a:off x="0" y="0"/>
+                      <a:ext cx="2813938" cy="1427172"/>
+                    </a:xfrm>
+                    <a:prstGeom prst="rect">
+                      <a:avLst/>
+                    </a:prstGeom>
+                    <a:noFill/>
+                    <a:ln>
+                      <a:noFill/>
+                    </a:ln>
+                  </pic:spPr>
+                </pic:pic>
+              </a:graphicData>
+            </a:graphic>
+            <wp14:sizeRelH relativeFrom="margin">
+              <wp14:pctWidth>0</wp14:pctWidth>
+            </wp14:sizeRelH>
+            <wp14:sizeRelV relativeFrom="margin">
+              <wp14:pctHeight>0</wp14:pctHeight>
+            </wp14:sizeRelV>
+          </wp:anchor>
+        </w:drawing>
+      </w:r>
+    </w:p>
+    <w:p>
+      <w:pPr>
+        <w:pStyle w:val="Paragrafoelenco"/>
+        <w:rPr>
+          <w:sz w:val="26"/>
+          <w:szCs w:val="26"/>
+        </w:rPr>
+      </w:pPr>
+      <w:r>
+        <w:drawing>
+          <wp:anchor distT="0" distB="0" distL="114300" distR="114300" simplePos="0" relativeHeight="251671552" behindDoc="0" locked="0" layoutInCell="1" allowOverlap="1" wp14:anchorId="70F6DF38" wp14:editId="1F73E334">
+            <wp:simplePos x="0" y="0"/>
+            <wp:positionH relativeFrom="column">
+              <wp:posOffset>2398266</wp:posOffset>
+            </wp:positionH>
+            <wp:positionV relativeFrom="paragraph">
+              <wp:posOffset>125929</wp:posOffset>
+            </wp:positionV>
+            <wp:extent cx="2185834" cy="1876257"/>
+            <wp:effectExtent l="0" t="0" r="5080" b="0"/>
+            <wp:wrapNone/>
+            <wp:docPr id="1018131445" name="Immagine 1"/>
+            <wp:cNvGraphicFramePr>
+              <a:graphicFrameLocks xmlns:a="http://schemas.openxmlformats.org/drawingml/2006/main" noChangeAspect="1"/>
+            </wp:cNvGraphicFramePr>
+            <a:graphic xmlns:a="http://schemas.openxmlformats.org/drawingml/2006/main">
+              <a:graphicData uri="http://schemas.openxmlformats.org/drawingml/2006/picture">
+                <pic:pic xmlns:pic="http://schemas.openxmlformats.org/drawingml/2006/picture">
+                  <pic:nvPicPr>
+                    <pic:cNvPr id="1018131445" name=""/>
                     <pic:cNvPicPr/>
                   </pic:nvPicPr>
                   <pic:blipFill>
-                    <a:blip r:embed="rId21"/>
+                    <a:blip r:embed="rId18"/>
                     <a:stretch>
                       <a:fillRect/>
                     </a:stretch>
@@ -3135,7 +2703,7 @@
                   <pic:spPr>
                     <a:xfrm>
                       <a:off x="0" y="0"/>
-                      <a:ext cx="3308989" cy="1739900"/>
+                      <a:ext cx="2185834" cy="1876257"/>
                     </a:xfrm>
                     <a:prstGeom prst="rect">
                       <a:avLst/>
@@ -3156,22 +2724,20 @@
       <w:r>
         <w:rPr>
           <w:rFonts w:cstheme="majorHAnsi"/>
-          <w:noProof/>
-          <w:lang w:val="it-IT"/>
         </w:rPr>
         <mc:AlternateContent>
           <mc:Choice Requires="wps">
             <w:drawing>
-              <wp:anchor distT="45720" distB="45720" distL="114300" distR="114300" simplePos="0" relativeHeight="251663872" behindDoc="0" locked="0" layoutInCell="1" allowOverlap="1" wp14:anchorId="17E6327D" wp14:editId="6FBA9D0E">
+              <wp:anchor distT="45720" distB="45720" distL="114300" distR="114300" simplePos="0" relativeHeight="251638784" behindDoc="0" locked="0" layoutInCell="1" allowOverlap="1" wp14:anchorId="17E6327D" wp14:editId="3E04F620">
                 <wp:simplePos x="0" y="0"/>
                 <wp:positionH relativeFrom="column">
-                  <wp:posOffset>-908050</wp:posOffset>
+                  <wp:posOffset>-904875</wp:posOffset>
                 </wp:positionH>
                 <wp:positionV relativeFrom="paragraph">
-                  <wp:posOffset>-448945</wp:posOffset>
+                  <wp:posOffset>242570</wp:posOffset>
                 </wp:positionV>
-                <wp:extent cx="2698750" cy="1676400"/>
-                <wp:effectExtent l="0" t="0" r="25400" b="19050"/>
+                <wp:extent cx="2609850" cy="1190625"/>
+                <wp:effectExtent l="0" t="0" r="19050" b="28575"/>
                 <wp:wrapSquare wrapText="bothSides"/>
                 <wp:docPr id="217" name="Casella di testo 2"/>
                 <wp:cNvGraphicFramePr>
@@ -3186,7 +2752,7 @@
                       <wps:spPr bwMode="auto">
                         <a:xfrm>
                           <a:off x="0" y="0"/>
-                          <a:ext cx="2698750" cy="1676400"/>
+                          <a:ext cx="2609850" cy="1190625"/>
                         </a:xfrm>
                         <a:prstGeom prst="rect">
                           <a:avLst/>
@@ -3211,10 +2777,6 @@
                               </w:rPr>
                             </w:pPr>
                             <w:r>
-                              <w:rPr>
-                                <w:sz w:val="28"/>
-                                <w:szCs w:val="28"/>
-                              </w:rPr>
                               <w:t xml:space="preserve">Nel Catalogo che ci viene offerto nella sezione </w:t>
                             </w:r>
                             <w:r>
@@ -3223,24 +2785,18 @@
                                 <w:bCs/>
                                 <w:i/>
                                 <w:iCs/>
-                                <w:sz w:val="28"/>
-                                <w:szCs w:val="28"/>
                               </w:rPr>
                               <w:t xml:space="preserve">Plugins </w:t>
+                            </w:r>
+                            <w:r>
+                              <w:t>possiamo selezionare i prodotti desiderati e inserirli nel carrello. Ci verrà però chiesto di inserire un account per procedere con il pagamento</w:t>
                             </w:r>
                             <w:r>
                               <w:rPr>
                                 <w:sz w:val="28"/>
                                 <w:szCs w:val="28"/>
                               </w:rPr>
-                              <w:t>possiamo selezionare i prodotti desiderati e inserirli nel carrello</w:t>
-                            </w:r>
-                            <w:r>
-                              <w:rPr>
-                                <w:sz w:val="28"/>
-                                <w:szCs w:val="28"/>
-                              </w:rPr>
-                              <w:t>. Ci verrà però chiesto di inserire un account per procedere con il pagamento.</w:t>
+                              <w:t>.</w:t>
                             </w:r>
                           </w:p>
                         </w:txbxContent>
@@ -3266,7 +2822,7 @@
                 <v:stroke joinstyle="miter"/>
                 <v:path gradientshapeok="t" o:connecttype="rect"/>
               </v:shapetype>
-              <v:shape id="Casella di testo 2" o:spid="_x0000_s1026" type="#_x0000_t202" style="position:absolute;left:0;text-align:left;margin-left:-71.5pt;margin-top:-35.35pt;width:212.5pt;height:132pt;z-index:251663872;visibility:visible;mso-wrap-style:square;mso-width-percent:0;mso-height-percent:0;mso-wrap-distance-left:9pt;mso-wrap-distance-top:3.6pt;mso-wrap-distance-right:9pt;mso-wrap-distance-bottom:3.6pt;mso-position-horizontal:absolute;mso-position-horizontal-relative:text;mso-position-vertical:absolute;mso-position-vertical-relative:text;mso-width-percent:0;mso-height-percent:0;mso-width-relative:margin;mso-height-relative:margin;v-text-anchor:top" o:gfxdata="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" filled="f" strokecolor="black [3213]">
+              <v:shape id="Casella di testo 2" o:spid="_x0000_s1026" type="#_x0000_t202" style="position:absolute;left:0;text-align:left;margin-left:-71.25pt;margin-top:19.1pt;width:205.5pt;height:93.75pt;z-index:251638784;visibility:visible;mso-wrap-style:square;mso-width-percent:0;mso-height-percent:0;mso-wrap-distance-left:9pt;mso-wrap-distance-top:3.6pt;mso-wrap-distance-right:9pt;mso-wrap-distance-bottom:3.6pt;mso-position-horizontal:absolute;mso-position-horizontal-relative:text;mso-position-vertical:absolute;mso-position-vertical-relative:text;mso-width-percent:0;mso-height-percent:0;mso-width-relative:margin;mso-height-relative:margin;v-text-anchor:top" o:gfxdata="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" filled="f" strokecolor="black [3213]">
                 <v:textbox>
                   <w:txbxContent>
                     <w:p>
@@ -3277,10 +2833,6 @@
                         </w:rPr>
                       </w:pPr>
                       <w:r>
-                        <w:rPr>
-                          <w:sz w:val="28"/>
-                          <w:szCs w:val="28"/>
-                        </w:rPr>
                         <w:t xml:space="preserve">Nel Catalogo che ci viene offerto nella sezione </w:t>
                       </w:r>
                       <w:r>
@@ -3289,24 +2841,18 @@
                           <w:bCs/>
                           <w:i/>
                           <w:iCs/>
-                          <w:sz w:val="28"/>
-                          <w:szCs w:val="28"/>
                         </w:rPr>
                         <w:t xml:space="preserve">Plugins </w:t>
+                      </w:r>
+                      <w:r>
+                        <w:t>possiamo selezionare i prodotti desiderati e inserirli nel carrello. Ci verrà però chiesto di inserire un account per procedere con il pagamento</w:t>
                       </w:r>
                       <w:r>
                         <w:rPr>
                           <w:sz w:val="28"/>
                           <w:szCs w:val="28"/>
                         </w:rPr>
-                        <w:t>possiamo selezionare i prodotti desiderati e inserirli nel carrello</w:t>
-                      </w:r>
-                      <w:r>
-                        <w:rPr>
-                          <w:sz w:val="28"/>
-                          <w:szCs w:val="28"/>
-                        </w:rPr>
-                        <w:t>. Ci verrà però chiesto di inserire un account per procedere con il pagamento.</w:t>
+                        <w:t>.</w:t>
                       </w:r>
                     </w:p>
                   </w:txbxContent>
@@ -3320,111 +2866,88 @@
     </w:p>
     <w:p>
       <w:pPr>
+        <w:pStyle w:val="Paragrafoelenco"/>
+        <w:rPr>
+          <w:sz w:val="26"/>
+          <w:szCs w:val="26"/>
+        </w:rPr>
+      </w:pPr>
+    </w:p>
+    <w:p>
+      <w:pPr>
+        <w:pStyle w:val="Paragrafoelenco"/>
+        <w:rPr>
+          <w:sz w:val="26"/>
+          <w:szCs w:val="26"/>
+        </w:rPr>
+      </w:pPr>
+    </w:p>
+    <w:p>
+      <w:pPr>
+        <w:pStyle w:val="Paragrafoelenco"/>
+        <w:rPr>
+          <w:sz w:val="26"/>
+          <w:szCs w:val="26"/>
+        </w:rPr>
+      </w:pPr>
+    </w:p>
+    <w:p>
+      <w:pPr>
         <w:pStyle w:val="Titolo1"/>
         <w:rPr>
           <w:rFonts w:cstheme="majorHAnsi"/>
-          <w:lang w:val="it-IT"/>
         </w:rPr>
       </w:pPr>
       <w:bookmarkStart w:id="3" w:name="_Toc223999117"/>
     </w:p>
     <w:p>
       <w:pPr>
+        <w:ind w:left="426"/>
+      </w:pPr>
+    </w:p>
+    <w:p>
+      <w:pPr>
+        <w:ind w:left="426"/>
+      </w:pPr>
+    </w:p>
+    <w:p>
+      <w:pPr>
+        <w:ind w:left="426"/>
         <w:rPr>
-          <w:lang w:val="it-IT"/>
+          <w:sz w:val="26"/>
+          <w:szCs w:val="26"/>
         </w:rPr>
       </w:pPr>
       <w:r>
-        <w:rPr>
-          <w:lang w:val="it-IT"/>
-        </w:rPr>
-        <w:drawing>
-          <wp:anchor distT="0" distB="0" distL="114300" distR="114300" simplePos="0" relativeHeight="251682304" behindDoc="0" locked="0" layoutInCell="1" allowOverlap="1" wp14:anchorId="70F6DF38" wp14:editId="53DFA12E">
-            <wp:simplePos x="0" y="0"/>
-            <wp:positionH relativeFrom="column">
-              <wp:posOffset>1676400</wp:posOffset>
-            </wp:positionH>
-            <wp:positionV relativeFrom="paragraph">
-              <wp:posOffset>59055</wp:posOffset>
-            </wp:positionV>
-            <wp:extent cx="2806700" cy="2409190"/>
-            <wp:effectExtent l="0" t="0" r="0" b="0"/>
-            <wp:wrapNone/>
-            <wp:docPr id="1018131445" name="Immagine 1"/>
-            <wp:cNvGraphicFramePr>
-              <a:graphicFrameLocks xmlns:a="http://schemas.openxmlformats.org/drawingml/2006/main" noChangeAspect="1"/>
-            </wp:cNvGraphicFramePr>
-            <a:graphic xmlns:a="http://schemas.openxmlformats.org/drawingml/2006/main">
-              <a:graphicData uri="http://schemas.openxmlformats.org/drawingml/2006/picture">
-                <pic:pic xmlns:pic="http://schemas.openxmlformats.org/drawingml/2006/picture">
-                  <pic:nvPicPr>
-                    <pic:cNvPr id="1018131445" name=""/>
-                    <pic:cNvPicPr/>
-                  </pic:nvPicPr>
-                  <pic:blipFill>
-                    <a:blip r:embed="rId22"/>
-                    <a:stretch>
-                      <a:fillRect/>
-                    </a:stretch>
-                  </pic:blipFill>
-                  <pic:spPr>
-                    <a:xfrm>
-                      <a:off x="0" y="0"/>
-                      <a:ext cx="2806700" cy="2409190"/>
-                    </a:xfrm>
-                    <a:prstGeom prst="rect">
-                      <a:avLst/>
-                    </a:prstGeom>
-                  </pic:spPr>
-                </pic:pic>
-              </a:graphicData>
-            </a:graphic>
-            <wp14:sizeRelH relativeFrom="margin">
-              <wp14:pctWidth>0</wp14:pctWidth>
-            </wp14:sizeRelH>
-            <wp14:sizeRelV relativeFrom="margin">
-              <wp14:pctHeight>0</wp14:pctHeight>
-            </wp14:sizeRelV>
-          </wp:anchor>
-        </w:drawing>
+        <w:t xml:space="preserve">Le sue offerte comprendono una suite completa che include </w:t>
+      </w:r>
+      <w:proofErr w:type="spellStart"/>
+      <w:r>
+        <w:t>pre</w:t>
+      </w:r>
+      <w:proofErr w:type="spellEnd"/>
+      <w:r>
+        <w:t xml:space="preserve">-effetti (pedali), diverse testate di amplificatori, cabinet con microfoni virtuali posizionabili e post-effetti (delay, riverberi). </w:t>
       </w:r>
     </w:p>
     <w:p>
-      <w:pPr>
-        <w:pStyle w:val="Titolo1"/>
-        <w:rPr>
-          <w:rFonts w:cstheme="majorHAnsi"/>
-          <w:lang w:val="it-IT"/>
-        </w:rPr>
-      </w:pPr>
-    </w:p>
-    <w:p>
-      <w:pPr>
-        <w:pStyle w:val="Titolo1"/>
-        <w:rPr>
-          <w:rFonts w:cstheme="majorHAnsi"/>
-          <w:lang w:val="it-IT"/>
-        </w:rPr>
-      </w:pPr>
       <w:r>
         <w:rPr>
           <w:rFonts w:cstheme="majorHAnsi"/>
-          <w:noProof/>
-          <w:lang w:val="it-IT"/>
         </w:rPr>
         <mc:AlternateContent>
           <mc:Choice Requires="wps">
             <w:drawing>
-              <wp:anchor distT="45720" distB="45720" distL="114300" distR="114300" simplePos="0" relativeHeight="251690496" behindDoc="0" locked="0" layoutInCell="1" allowOverlap="1" wp14:anchorId="4C60BD46" wp14:editId="4AC85ABB">
+              <wp:anchor distT="45720" distB="45720" distL="114300" distR="114300" simplePos="0" relativeHeight="251654144" behindDoc="0" locked="0" layoutInCell="1" allowOverlap="1" wp14:anchorId="4C60BD46" wp14:editId="266217A1">
                 <wp:simplePos x="0" y="0"/>
                 <wp:positionH relativeFrom="column">
-                  <wp:posOffset>-850900</wp:posOffset>
+                  <wp:posOffset>-717697</wp:posOffset>
                 </wp:positionH>
                 <wp:positionV relativeFrom="paragraph">
-                  <wp:posOffset>158750</wp:posOffset>
+                  <wp:posOffset>480577</wp:posOffset>
                 </wp:positionV>
-                <wp:extent cx="3810000" cy="1676400"/>
-                <wp:effectExtent l="0" t="0" r="19050" b="19050"/>
+                <wp:extent cx="2870200" cy="1201420"/>
+                <wp:effectExtent l="0" t="0" r="25400" b="17780"/>
                 <wp:wrapSquare wrapText="bothSides"/>
                 <wp:docPr id="1261319973" name="Casella di testo 2"/>
                 <wp:cNvGraphicFramePr>
@@ -3439,7 +2962,7 @@
                       <wps:spPr bwMode="auto">
                         <a:xfrm>
                           <a:off x="0" y="0"/>
-                          <a:ext cx="3810000" cy="1676400"/>
+                          <a:ext cx="2870200" cy="1201420"/>
                         </a:xfrm>
                         <a:prstGeom prst="rect">
                           <a:avLst/>
@@ -3457,18 +2980,14 @@
                       <wps:txbx>
                         <w:txbxContent>
                           <w:p>
-                            <w:pPr>
-                              <w:rPr>
-                                <w:sz w:val="30"/>
-                                <w:szCs w:val="30"/>
-                              </w:rPr>
-                            </w:pPr>
                             <w:r>
-                              <w:rPr>
-                                <w:sz w:val="30"/>
-                                <w:szCs w:val="30"/>
-                              </w:rPr>
-                              <w:t>Abbiamo poi una sezione dedicata all’utente dove possiamo visionare tutte le informazioni riguardo alle informazioni personali, i propri ordini e Download che possiamo effettuare di tutti I programmi di loro proprietà</w:t>
+                              <w:t xml:space="preserve">Abbiamo poi una sezione dedicata all’utente dove possiamo visionare tutte le informazioni riguardo alle informazioni personali, i propri ordini e Download che possiamo effettuare di tutti </w:t>
+                            </w:r>
+                            <w:r>
+                              <w:t>i</w:t>
+                            </w:r>
+                            <w:r>
+                              <w:t xml:space="preserve"> programmi di loro proprietà</w:t>
                             </w:r>
                           </w:p>
                         </w:txbxContent>
@@ -3490,22 +3009,18 @@
           </mc:Choice>
           <mc:Fallback>
             <w:pict>
-              <v:shape w14:anchorId="4C60BD46" id="_x0000_s1027" type="#_x0000_t202" style="position:absolute;margin-left:-67pt;margin-top:12.5pt;width:300pt;height:132pt;z-index:251690496;visibility:visible;mso-wrap-style:square;mso-width-percent:0;mso-height-percent:0;mso-wrap-distance-left:9pt;mso-wrap-distance-top:3.6pt;mso-wrap-distance-right:9pt;mso-wrap-distance-bottom:3.6pt;mso-position-horizontal:absolute;mso-position-horizontal-relative:text;mso-position-vertical:absolute;mso-position-vertical-relative:text;mso-width-percent:0;mso-height-percent:0;mso-width-relative:margin;mso-height-relative:margin;v-text-anchor:top" o:gfxdata="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" filled="f" strokecolor="black [3213]">
+              <v:shape w14:anchorId="4C60BD46" id="_x0000_s1027" type="#_x0000_t202" style="position:absolute;margin-left:-56.5pt;margin-top:37.85pt;width:226pt;height:94.6pt;z-index:251654144;visibility:visible;mso-wrap-style:square;mso-width-percent:0;mso-height-percent:0;mso-wrap-distance-left:9pt;mso-wrap-distance-top:3.6pt;mso-wrap-distance-right:9pt;mso-wrap-distance-bottom:3.6pt;mso-position-horizontal:absolute;mso-position-horizontal-relative:text;mso-position-vertical:absolute;mso-position-vertical-relative:text;mso-width-percent:0;mso-height-percent:0;mso-width-relative:margin;mso-height-relative:margin;v-text-anchor:top" o:gfxdata="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" filled="f" strokecolor="black [3213]">
                 <v:textbox>
                   <w:txbxContent>
                     <w:p>
-                      <w:pPr>
-                        <w:rPr>
-                          <w:sz w:val="30"/>
-                          <w:szCs w:val="30"/>
-                        </w:rPr>
-                      </w:pPr>
                       <w:r>
-                        <w:rPr>
-                          <w:sz w:val="30"/>
-                          <w:szCs w:val="30"/>
-                        </w:rPr>
-                        <w:t>Abbiamo poi una sezione dedicata all’utente dove possiamo visionare tutte le informazioni riguardo alle informazioni personali, i propri ordini e Download che possiamo effettuare di tutti I programmi di loro proprietà</w:t>
+                        <w:t xml:space="preserve">Abbiamo poi una sezione dedicata all’utente dove possiamo visionare tutte le informazioni riguardo alle informazioni personali, i propri ordini e Download che possiamo effettuare di tutti </w:t>
+                      </w:r>
+                      <w:r>
+                        <w:t>i</w:t>
+                      </w:r>
+                      <w:r>
+                        <w:t xml:space="preserve"> programmi di loro proprietà</w:t>
                       </w:r>
                     </w:p>
                   </w:txbxContent>
@@ -3516,40 +3031,23 @@
           </mc:Fallback>
         </mc:AlternateContent>
       </w:r>
-    </w:p>
-    <w:p>
-      <w:pPr>
-        <w:pStyle w:val="Titolo1"/>
-        <w:rPr>
-          <w:rFonts w:cstheme="majorHAnsi"/>
-          <w:lang w:val="it-IT"/>
-        </w:rPr>
-      </w:pPr>
-    </w:p>
-    <w:p>
-      <w:pPr>
-        <w:rPr>
-          <w:lang w:val="it-IT"/>
-        </w:rPr>
-      </w:pPr>
       <w:r>
         <w:rPr>
           <w:rFonts w:cstheme="majorHAnsi"/>
-          <w:lang w:val="it-IT"/>
         </w:rPr>
         <w:drawing>
-          <wp:anchor distT="0" distB="0" distL="114300" distR="114300" simplePos="0" relativeHeight="251697664" behindDoc="0" locked="0" layoutInCell="1" allowOverlap="1" wp14:anchorId="45FC5EF6" wp14:editId="426027C5">
+          <wp:anchor distT="0" distB="0" distL="114300" distR="114300" simplePos="0" relativeHeight="251688960" behindDoc="0" locked="0" layoutInCell="1" allowOverlap="1" wp14:anchorId="3B8D6B32" wp14:editId="1A5A7FC6">
             <wp:simplePos x="0" y="0"/>
             <wp:positionH relativeFrom="column">
-              <wp:posOffset>-69850</wp:posOffset>
+              <wp:posOffset>2992189</wp:posOffset>
             </wp:positionH>
             <wp:positionV relativeFrom="paragraph">
-              <wp:posOffset>161925</wp:posOffset>
+              <wp:posOffset>66321</wp:posOffset>
             </wp:positionV>
-            <wp:extent cx="3009900" cy="1592739"/>
-            <wp:effectExtent l="0" t="0" r="0" b="7620"/>
+            <wp:extent cx="3216664" cy="1733797"/>
+            <wp:effectExtent l="0" t="0" r="3175" b="0"/>
             <wp:wrapNone/>
-            <wp:docPr id="1316695409" name="Immagine 1"/>
+            <wp:docPr id="1918184158" name="Immagine 1"/>
             <wp:cNvGraphicFramePr>
               <a:graphicFrameLocks xmlns:a="http://schemas.openxmlformats.org/drawingml/2006/main" noChangeAspect="1"/>
             </wp:cNvGraphicFramePr>
@@ -3557,11 +3055,11 @@
               <a:graphicData uri="http://schemas.openxmlformats.org/drawingml/2006/picture">
                 <pic:pic xmlns:pic="http://schemas.openxmlformats.org/drawingml/2006/picture">
                   <pic:nvPicPr>
-                    <pic:cNvPr id="1316695409" name=""/>
+                    <pic:cNvPr id="1918184158" name=""/>
                     <pic:cNvPicPr/>
                   </pic:nvPicPr>
                   <pic:blipFill>
-                    <a:blip r:embed="rId23"/>
+                    <a:blip r:embed="rId19"/>
                     <a:stretch>
                       <a:fillRect/>
                     </a:stretch>
@@ -3569,7 +3067,7 @@
                   <pic:spPr>
                     <a:xfrm>
                       <a:off x="0" y="0"/>
-                      <a:ext cx="3009900" cy="1592739"/>
+                      <a:ext cx="3216664" cy="1733797"/>
                     </a:xfrm>
                     <a:prstGeom prst="rect">
                       <a:avLst/>
@@ -3593,120 +3091,34 @@
         <w:pStyle w:val="Titolo1"/>
         <w:rPr>
           <w:rFonts w:cstheme="majorHAnsi"/>
-          <w:lang w:val="it-IT"/>
+        </w:rPr>
+      </w:pPr>
+    </w:p>
+    <w:p/>
+    <w:p/>
+    <w:p>
+      <w:pPr>
+        <w:pStyle w:val="Titolo1"/>
+        <w:rPr>
+          <w:rFonts w:cstheme="majorHAnsi"/>
         </w:rPr>
       </w:pPr>
       <w:r>
         <w:rPr>
           <w:rFonts w:cstheme="majorHAnsi"/>
-          <w:lang w:val="it-IT"/>
         </w:rPr>
-        <w:drawing>
-          <wp:anchor distT="0" distB="0" distL="114300" distR="114300" simplePos="0" relativeHeight="251703808" behindDoc="0" locked="0" layoutInCell="1" allowOverlap="1" wp14:anchorId="3B8D6B32" wp14:editId="5C418703">
-            <wp:simplePos x="0" y="0"/>
-            <wp:positionH relativeFrom="column">
-              <wp:posOffset>-3879850</wp:posOffset>
-            </wp:positionH>
-            <wp:positionV relativeFrom="paragraph">
-              <wp:posOffset>442595</wp:posOffset>
-            </wp:positionV>
-            <wp:extent cx="4025900" cy="2169979"/>
-            <wp:effectExtent l="0" t="0" r="0" b="1905"/>
-            <wp:wrapNone/>
-            <wp:docPr id="1918184158" name="Immagine 1"/>
-            <wp:cNvGraphicFramePr>
-              <a:graphicFrameLocks xmlns:a="http://schemas.openxmlformats.org/drawingml/2006/main" noChangeAspect="1"/>
-            </wp:cNvGraphicFramePr>
-            <a:graphic xmlns:a="http://schemas.openxmlformats.org/drawingml/2006/main">
-              <a:graphicData uri="http://schemas.openxmlformats.org/drawingml/2006/picture">
-                <pic:pic xmlns:pic="http://schemas.openxmlformats.org/drawingml/2006/picture">
-                  <pic:nvPicPr>
-                    <pic:cNvPr id="1918184158" name=""/>
-                    <pic:cNvPicPr/>
-                  </pic:nvPicPr>
-                  <pic:blipFill>
-                    <a:blip r:embed="rId24"/>
-                    <a:stretch>
-                      <a:fillRect/>
-                    </a:stretch>
-                  </pic:blipFill>
-                  <pic:spPr>
-                    <a:xfrm>
-                      <a:off x="0" y="0"/>
-                      <a:ext cx="4025900" cy="2169979"/>
-                    </a:xfrm>
-                    <a:prstGeom prst="rect">
-                      <a:avLst/>
-                    </a:prstGeom>
-                  </pic:spPr>
-                </pic:pic>
-              </a:graphicData>
-            </a:graphic>
-            <wp14:sizeRelH relativeFrom="margin">
-              <wp14:pctWidth>0</wp14:pctWidth>
-            </wp14:sizeRelH>
-            <wp14:sizeRelV relativeFrom="margin">
-              <wp14:pctHeight>0</wp14:pctHeight>
-            </wp14:sizeRelV>
-          </wp:anchor>
-        </w:drawing>
-      </w:r>
-    </w:p>
-    <w:p>
-      <w:pPr>
-        <w:pStyle w:val="Titolo1"/>
-        <w:rPr>
-          <w:rFonts w:cstheme="majorHAnsi"/>
-          <w:lang w:val="it-IT"/>
-        </w:rPr>
-      </w:pPr>
-    </w:p>
-    <w:p>
-      <w:pPr>
-        <w:pStyle w:val="Titolo1"/>
-        <w:rPr>
-          <w:rFonts w:cstheme="majorHAnsi"/>
-          <w:lang w:val="it-IT"/>
-        </w:rPr>
-      </w:pPr>
-    </w:p>
-    <w:p>
-      <w:pPr>
-        <w:pStyle w:val="Titolo1"/>
-        <w:rPr>
-          <w:rFonts w:cstheme="majorHAnsi"/>
-          <w:lang w:val="it-IT"/>
-        </w:rPr>
-      </w:pPr>
-    </w:p>
-    <w:p>
-      <w:pPr>
-        <w:pStyle w:val="Titolo1"/>
-        <w:rPr>
-          <w:rFonts w:cstheme="majorHAnsi"/>
-          <w:lang w:val="it-IT"/>
-        </w:rPr>
-      </w:pPr>
-    </w:p>
-    <w:p>
-      <w:pPr>
-        <w:pStyle w:val="Titolo1"/>
-        <w:rPr>
-          <w:rFonts w:cstheme="majorHAnsi"/>
-          <w:lang w:val="it-IT"/>
-        </w:rPr>
-      </w:pPr>
-      <w:r>
-        <w:rPr>
-          <w:rFonts w:cstheme="majorHAnsi"/>
-          <w:lang w:val="it-IT"/>
-        </w:rPr>
+        <w:lastRenderedPageBreak/>
         <w:t>4. Funzionalità del sito</w:t>
       </w:r>
       <w:bookmarkEnd w:id="3"/>
     </w:p>
     <w:p>
       <w:pPr>
+        <w:pStyle w:val="Paragrafoelenco"/>
+        <w:numPr>
+          <w:ilvl w:val="0"/>
+          <w:numId w:val="17"/>
+        </w:numPr>
         <w:jc w:val="both"/>
         <w:rPr>
           <w:rFonts w:asciiTheme="majorHAnsi" w:hAnsiTheme="majorHAnsi" w:cstheme="majorHAnsi"/>
@@ -3717,20 +3129,175 @@
       <w:r>
         <w:rPr>
           <w:rFonts w:asciiTheme="majorHAnsi" w:hAnsiTheme="majorHAnsi" w:cstheme="majorHAnsi"/>
+          <w:b/>
+          <w:bCs/>
           <w:sz w:val="24"/>
           <w:szCs w:val="24"/>
-          <w:lang w:val="it-IT"/>
         </w:rPr>
-        <w:t xml:space="preserve">Una breve descrizione dei contenuti del sito e delle funzionalità a disposizione dell’utente (es. </w:t>
+        <w:t>Funzionalità lato utente non registrato</w:t>
       </w:r>
+    </w:p>
+    <w:p>
+      <w:pPr>
+        <w:pStyle w:val="Paragrafoelenco"/>
+        <w:jc w:val="both"/>
+        <w:rPr>
+          <w:rFonts w:asciiTheme="majorHAnsi" w:hAnsiTheme="majorHAnsi" w:cstheme="majorHAnsi"/>
+          <w:sz w:val="24"/>
+          <w:szCs w:val="24"/>
+        </w:rPr>
+      </w:pPr>
       <w:r>
         <w:rPr>
           <w:rFonts w:asciiTheme="majorHAnsi" w:hAnsiTheme="majorHAnsi" w:cstheme="majorHAnsi"/>
           <w:sz w:val="24"/>
           <w:szCs w:val="24"/>
         </w:rPr>
-        <w:t>Login, Gestione Profilo, Carrello, Pannello Admin, ecc.).</w:t>
+        <w:t>Un utente guest (non registrato) ha la possibilità di:</w:t>
       </w:r>
+    </w:p>
+    <w:p>
+      <w:pPr>
+        <w:pStyle w:val="Paragrafoelenco"/>
+        <w:numPr>
+          <w:ilvl w:val="0"/>
+          <w:numId w:val="19"/>
+        </w:numPr>
+        <w:jc w:val="both"/>
+        <w:rPr>
+          <w:rFonts w:asciiTheme="majorHAnsi" w:hAnsiTheme="majorHAnsi" w:cstheme="majorHAnsi"/>
+          <w:sz w:val="24"/>
+          <w:szCs w:val="24"/>
+        </w:rPr>
+      </w:pPr>
+    </w:p>
+    <w:p>
+      <w:pPr>
+        <w:pStyle w:val="Paragrafoelenco"/>
+        <w:numPr>
+          <w:ilvl w:val="0"/>
+          <w:numId w:val="17"/>
+        </w:numPr>
+        <w:jc w:val="both"/>
+        <w:rPr>
+          <w:rFonts w:asciiTheme="majorHAnsi" w:hAnsiTheme="majorHAnsi" w:cstheme="majorHAnsi"/>
+          <w:sz w:val="24"/>
+          <w:szCs w:val="24"/>
+        </w:rPr>
+      </w:pPr>
+      <w:r>
+        <w:rPr>
+          <w:rFonts w:asciiTheme="majorHAnsi" w:hAnsiTheme="majorHAnsi" w:cstheme="majorHAnsi"/>
+          <w:b/>
+          <w:bCs/>
+          <w:sz w:val="24"/>
+          <w:szCs w:val="24"/>
+        </w:rPr>
+        <w:t>Funzionalità lato utente registrato</w:t>
+      </w:r>
+    </w:p>
+    <w:p>
+      <w:pPr>
+        <w:pStyle w:val="Paragrafoelenco"/>
+        <w:jc w:val="both"/>
+        <w:rPr>
+          <w:rFonts w:asciiTheme="majorHAnsi" w:hAnsiTheme="majorHAnsi" w:cstheme="majorHAnsi"/>
+          <w:sz w:val="24"/>
+          <w:szCs w:val="24"/>
+        </w:rPr>
+      </w:pPr>
+      <w:r>
+        <w:rPr>
+          <w:rFonts w:asciiTheme="majorHAnsi" w:hAnsiTheme="majorHAnsi" w:cstheme="majorHAnsi"/>
+          <w:sz w:val="24"/>
+          <w:szCs w:val="24"/>
+        </w:rPr>
+        <w:t>Dopo aver effettuato la registrazione, l’utente avrà ulteriori funzionalità:</w:t>
+      </w:r>
+    </w:p>
+    <w:p>
+      <w:pPr>
+        <w:pStyle w:val="Paragrafoelenco"/>
+        <w:numPr>
+          <w:ilvl w:val="0"/>
+          <w:numId w:val="19"/>
+        </w:numPr>
+        <w:jc w:val="both"/>
+        <w:rPr>
+          <w:rFonts w:asciiTheme="majorHAnsi" w:hAnsiTheme="majorHAnsi" w:cstheme="majorHAnsi"/>
+          <w:sz w:val="24"/>
+          <w:szCs w:val="24"/>
+        </w:rPr>
+      </w:pPr>
+    </w:p>
+    <w:p>
+      <w:pPr>
+        <w:pStyle w:val="Paragrafoelenco"/>
+        <w:numPr>
+          <w:ilvl w:val="0"/>
+          <w:numId w:val="17"/>
+        </w:numPr>
+        <w:jc w:val="both"/>
+        <w:rPr>
+          <w:rFonts w:asciiTheme="majorHAnsi" w:hAnsiTheme="majorHAnsi" w:cstheme="majorHAnsi"/>
+          <w:sz w:val="24"/>
+          <w:szCs w:val="24"/>
+        </w:rPr>
+      </w:pPr>
+      <w:r>
+        <w:rPr>
+          <w:rFonts w:asciiTheme="majorHAnsi" w:hAnsiTheme="majorHAnsi" w:cstheme="majorHAnsi"/>
+          <w:b/>
+          <w:bCs/>
+          <w:sz w:val="24"/>
+          <w:szCs w:val="24"/>
+        </w:rPr>
+        <w:t xml:space="preserve">Funzionalità lato </w:t>
+      </w:r>
+      <w:r>
+        <w:rPr>
+          <w:rFonts w:asciiTheme="majorHAnsi" w:hAnsiTheme="majorHAnsi" w:cstheme="majorHAnsi"/>
+          <w:b/>
+          <w:bCs/>
+          <w:sz w:val="24"/>
+          <w:szCs w:val="24"/>
+        </w:rPr>
+        <w:t>amministratore</w:t>
+      </w:r>
+    </w:p>
+    <w:p>
+      <w:pPr>
+        <w:pStyle w:val="Paragrafoelenco"/>
+        <w:jc w:val="both"/>
+        <w:rPr>
+          <w:rFonts w:asciiTheme="majorHAnsi" w:hAnsiTheme="majorHAnsi" w:cstheme="majorHAnsi"/>
+          <w:sz w:val="24"/>
+          <w:szCs w:val="24"/>
+        </w:rPr>
+      </w:pPr>
+      <w:r>
+        <w:rPr>
+          <w:rFonts w:asciiTheme="majorHAnsi" w:hAnsiTheme="majorHAnsi" w:cstheme="majorHAnsi"/>
+          <w:sz w:val="24"/>
+          <w:szCs w:val="24"/>
+        </w:rPr>
+        <w:t>L’amministratore non è obbligato ad avere conoscenze di programmazione per usufruire del sito, l’interfaccia è pensata per offrire varie possibilità:</w:t>
+      </w:r>
+    </w:p>
+    <w:p>
+      <w:pPr>
+        <w:pStyle w:val="Paragrafoelenco"/>
+        <w:numPr>
+          <w:ilvl w:val="0"/>
+          <w:numId w:val="19"/>
+        </w:numPr>
+        <w:jc w:val="both"/>
+        <w:rPr>
+          <w:rFonts w:asciiTheme="majorHAnsi" w:hAnsiTheme="majorHAnsi" w:cstheme="majorHAnsi"/>
+          <w:sz w:val="24"/>
+          <w:szCs w:val="24"/>
+        </w:rPr>
+      </w:pPr>
     </w:p>
     <w:sectPr>
       <w:pgSz w:w="12240" w:h="15840"/>
@@ -4142,6 +3709,119 @@
     </w:lvl>
   </w:abstractNum>
   <w:abstractNum w:abstractNumId="11" w15:restartNumberingAfterBreak="0">
+    <w:nsid w:val="0F5158A7"/>
+    <w:multiLevelType w:val="hybridMultilevel"/>
+    <w:tmpl w:val="F7286816"/>
+    <w:lvl w:ilvl="0" w:tplc="04100005">
+      <w:start w:val="1"/>
+      <w:numFmt w:val="bullet"/>
+      <w:lvlText w:val=""/>
+      <w:lvlJc w:val="left"/>
+      <w:pPr>
+        <w:ind w:left="1440" w:hanging="360"/>
+      </w:pPr>
+      <w:rPr>
+        <w:rFonts w:ascii="Wingdings" w:hAnsi="Wingdings" w:hint="default"/>
+      </w:rPr>
+    </w:lvl>
+    <w:lvl w:ilvl="1" w:tplc="04100003" w:tentative="1">
+      <w:start w:val="1"/>
+      <w:numFmt w:val="bullet"/>
+      <w:lvlText w:val="o"/>
+      <w:lvlJc w:val="left"/>
+      <w:pPr>
+        <w:ind w:left="2160" w:hanging="360"/>
+      </w:pPr>
+      <w:rPr>
+        <w:rFonts w:ascii="Courier New" w:hAnsi="Courier New" w:cs="Courier New" w:hint="default"/>
+      </w:rPr>
+    </w:lvl>
+    <w:lvl w:ilvl="2" w:tplc="04100005" w:tentative="1">
+      <w:start w:val="1"/>
+      <w:numFmt w:val="bullet"/>
+      <w:lvlText w:val=""/>
+      <w:lvlJc w:val="left"/>
+      <w:pPr>
+        <w:ind w:left="2880" w:hanging="360"/>
+      </w:pPr>
+      <w:rPr>
+        <w:rFonts w:ascii="Wingdings" w:hAnsi="Wingdings" w:hint="default"/>
+      </w:rPr>
+    </w:lvl>
+    <w:lvl w:ilvl="3" w:tplc="04100001" w:tentative="1">
+      <w:start w:val="1"/>
+      <w:numFmt w:val="bullet"/>
+      <w:lvlText w:val=""/>
+      <w:lvlJc w:val="left"/>
+      <w:pPr>
+        <w:ind w:left="3600" w:hanging="360"/>
+      </w:pPr>
+      <w:rPr>
+        <w:rFonts w:ascii="Symbol" w:hAnsi="Symbol" w:hint="default"/>
+      </w:rPr>
+    </w:lvl>
+    <w:lvl w:ilvl="4" w:tplc="04100003" w:tentative="1">
+      <w:start w:val="1"/>
+      <w:numFmt w:val="bullet"/>
+      <w:lvlText w:val="o"/>
+      <w:lvlJc w:val="left"/>
+      <w:pPr>
+        <w:ind w:left="4320" w:hanging="360"/>
+      </w:pPr>
+      <w:rPr>
+        <w:rFonts w:ascii="Courier New" w:hAnsi="Courier New" w:cs="Courier New" w:hint="default"/>
+      </w:rPr>
+    </w:lvl>
+    <w:lvl w:ilvl="5" w:tplc="04100005" w:tentative="1">
+      <w:start w:val="1"/>
+      <w:numFmt w:val="bullet"/>
+      <w:lvlText w:val=""/>
+      <w:lvlJc w:val="left"/>
+      <w:pPr>
+        <w:ind w:left="5040" w:hanging="360"/>
+      </w:pPr>
+      <w:rPr>
+        <w:rFonts w:ascii="Wingdings" w:hAnsi="Wingdings" w:hint="default"/>
+      </w:rPr>
+    </w:lvl>
+    <w:lvl w:ilvl="6" w:tplc="04100001" w:tentative="1">
+      <w:start w:val="1"/>
+      <w:numFmt w:val="bullet"/>
+      <w:lvlText w:val=""/>
+      <w:lvlJc w:val="left"/>
+      <w:pPr>
+        <w:ind w:left="5760" w:hanging="360"/>
+      </w:pPr>
+      <w:rPr>
+        <w:rFonts w:ascii="Symbol" w:hAnsi="Symbol" w:hint="default"/>
+      </w:rPr>
+    </w:lvl>
+    <w:lvl w:ilvl="7" w:tplc="04100003" w:tentative="1">
+      <w:start w:val="1"/>
+      <w:numFmt w:val="bullet"/>
+      <w:lvlText w:val="o"/>
+      <w:lvlJc w:val="left"/>
+      <w:pPr>
+        <w:ind w:left="6480" w:hanging="360"/>
+      </w:pPr>
+      <w:rPr>
+        <w:rFonts w:ascii="Courier New" w:hAnsi="Courier New" w:cs="Courier New" w:hint="default"/>
+      </w:rPr>
+    </w:lvl>
+    <w:lvl w:ilvl="8" w:tplc="04100005" w:tentative="1">
+      <w:start w:val="1"/>
+      <w:numFmt w:val="bullet"/>
+      <w:lvlText w:val=""/>
+      <w:lvlJc w:val="left"/>
+      <w:pPr>
+        <w:ind w:left="7200" w:hanging="360"/>
+      </w:pPr>
+      <w:rPr>
+        <w:rFonts w:ascii="Wingdings" w:hAnsi="Wingdings" w:hint="default"/>
+      </w:rPr>
+    </w:lvl>
+  </w:abstractNum>
+  <w:abstractNum w:abstractNumId="12" w15:restartNumberingAfterBreak="0">
     <w:nsid w:val="1D2C5388"/>
     <w:multiLevelType w:val="hybridMultilevel"/>
     <w:tmpl w:val="94D8AEB6"/>
@@ -4254,7 +3934,7 @@
       </w:rPr>
     </w:lvl>
   </w:abstractNum>
-  <w:abstractNum w:abstractNumId="12" w15:restartNumberingAfterBreak="0">
+  <w:abstractNum w:abstractNumId="13" w15:restartNumberingAfterBreak="0">
     <w:nsid w:val="3C845743"/>
     <w:multiLevelType w:val="hybridMultilevel"/>
     <w:tmpl w:val="ECBC70FE"/>
@@ -4367,7 +4047,120 @@
       </w:rPr>
     </w:lvl>
   </w:abstractNum>
-  <w:abstractNum w:abstractNumId="13" w15:restartNumberingAfterBreak="0">
+  <w:abstractNum w:abstractNumId="14" w15:restartNumberingAfterBreak="0">
+    <w:nsid w:val="4B3F6D7E"/>
+    <w:multiLevelType w:val="hybridMultilevel"/>
+    <w:tmpl w:val="91C6E816"/>
+    <w:lvl w:ilvl="0" w:tplc="04100001">
+      <w:start w:val="1"/>
+      <w:numFmt w:val="bullet"/>
+      <w:lvlText w:val=""/>
+      <w:lvlJc w:val="left"/>
+      <w:pPr>
+        <w:ind w:left="720" w:hanging="360"/>
+      </w:pPr>
+      <w:rPr>
+        <w:rFonts w:ascii="Symbol" w:hAnsi="Symbol" w:hint="default"/>
+      </w:rPr>
+    </w:lvl>
+    <w:lvl w:ilvl="1" w:tplc="04100003" w:tentative="1">
+      <w:start w:val="1"/>
+      <w:numFmt w:val="bullet"/>
+      <w:lvlText w:val="o"/>
+      <w:lvlJc w:val="left"/>
+      <w:pPr>
+        <w:ind w:left="1440" w:hanging="360"/>
+      </w:pPr>
+      <w:rPr>
+        <w:rFonts w:ascii="Courier New" w:hAnsi="Courier New" w:cs="Courier New" w:hint="default"/>
+      </w:rPr>
+    </w:lvl>
+    <w:lvl w:ilvl="2" w:tplc="04100005" w:tentative="1">
+      <w:start w:val="1"/>
+      <w:numFmt w:val="bullet"/>
+      <w:lvlText w:val=""/>
+      <w:lvlJc w:val="left"/>
+      <w:pPr>
+        <w:ind w:left="2160" w:hanging="360"/>
+      </w:pPr>
+      <w:rPr>
+        <w:rFonts w:ascii="Wingdings" w:hAnsi="Wingdings" w:hint="default"/>
+      </w:rPr>
+    </w:lvl>
+    <w:lvl w:ilvl="3" w:tplc="04100001" w:tentative="1">
+      <w:start w:val="1"/>
+      <w:numFmt w:val="bullet"/>
+      <w:lvlText w:val=""/>
+      <w:lvlJc w:val="left"/>
+      <w:pPr>
+        <w:ind w:left="2880" w:hanging="360"/>
+      </w:pPr>
+      <w:rPr>
+        <w:rFonts w:ascii="Symbol" w:hAnsi="Symbol" w:hint="default"/>
+      </w:rPr>
+    </w:lvl>
+    <w:lvl w:ilvl="4" w:tplc="04100003" w:tentative="1">
+      <w:start w:val="1"/>
+      <w:numFmt w:val="bullet"/>
+      <w:lvlText w:val="o"/>
+      <w:lvlJc w:val="left"/>
+      <w:pPr>
+        <w:ind w:left="3600" w:hanging="360"/>
+      </w:pPr>
+      <w:rPr>
+        <w:rFonts w:ascii="Courier New" w:hAnsi="Courier New" w:cs="Courier New" w:hint="default"/>
+      </w:rPr>
+    </w:lvl>
+    <w:lvl w:ilvl="5" w:tplc="04100005" w:tentative="1">
+      <w:start w:val="1"/>
+      <w:numFmt w:val="bullet"/>
+      <w:lvlText w:val=""/>
+      <w:lvlJc w:val="left"/>
+      <w:pPr>
+        <w:ind w:left="4320" w:hanging="360"/>
+      </w:pPr>
+      <w:rPr>
+        <w:rFonts w:ascii="Wingdings" w:hAnsi="Wingdings" w:hint="default"/>
+      </w:rPr>
+    </w:lvl>
+    <w:lvl w:ilvl="6" w:tplc="04100001" w:tentative="1">
+      <w:start w:val="1"/>
+      <w:numFmt w:val="bullet"/>
+      <w:lvlText w:val=""/>
+      <w:lvlJc w:val="left"/>
+      <w:pPr>
+        <w:ind w:left="5040" w:hanging="360"/>
+      </w:pPr>
+      <w:rPr>
+        <w:rFonts w:ascii="Symbol" w:hAnsi="Symbol" w:hint="default"/>
+      </w:rPr>
+    </w:lvl>
+    <w:lvl w:ilvl="7" w:tplc="04100003" w:tentative="1">
+      <w:start w:val="1"/>
+      <w:numFmt w:val="bullet"/>
+      <w:lvlText w:val="o"/>
+      <w:lvlJc w:val="left"/>
+      <w:pPr>
+        <w:ind w:left="5760" w:hanging="360"/>
+      </w:pPr>
+      <w:rPr>
+        <w:rFonts w:ascii="Courier New" w:hAnsi="Courier New" w:cs="Courier New" w:hint="default"/>
+      </w:rPr>
+    </w:lvl>
+    <w:lvl w:ilvl="8" w:tplc="04100005" w:tentative="1">
+      <w:start w:val="1"/>
+      <w:numFmt w:val="bullet"/>
+      <w:lvlText w:val=""/>
+      <w:lvlJc w:val="left"/>
+      <w:pPr>
+        <w:ind w:left="6480" w:hanging="360"/>
+      </w:pPr>
+      <w:rPr>
+        <w:rFonts w:ascii="Wingdings" w:hAnsi="Wingdings" w:hint="default"/>
+      </w:rPr>
+    </w:lvl>
+  </w:abstractNum>
+  <w:abstractNum w:abstractNumId="15" w15:restartNumberingAfterBreak="0">
     <w:nsid w:val="5982281E"/>
     <w:multiLevelType w:val="hybridMultilevel"/>
     <w:tmpl w:val="6106A296"/>
@@ -4480,7 +4273,120 @@
       </w:rPr>
     </w:lvl>
   </w:abstractNum>
-  <w:abstractNum w:abstractNumId="14" w15:restartNumberingAfterBreak="0">
+  <w:abstractNum w:abstractNumId="16" w15:restartNumberingAfterBreak="0">
+    <w:nsid w:val="5EB168DC"/>
+    <w:multiLevelType w:val="hybridMultilevel"/>
+    <w:tmpl w:val="285C96F4"/>
+    <w:lvl w:ilvl="0" w:tplc="04100005">
+      <w:start w:val="1"/>
+      <w:numFmt w:val="bullet"/>
+      <w:lvlText w:val=""/>
+      <w:lvlJc w:val="left"/>
+      <w:pPr>
+        <w:ind w:left="1440" w:hanging="360"/>
+      </w:pPr>
+      <w:rPr>
+        <w:rFonts w:ascii="Wingdings" w:hAnsi="Wingdings" w:hint="default"/>
+      </w:rPr>
+    </w:lvl>
+    <w:lvl w:ilvl="1" w:tplc="04100003" w:tentative="1">
+      <w:start w:val="1"/>
+      <w:numFmt w:val="bullet"/>
+      <w:lvlText w:val="o"/>
+      <w:lvlJc w:val="left"/>
+      <w:pPr>
+        <w:ind w:left="2160" w:hanging="360"/>
+      </w:pPr>
+      <w:rPr>
+        <w:rFonts w:ascii="Courier New" w:hAnsi="Courier New" w:cs="Courier New" w:hint="default"/>
+      </w:rPr>
+    </w:lvl>
+    <w:lvl w:ilvl="2" w:tplc="04100005" w:tentative="1">
+      <w:start w:val="1"/>
+      <w:numFmt w:val="bullet"/>
+      <w:lvlText w:val=""/>
+      <w:lvlJc w:val="left"/>
+      <w:pPr>
+        <w:ind w:left="2880" w:hanging="360"/>
+      </w:pPr>
+      <w:rPr>
+        <w:rFonts w:ascii="Wingdings" w:hAnsi="Wingdings" w:hint="default"/>
+      </w:rPr>
+    </w:lvl>
+    <w:lvl w:ilvl="3" w:tplc="04100001" w:tentative="1">
+      <w:start w:val="1"/>
+      <w:numFmt w:val="bullet"/>
+      <w:lvlText w:val=""/>
+      <w:lvlJc w:val="left"/>
+      <w:pPr>
+        <w:ind w:left="3600" w:hanging="360"/>
+      </w:pPr>
+      <w:rPr>
+        <w:rFonts w:ascii="Symbol" w:hAnsi="Symbol" w:hint="default"/>
+      </w:rPr>
+    </w:lvl>
+    <w:lvl w:ilvl="4" w:tplc="04100003" w:tentative="1">
+      <w:start w:val="1"/>
+      <w:numFmt w:val="bullet"/>
+      <w:lvlText w:val="o"/>
+      <w:lvlJc w:val="left"/>
+      <w:pPr>
+        <w:ind w:left="4320" w:hanging="360"/>
+      </w:pPr>
+      <w:rPr>
+        <w:rFonts w:ascii="Courier New" w:hAnsi="Courier New" w:cs="Courier New" w:hint="default"/>
+      </w:rPr>
+    </w:lvl>
+    <w:lvl w:ilvl="5" w:tplc="04100005" w:tentative="1">
+      <w:start w:val="1"/>
+      <w:numFmt w:val="bullet"/>
+      <w:lvlText w:val=""/>
+      <w:lvlJc w:val="left"/>
+      <w:pPr>
+        <w:ind w:left="5040" w:hanging="360"/>
+      </w:pPr>
+      <w:rPr>
+        <w:rFonts w:ascii="Wingdings" w:hAnsi="Wingdings" w:hint="default"/>
+      </w:rPr>
+    </w:lvl>
+    <w:lvl w:ilvl="6" w:tplc="04100001" w:tentative="1">
+      <w:start w:val="1"/>
+      <w:numFmt w:val="bullet"/>
+      <w:lvlText w:val=""/>
+      <w:lvlJc w:val="left"/>
+      <w:pPr>
+        <w:ind w:left="5760" w:hanging="360"/>
+      </w:pPr>
+      <w:rPr>
+        <w:rFonts w:ascii="Symbol" w:hAnsi="Symbol" w:hint="default"/>
+      </w:rPr>
+    </w:lvl>
+    <w:lvl w:ilvl="7" w:tplc="04100003" w:tentative="1">
+      <w:start w:val="1"/>
+      <w:numFmt w:val="bullet"/>
+      <w:lvlText w:val="o"/>
+      <w:lvlJc w:val="left"/>
+      <w:pPr>
+        <w:ind w:left="6480" w:hanging="360"/>
+      </w:pPr>
+      <w:rPr>
+        <w:rFonts w:ascii="Courier New" w:hAnsi="Courier New" w:cs="Courier New" w:hint="default"/>
+      </w:rPr>
+    </w:lvl>
+    <w:lvl w:ilvl="8" w:tplc="04100005" w:tentative="1">
+      <w:start w:val="1"/>
+      <w:numFmt w:val="bullet"/>
+      <w:lvlText w:val=""/>
+      <w:lvlJc w:val="left"/>
+      <w:pPr>
+        <w:ind w:left="7200" w:hanging="360"/>
+      </w:pPr>
+      <w:rPr>
+        <w:rFonts w:ascii="Wingdings" w:hAnsi="Wingdings" w:hint="default"/>
+      </w:rPr>
+    </w:lvl>
+  </w:abstractNum>
+  <w:abstractNum w:abstractNumId="17" w15:restartNumberingAfterBreak="0">
     <w:nsid w:val="647D5542"/>
     <w:multiLevelType w:val="hybridMultilevel"/>
     <w:tmpl w:val="9132B34E"/>
@@ -4593,7 +4499,7 @@
       </w:rPr>
     </w:lvl>
   </w:abstractNum>
-  <w:abstractNum w:abstractNumId="15" w15:restartNumberingAfterBreak="0">
+  <w:abstractNum w:abstractNumId="18" w15:restartNumberingAfterBreak="0">
     <w:nsid w:val="7FCB7581"/>
     <w:multiLevelType w:val="hybridMultilevel"/>
     <w:tmpl w:val="3CF6F812"/>
@@ -4734,25 +4640,34 @@
     <w:abstractNumId w:val="0"/>
   </w:num>
   <w:num w:numId="10" w16cid:durableId="1561818248">
+    <w:abstractNumId w:val="15"/>
+  </w:num>
+  <w:num w:numId="11" w16cid:durableId="1860503072">
+    <w:abstractNumId w:val="12"/>
+  </w:num>
+  <w:num w:numId="12" w16cid:durableId="667244565">
+    <w:abstractNumId w:val="17"/>
+  </w:num>
+  <w:num w:numId="13" w16cid:durableId="47456666">
     <w:abstractNumId w:val="13"/>
   </w:num>
-  <w:num w:numId="11" w16cid:durableId="1860503072">
-    <w:abstractNumId w:val="11"/>
-  </w:num>
-  <w:num w:numId="12" w16cid:durableId="667244565">
-    <w:abstractNumId w:val="14"/>
-  </w:num>
-  <w:num w:numId="13" w16cid:durableId="47456666">
-    <w:abstractNumId w:val="12"/>
-  </w:num>
   <w:num w:numId="14" w16cid:durableId="746269538">
-    <w:abstractNumId w:val="15"/>
+    <w:abstractNumId w:val="18"/>
   </w:num>
   <w:num w:numId="15" w16cid:durableId="441463907">
     <w:abstractNumId w:val="9"/>
   </w:num>
   <w:num w:numId="16" w16cid:durableId="792863499">
     <w:abstractNumId w:val="10"/>
+  </w:num>
+  <w:num w:numId="17" w16cid:durableId="1406101138">
+    <w:abstractNumId w:val="14"/>
+  </w:num>
+  <w:num w:numId="18" w16cid:durableId="911159074">
+    <w:abstractNumId w:val="16"/>
+  </w:num>
+  <w:num w:numId="19" w16cid:durableId="970015615">
+    <w:abstractNumId w:val="11"/>
   </w:num>
 </w:numbering>
 </file>
@@ -5149,6 +5064,7 @@
     <w:rsid w:val="00FC693F"/>
     <w:rPr>
       <w:rFonts w:ascii="Calibri" w:hAnsi="Calibri"/>
+      <w:lang w:val="it-IT"/>
     </w:rPr>
   </w:style>
   <w:style w:type="paragraph" w:styleId="Titolo1">
@@ -5363,6 +5279,7 @@
   <w:style w:type="character" w:default="1" w:styleId="Carpredefinitoparagrafo">
     <w:name w:val="Default Paragraph Font"/>
     <w:uiPriority w:val="1"/>
+    <w:semiHidden/>
     <w:unhideWhenUsed/>
   </w:style>
   <w:style w:type="table" w:default="1" w:styleId="Tabellanormale">

</xml_diff>

<commit_message>
Aggiunta file di S.A.
</commit_message>
<xml_diff>
--- a/Saendwave_Project_Proposal.docx
+++ b/Saendwave_Project_Proposal.docx
@@ -240,8 +240,19 @@
           <w:sz w:val="44"/>
           <w:szCs w:val="44"/>
         </w:rPr>
-        <w:t>Project Proposal</w:t>
+        <w:t xml:space="preserve">Project </w:t>
       </w:r>
+      <w:proofErr w:type="spellStart"/>
+      <w:r>
+        <w:rPr>
+          <w:rFonts w:asciiTheme="majorHAnsi" w:hAnsiTheme="majorHAnsi" w:cstheme="majorHAnsi"/>
+          <w:i/>
+          <w:sz w:val="44"/>
+          <w:szCs w:val="44"/>
+        </w:rPr>
+        <w:t>Proposal</w:t>
+      </w:r>
+      <w:proofErr w:type="spellEnd"/>
       <w:r>
         <w:rPr>
           <w:rFonts w:asciiTheme="majorHAnsi" w:hAnsiTheme="majorHAnsi" w:cstheme="majorHAnsi"/>
@@ -908,8 +919,18 @@
           <w:sz w:val="24"/>
           <w:szCs w:val="24"/>
         </w:rPr>
-        <w:t>Titolo del progetto: Sændwave</w:t>
+        <w:t xml:space="preserve">Titolo del progetto: </w:t>
       </w:r>
+      <w:proofErr w:type="spellStart"/>
+      <w:r>
+        <w:rPr>
+          <w:rFonts w:asciiTheme="majorHAnsi" w:hAnsiTheme="majorHAnsi" w:cstheme="majorHAnsi"/>
+          <w:sz w:val="24"/>
+          <w:szCs w:val="24"/>
+        </w:rPr>
+        <w:t>Sændwave</w:t>
+      </w:r>
+      <w:proofErr w:type="spellEnd"/>
     </w:p>
     <w:p>
       <w:pPr>
@@ -1051,6 +1072,7 @@
           <w:szCs w:val="24"/>
         </w:rPr>
       </w:pPr>
+      <w:proofErr w:type="spellStart"/>
       <w:r>
         <w:rPr>
           <w:rFonts w:asciiTheme="majorHAnsi" w:hAnsiTheme="majorHAnsi" w:cstheme="majorHAnsi"/>
@@ -1058,7 +1080,17 @@
           <w:sz w:val="24"/>
           <w:szCs w:val="24"/>
         </w:rPr>
-        <w:t xml:space="preserve">Sændwave </w:t>
+        <w:t>Sændwave</w:t>
+      </w:r>
+      <w:proofErr w:type="spellEnd"/>
+      <w:r>
+        <w:rPr>
+          <w:rFonts w:asciiTheme="majorHAnsi" w:hAnsiTheme="majorHAnsi" w:cstheme="majorHAnsi"/>
+          <w:iCs/>
+          <w:sz w:val="24"/>
+          <w:szCs w:val="24"/>
+        </w:rPr>
+        <w:t xml:space="preserve"> </w:t>
       </w:r>
       <w:r>
         <w:rPr>
@@ -1144,6 +1176,7 @@
           <w:szCs w:val="26"/>
         </w:rPr>
       </w:pPr>
+      <w:proofErr w:type="spellStart"/>
       <w:r>
         <w:rPr>
           <w:b/>
@@ -1153,6 +1186,7 @@
         </w:rPr>
         <w:t>SoundBetter</w:t>
       </w:r>
+      <w:proofErr w:type="spellEnd"/>
       <w:r>
         <w:rPr>
           <w:b/>
@@ -1171,8 +1205,64 @@
             <w:sz w:val="26"/>
             <w:szCs w:val="26"/>
           </w:rPr>
-          <w:t>Hire Mixing &amp; Mastering Engineers, Producers, Singers &amp; Songwriters | SoundBetter</w:t>
+          <w:t xml:space="preserve">Hire Mixing &amp; Mastering </w:t>
         </w:r>
+        <w:proofErr w:type="spellStart"/>
+        <w:r>
+          <w:rPr>
+            <w:rStyle w:val="Collegamentoipertestuale"/>
+            <w:b/>
+            <w:bCs/>
+            <w:sz w:val="26"/>
+            <w:szCs w:val="26"/>
+          </w:rPr>
+          <w:t>Engineers</w:t>
+        </w:r>
+        <w:proofErr w:type="spellEnd"/>
+        <w:r>
+          <w:rPr>
+            <w:rStyle w:val="Collegamentoipertestuale"/>
+            <w:b/>
+            <w:bCs/>
+            <w:sz w:val="26"/>
+            <w:szCs w:val="26"/>
+          </w:rPr>
+          <w:t xml:space="preserve">, Producers, </w:t>
+        </w:r>
+        <w:proofErr w:type="spellStart"/>
+        <w:r>
+          <w:rPr>
+            <w:rStyle w:val="Collegamentoipertestuale"/>
+            <w:b/>
+            <w:bCs/>
+            <w:sz w:val="26"/>
+            <w:szCs w:val="26"/>
+          </w:rPr>
+          <w:t>Singers</w:t>
+        </w:r>
+        <w:proofErr w:type="spellEnd"/>
+        <w:r>
+          <w:rPr>
+            <w:rStyle w:val="Collegamentoipertestuale"/>
+            <w:b/>
+            <w:bCs/>
+            <w:sz w:val="26"/>
+            <w:szCs w:val="26"/>
+          </w:rPr>
+          <w:t xml:space="preserve"> &amp; Songwriters | </w:t>
+        </w:r>
+        <w:proofErr w:type="spellStart"/>
+        <w:r>
+          <w:rPr>
+            <w:rStyle w:val="Collegamentoipertestuale"/>
+            <w:b/>
+            <w:bCs/>
+            <w:sz w:val="26"/>
+            <w:szCs w:val="26"/>
+          </w:rPr>
+          <w:t>SoundBetter</w:t>
+        </w:r>
+        <w:proofErr w:type="spellEnd"/>
       </w:hyperlink>
       <w:r>
         <w:rPr>
@@ -1199,8 +1289,13 @@
       <w:pPr>
         <w:pStyle w:val="Paragrafoelenco"/>
       </w:pPr>
+      <w:proofErr w:type="spellStart"/>
       <w:r>
-        <w:t xml:space="preserve">SoundBetter è un sito inglese che permette di contattare e assumere figure professionali, le quali si appoggiano al sito usandolo come vetrina per i loro lavori. Il sito presenta un banner centrale che permette velocemente di cercare un professionista, creare un proprio progetto senza appoggiarsi ad un professionista specifico e collegamento ad un video introduttivo che presenta </w:t>
+        <w:t>SoundBetter</w:t>
+      </w:r>
+      <w:proofErr w:type="spellEnd"/>
+      <w:r>
+        <w:t xml:space="preserve"> è un sito inglese che permette di contattare e assumere figure professionali, le quali si appoggiano al sito usandolo come vetrina per i loro lavori. Il sito presenta un banner centrale che permette velocemente di cercare un professionista, creare un proprio progetto senza appoggiarsi ad un professionista specifico e collegamento ad un video introduttivo che presenta </w:t>
       </w:r>
       <w:r>
         <w:t>alcuni</w:t>
@@ -1702,6 +1797,7 @@
           <w:szCs w:val="26"/>
         </w:rPr>
       </w:pPr>
+      <w:proofErr w:type="spellStart"/>
       <w:r>
         <w:rPr>
           <w:b/>
@@ -1709,20 +1805,9 @@
           <w:sz w:val="26"/>
           <w:szCs w:val="26"/>
         </w:rPr>
-        <w:t>Fiverr (</w:t>
+        <w:t>Fiverr</w:t>
       </w:r>
-      <w:hyperlink r:id="rId12" w:history="1">
-        <w:r>
-          <w:rPr>
-            <w:rStyle w:val="Collegamentoipertestuale"/>
-            <w:b/>
-            <w:bCs/>
-            <w:sz w:val="26"/>
-            <w:szCs w:val="26"/>
-          </w:rPr>
-          <w:t>Fiverr | Marketplace di servizi freelance | Trova i migliori talenti globali</w:t>
-        </w:r>
-      </w:hyperlink>
+      <w:proofErr w:type="spellEnd"/>
       <w:r>
         <w:rPr>
           <w:b/>
@@ -1730,6 +1815,49 @@
           <w:sz w:val="26"/>
           <w:szCs w:val="26"/>
         </w:rPr>
+        <w:t xml:space="preserve"> (</w:t>
+      </w:r>
+      <w:proofErr w:type="spellStart"/>
+      <w:r>
+        <w:fldChar w:fldCharType="begin"/>
+      </w:r>
+      <w:r>
+        <w:instrText>HYPERLINK "https://it.fiverr.com/"</w:instrText>
+      </w:r>
+      <w:r>
+        <w:fldChar w:fldCharType="separate"/>
+      </w:r>
+      <w:r>
+        <w:rPr>
+          <w:rStyle w:val="Collegamentoipertestuale"/>
+          <w:b/>
+          <w:bCs/>
+          <w:sz w:val="26"/>
+          <w:szCs w:val="26"/>
+        </w:rPr>
+        <w:t>Fiverr</w:t>
+      </w:r>
+      <w:proofErr w:type="spellEnd"/>
+      <w:r>
+        <w:rPr>
+          <w:rStyle w:val="Collegamentoipertestuale"/>
+          <w:b/>
+          <w:bCs/>
+          <w:sz w:val="26"/>
+          <w:szCs w:val="26"/>
+        </w:rPr>
+        <w:t xml:space="preserve"> | Marketplace di servizi freelance | Trova i migliori talenti globali</w:t>
+      </w:r>
+      <w:r>
+        <w:fldChar w:fldCharType="end"/>
+      </w:r>
+      <w:r>
+        <w:rPr>
+          <w:b/>
+          <w:bCs/>
+          <w:sz w:val="26"/>
+          <w:szCs w:val="26"/>
+        </w:rPr>
         <w:t>)</w:t>
       </w:r>
     </w:p>
@@ -1737,6 +1865,7 @@
       <w:pPr>
         <w:pStyle w:val="Paragrafoelenco"/>
       </w:pPr>
+      <w:proofErr w:type="spellStart"/>
       <w:r>
         <w:t>Five</w:t>
       </w:r>
@@ -1744,7 +1873,11 @@
         <w:t>r</w:t>
       </w:r>
       <w:r>
-        <w:t xml:space="preserve">r è un sito internazionale che offre servizi di freelance in diversi ambiti. </w:t>
+        <w:t>r</w:t>
+      </w:r>
+      <w:proofErr w:type="spellEnd"/>
+      <w:r>
+        <w:t xml:space="preserve"> è un sito internazionale che offre servizi di freelance in diversi ambiti. </w:t>
       </w:r>
     </w:p>
     <w:p>
@@ -1752,13 +1885,21 @@
         <w:pStyle w:val="Paragrafoelenco"/>
       </w:pPr>
       <w:r>
-        <w:t>Ciò che richiama l’attenzione è il banner centrale che promuove le categorie popolari o in evidenza. Sulla parte superiore troviamo una barra di ricerca e le categorie, affiancati dalle sezioni per l’accesso. Sotto il testo di benvenuto ci sono due opzioni: una permette di generare un brief con l’AI, l’altra di scaricare l’app di Five</w:t>
+        <w:t xml:space="preserve">Ciò che richiama l’attenzione è il banner centrale che promuove le categorie popolari o in evidenza. Sulla parte superiore troviamo una barra di ricerca e le categorie, affiancati dalle sezioni per l’accesso. Sotto il testo di benvenuto ci sono due opzioni: una permette di generare un brief con l’AI, l’altra di scaricare l’app di </w:t>
+      </w:r>
+      <w:proofErr w:type="spellStart"/>
+      <w:r>
+        <w:t>Five</w:t>
       </w:r>
       <w:r>
         <w:t>r</w:t>
       </w:r>
       <w:r>
-        <w:t>r.</w:t>
+        <w:t>r</w:t>
+      </w:r>
+      <w:proofErr w:type="spellEnd"/>
+      <w:r>
+        <w:t>.</w:t>
       </w:r>
       <w:r>
         <w:t xml:space="preserve"> Dopo si possono esplorare i consigliati in cui vengono mostrati i video delle persone che offrono i loro servizi</w:t>
@@ -1797,7 +1938,7 @@
                     </pic:cNvPicPr>
                   </pic:nvPicPr>
                   <pic:blipFill>
-                    <a:blip r:embed="rId13">
+                    <a:blip r:embed="rId12">
                       <a:extLst>
                         <a:ext uri="{28A0092B-C50C-407E-A947-70E740481C1C}">
                           <a14:useLocalDpi xmlns:a14="http://schemas.microsoft.com/office/drawing/2010/main" val="0"/>
@@ -1892,7 +2033,7 @@
                     </pic:cNvPicPr>
                   </pic:nvPicPr>
                   <pic:blipFill>
-                    <a:blip r:embed="rId14">
+                    <a:blip r:embed="rId13">
                       <a:extLst>
                         <a:ext uri="{28A0092B-C50C-407E-A947-70E740481C1C}">
                           <a14:useLocalDpi xmlns:a14="http://schemas.microsoft.com/office/drawing/2010/main" val="0"/>
@@ -1969,7 +2110,7 @@
                     </pic:cNvPicPr>
                   </pic:nvPicPr>
                   <pic:blipFill>
-                    <a:blip r:embed="rId15">
+                    <a:blip r:embed="rId14">
                       <a:extLst>
                         <a:ext uri="{28A0092B-C50C-407E-A947-70E740481C1C}">
                           <a14:useLocalDpi xmlns:a14="http://schemas.microsoft.com/office/drawing/2010/main" val="0"/>
@@ -2067,7 +2208,7 @@
                     </pic:cNvPicPr>
                   </pic:nvPicPr>
                   <pic:blipFill>
-                    <a:blip r:embed="rId16">
+                    <a:blip r:embed="rId15">
                       <a:extLst>
                         <a:ext uri="{28A0092B-C50C-407E-A947-70E740481C1C}">
                           <a14:useLocalDpi xmlns:a14="http://schemas.microsoft.com/office/drawing/2010/main" val="0"/>
@@ -2210,6 +2351,7 @@
           <w:szCs w:val="26"/>
         </w:rPr>
       </w:pPr>
+      <w:proofErr w:type="spellStart"/>
       <w:r>
         <w:rPr>
           <w:b/>
@@ -2238,6 +2380,7 @@
         </w:rPr>
         <w:t>l</w:t>
       </w:r>
+      <w:proofErr w:type="spellEnd"/>
       <w:r>
         <w:rPr>
           <w:sz w:val="26"/>
@@ -2245,16 +2388,72 @@
         </w:rPr>
         <w:t xml:space="preserve"> (</w:t>
       </w:r>
-      <w:hyperlink r:id="rId17" w:history="1">
-        <w:r>
-          <w:rPr>
-            <w:rStyle w:val="Collegamentoipertestuale"/>
-            <w:sz w:val="26"/>
-            <w:szCs w:val="26"/>
-          </w:rPr>
-          <w:t>Neural DSP - Algorithmically Perfect - Neural DSP</w:t>
-        </w:r>
-      </w:hyperlink>
+      <w:proofErr w:type="spellStart"/>
+      <w:r>
+        <w:fldChar w:fldCharType="begin"/>
+      </w:r>
+      <w:r>
+        <w:instrText>HYPERLINK "https://neuraldsp.com/"</w:instrText>
+      </w:r>
+      <w:r>
+        <w:fldChar w:fldCharType="separate"/>
+      </w:r>
+      <w:r>
+        <w:rPr>
+          <w:rStyle w:val="Collegamentoipertestuale"/>
+          <w:sz w:val="26"/>
+          <w:szCs w:val="26"/>
+        </w:rPr>
+        <w:t>Neural</w:t>
+      </w:r>
+      <w:proofErr w:type="spellEnd"/>
+      <w:r>
+        <w:rPr>
+          <w:rStyle w:val="Collegamentoipertestuale"/>
+          <w:sz w:val="26"/>
+          <w:szCs w:val="26"/>
+        </w:rPr>
+        <w:t xml:space="preserve"> DSP - </w:t>
+      </w:r>
+      <w:proofErr w:type="spellStart"/>
+      <w:r>
+        <w:rPr>
+          <w:rStyle w:val="Collegamentoipertestuale"/>
+          <w:sz w:val="26"/>
+          <w:szCs w:val="26"/>
+        </w:rPr>
+        <w:t>Algorithmically</w:t>
+      </w:r>
+      <w:proofErr w:type="spellEnd"/>
+      <w:r>
+        <w:rPr>
+          <w:rStyle w:val="Collegamentoipertestuale"/>
+          <w:sz w:val="26"/>
+          <w:szCs w:val="26"/>
+        </w:rPr>
+        <w:t xml:space="preserve"> Perfect - </w:t>
+      </w:r>
+      <w:proofErr w:type="spellStart"/>
+      <w:r>
+        <w:rPr>
+          <w:rStyle w:val="Collegamentoipertestuale"/>
+          <w:sz w:val="26"/>
+          <w:szCs w:val="26"/>
+        </w:rPr>
+        <w:t>Neural</w:t>
+      </w:r>
+      <w:proofErr w:type="spellEnd"/>
+      <w:r>
+        <w:rPr>
+          <w:rStyle w:val="Collegamentoipertestuale"/>
+          <w:sz w:val="26"/>
+          <w:szCs w:val="26"/>
+        </w:rPr>
+        <w:t xml:space="preserve"> DSP</w:t>
+      </w:r>
+      <w:r>
+        <w:fldChar w:fldCharType="end"/>
+      </w:r>
       <w:r>
         <w:rPr>
           <w:sz w:val="26"/>
@@ -2267,12 +2466,21 @@
       <w:pPr>
         <w:ind w:left="426"/>
       </w:pPr>
+      <w:proofErr w:type="spellStart"/>
       <w:r>
         <w:rPr>
           <w:b/>
           <w:bCs/>
         </w:rPr>
-        <w:t>Neural DSP</w:t>
+        <w:t>Neural</w:t>
+      </w:r>
+      <w:proofErr w:type="spellEnd"/>
+      <w:r>
+        <w:rPr>
+          <w:b/>
+          <w:bCs/>
+        </w:rPr>
+        <w:t xml:space="preserve"> DSP</w:t>
       </w:r>
       <w:r>
         <w:t xml:space="preserve"> è un'azienda finlandese specializzata nella creazione di soluzioni digitali di altissima qualità per chitarristi e bassisti. </w:t>
@@ -2330,7 +2538,7 @@
                     </pic:cNvPicPr>
                   </pic:nvPicPr>
                   <pic:blipFill>
-                    <a:blip r:embed="rId18">
+                    <a:blip r:embed="rId16">
                       <a:extLst>
                         <a:ext uri="{28A0092B-C50C-407E-A947-70E740481C1C}">
                           <a14:useLocalDpi xmlns:a14="http://schemas.microsoft.com/office/drawing/2010/main" val="0"/>
@@ -2447,7 +2655,7 @@
                     </pic:cNvPicPr>
                   </pic:nvPicPr>
                   <pic:blipFill>
-                    <a:blip r:embed="rId19">
+                    <a:blip r:embed="rId17">
                       <a:extLst>
                         <a:ext uri="{28A0092B-C50C-407E-A947-70E740481C1C}">
                           <a14:useLocalDpi xmlns:a14="http://schemas.microsoft.com/office/drawing/2010/main" val="0"/>
@@ -2521,7 +2729,7 @@
                     <pic:cNvPicPr/>
                   </pic:nvPicPr>
                   <pic:blipFill>
-                    <a:blip r:embed="rId20"/>
+                    <a:blip r:embed="rId18"/>
                     <a:stretch>
                       <a:fillRect/>
                     </a:stretch>
@@ -2746,7 +2954,15 @@
         </w:rPr>
       </w:pPr>
       <w:r>
-        <w:t xml:space="preserve">Le sue offerte comprendono una suite completa che include pre-effetti (pedali), diverse testate di amplificatori, cabinet con microfoni virtuali posizionabili e post-effetti (delay, riverberi). </w:t>
+        <w:t xml:space="preserve">Le sue offerte comprendono una suite completa che include </w:t>
+      </w:r>
+      <w:proofErr w:type="spellStart"/>
+      <w:r>
+        <w:t>pre</w:t>
+      </w:r>
+      <w:proofErr w:type="spellEnd"/>
+      <w:r>
+        <w:t xml:space="preserve">-effetti (pedali), diverse testate di amplificatori, cabinet con microfoni virtuali posizionabili e post-effetti (delay, riverberi). </w:t>
       </w:r>
     </w:p>
     <w:p>
@@ -2880,7 +3096,7 @@
                     <pic:cNvPicPr/>
                   </pic:nvPicPr>
                   <pic:blipFill>
-                    <a:blip r:embed="rId21"/>
+                    <a:blip r:embed="rId19"/>
                     <a:stretch>
                       <a:fillRect/>
                     </a:stretch>
@@ -3409,7 +3625,25 @@
           <w:sz w:val="24"/>
           <w:szCs w:val="24"/>
         </w:rPr>
-        <w:t>Modifica informazioni personali (indirizzo di spedizione, email, nome, cognome, metodo di pagamento…)</w:t>
+        <w:t xml:space="preserve">Modifica informazioni personali (indirizzo di spedizione, </w:t>
+      </w:r>
+      <w:proofErr w:type="gramStart"/>
+      <w:r>
+        <w:rPr>
+          <w:rFonts w:asciiTheme="majorHAnsi" w:hAnsiTheme="majorHAnsi" w:cstheme="majorHAnsi"/>
+          <w:sz w:val="24"/>
+          <w:szCs w:val="24"/>
+        </w:rPr>
+        <w:t>email</w:t>
+      </w:r>
+      <w:proofErr w:type="gramEnd"/>
+      <w:r>
+        <w:rPr>
+          <w:rFonts w:asciiTheme="majorHAnsi" w:hAnsiTheme="majorHAnsi" w:cstheme="majorHAnsi"/>
+          <w:sz w:val="24"/>
+          <w:szCs w:val="24"/>
+        </w:rPr>
+        <w:t>, nome, cognome, metodo di pagamento…)</w:t>
       </w:r>
     </w:p>
     <w:p>

</xml_diff>